<commit_message>
add data profile and correlation endpoints with docs updates
</commit_message>
<xml_diff>
--- a/docs/LLD.docx
+++ b/docs/LLD.docx
@@ -2,7 +2,7 @@
 <file path=word/document.xml><?xml version="1.0" encoding="utf-8"?>
 <w:document xmlns:w="http://schemas.openxmlformats.org/wordprocessingml/2006/main" xmlns:m="http://schemas.openxmlformats.org/officeDocument/2006/math" xmlns:r="http://schemas.openxmlformats.org/officeDocument/2006/relationships" xmlns:o="urn:schemas-microsoft-com:office:office" xmlns:v="urn:schemas-microsoft-com:vml" xmlns:w10="urn:schemas-microsoft-com:office:word" xmlns:a="http://schemas.openxmlformats.org/drawingml/2006/main" xmlns:pic="http://schemas.openxmlformats.org/drawingml/2006/picture" xmlns:wp="http://schemas.openxmlformats.org/drawingml/2006/wordprocessingDrawing">
   <w:body>
-    <w:bookmarkStart w:id="76" w:name="X76f88b2687ad45cf359f79bc4105a81cfd3547f"/>
+    <w:bookmarkStart w:id="79" w:name="X76f88b2687ad45cf359f79bc4105a81cfd3547f"/>
     <w:p>
       <w:pPr>
         <w:pStyle w:val="Heading1"/>
@@ -598,7 +598,7 @@
     </w:p>
     <w:bookmarkEnd w:id="25"/>
     <w:bookmarkEnd w:id="26"/>
-    <w:bookmarkStart w:id="37" w:name="backend-lld-nodeexpress"/>
+    <w:bookmarkStart w:id="40" w:name="backend-lld-nodeexpress"/>
     <w:p>
       <w:pPr>
         <w:pStyle w:val="Heading2"/>
@@ -898,7 +898,7 @@
       </w:r>
     </w:p>
     <w:bookmarkEnd w:id="28"/>
-    <w:bookmarkStart w:id="32" w:name="api-endpoint-definitions"/>
+    <w:bookmarkStart w:id="35" w:name="api-endpoint-definitions"/>
     <w:p>
       <w:pPr>
         <w:pStyle w:val="Heading3"/>
@@ -924,7 +924,7 @@
         <w:t xml:space="preserve">/api</w:t>
       </w:r>
     </w:p>
-    <w:bookmarkStart w:id="29" w:name="get-apistreams"/>
+    <w:bookmarkStart w:id="29" w:name="get-health-service-level"/>
     <w:p>
       <w:pPr>
         <w:pStyle w:val="Heading4"/>
@@ -933,6 +933,237 @@
         <w:rPr>
           <w:rStyle w:val="VerbatimChar"/>
         </w:rPr>
+        <w:t xml:space="preserve">GET /health</w:t>
+      </w:r>
+      <w:r>
+        <w:t xml:space="preserve"> </w:t>
+      </w:r>
+      <w:r>
+        <w:t xml:space="preserve">(service-level)</w:t>
+      </w:r>
+    </w:p>
+    <w:p>
+      <w:pPr>
+        <w:numPr>
+          <w:ilvl w:val="0"/>
+          <w:numId w:val="1009"/>
+        </w:numPr>
+        <w:pStyle w:val="Compact"/>
+      </w:pPr>
+      <w:r>
+        <w:t xml:space="preserve">Purpose: backend readiness/liveness signal for operational checks</w:t>
+      </w:r>
+    </w:p>
+    <w:p>
+      <w:pPr>
+        <w:numPr>
+          <w:ilvl w:val="0"/>
+          <w:numId w:val="1009"/>
+        </w:numPr>
+        <w:pStyle w:val="Compact"/>
+      </w:pPr>
+      <w:r>
+        <w:t xml:space="preserve">Location: app-level route in</w:t>
+      </w:r>
+      <w:r>
+        <w:t xml:space="preserve"> </w:t>
+      </w:r>
+      <w:r>
+        <w:rPr>
+          <w:rStyle w:val="VerbatimChar"/>
+        </w:rPr>
+        <w:t xml:space="preserve">newBackend/BackendCode/app.js</w:t>
+      </w:r>
+    </w:p>
+    <w:p>
+      <w:pPr>
+        <w:numPr>
+          <w:ilvl w:val="0"/>
+          <w:numId w:val="1009"/>
+        </w:numPr>
+        <w:pStyle w:val="Compact"/>
+      </w:pPr>
+      <w:r>
+        <w:t xml:space="preserve">Status: implemented and covered by smoke test</w:t>
+      </w:r>
+      <w:r>
+        <w:t xml:space="preserve"> </w:t>
+      </w:r>
+      <w:r>
+        <w:rPr>
+          <w:rStyle w:val="VerbatimChar"/>
+        </w:rPr>
+        <w:t xml:space="preserve">GET /health returns service health payload</w:t>
+      </w:r>
+    </w:p>
+    <w:p>
+      <w:pPr>
+        <w:numPr>
+          <w:ilvl w:val="0"/>
+          <w:numId w:val="1009"/>
+        </w:numPr>
+        <w:pStyle w:val="Compact"/>
+      </w:pPr>
+      <w:r>
+        <w:t xml:space="preserve">Success:</w:t>
+      </w:r>
+      <w:r>
+        <w:t xml:space="preserve"> </w:t>
+      </w:r>
+      <w:r>
+        <w:rPr>
+          <w:rStyle w:val="VerbatimChar"/>
+        </w:rPr>
+        <w:t xml:space="preserve">200</w:t>
+      </w:r>
+      <w:r>
+        <w:t xml:space="preserve"> </w:t>
+      </w:r>
+      <w:r>
+        <w:t xml:space="preserve">with JSON payload</w:t>
+      </w:r>
+    </w:p>
+    <w:p>
+      <w:pPr>
+        <w:pStyle w:val="SourceCode"/>
+      </w:pPr>
+      <w:r>
+        <w:rPr>
+          <w:rStyle w:val="FunctionTok"/>
+        </w:rPr>
+        <w:t xml:space="preserve">{</w:t>
+      </w:r>
+      <w:r>
+        <w:br/>
+      </w:r>
+      <w:r>
+        <w:rPr>
+          <w:rStyle w:val="NormalTok"/>
+        </w:rPr>
+        <w:t xml:space="preserve">  </w:t>
+      </w:r>
+      <w:r>
+        <w:rPr>
+          <w:rStyle w:val="DataTypeTok"/>
+        </w:rPr>
+        <w:t xml:space="preserve">"status"</w:t>
+      </w:r>
+      <w:r>
+        <w:rPr>
+          <w:rStyle w:val="FunctionTok"/>
+        </w:rPr>
+        <w:t xml:space="preserve">:</w:t>
+      </w:r>
+      <w:r>
+        <w:rPr>
+          <w:rStyle w:val="NormalTok"/>
+        </w:rPr>
+        <w:t xml:space="preserve"> </w:t>
+      </w:r>
+      <w:r>
+        <w:rPr>
+          <w:rStyle w:val="StringTok"/>
+        </w:rPr>
+        <w:t xml:space="preserve">"ok"</w:t>
+      </w:r>
+      <w:r>
+        <w:rPr>
+          <w:rStyle w:val="FunctionTok"/>
+        </w:rPr>
+        <w:t xml:space="preserve">,</w:t>
+      </w:r>
+      <w:r>
+        <w:br/>
+      </w:r>
+      <w:r>
+        <w:rPr>
+          <w:rStyle w:val="NormalTok"/>
+        </w:rPr>
+        <w:t xml:space="preserve">  </w:t>
+      </w:r>
+      <w:r>
+        <w:rPr>
+          <w:rStyle w:val="DataTypeTok"/>
+        </w:rPr>
+        <w:t xml:space="preserve">"timestamp"</w:t>
+      </w:r>
+      <w:r>
+        <w:rPr>
+          <w:rStyle w:val="FunctionTok"/>
+        </w:rPr>
+        <w:t xml:space="preserve">:</w:t>
+      </w:r>
+      <w:r>
+        <w:rPr>
+          <w:rStyle w:val="NormalTok"/>
+        </w:rPr>
+        <w:t xml:space="preserve"> </w:t>
+      </w:r>
+      <w:r>
+        <w:rPr>
+          <w:rStyle w:val="StringTok"/>
+        </w:rPr>
+        <w:t xml:space="preserve">"2026-01-01T00:00:00.000Z"</w:t>
+      </w:r>
+      <w:r>
+        <w:rPr>
+          <w:rStyle w:val="FunctionTok"/>
+        </w:rPr>
+        <w:t xml:space="preserve">,</w:t>
+      </w:r>
+      <w:r>
+        <w:br/>
+      </w:r>
+      <w:r>
+        <w:rPr>
+          <w:rStyle w:val="NormalTok"/>
+        </w:rPr>
+        <w:t xml:space="preserve">  </w:t>
+      </w:r>
+      <w:r>
+        <w:rPr>
+          <w:rStyle w:val="DataTypeTok"/>
+        </w:rPr>
+        <w:t xml:space="preserve">"uptimeSeconds"</w:t>
+      </w:r>
+      <w:r>
+        <w:rPr>
+          <w:rStyle w:val="FunctionTok"/>
+        </w:rPr>
+        <w:t xml:space="preserve">:</w:t>
+      </w:r>
+      <w:r>
+        <w:rPr>
+          <w:rStyle w:val="NormalTok"/>
+        </w:rPr>
+        <w:t xml:space="preserve"> </w:t>
+      </w:r>
+      <w:r>
+        <w:rPr>
+          <w:rStyle w:val="FloatTok"/>
+        </w:rPr>
+        <w:t xml:space="preserve">123.45</w:t>
+      </w:r>
+      <w:r>
+        <w:br/>
+      </w:r>
+      <w:r>
+        <w:rPr>
+          <w:rStyle w:val="FunctionTok"/>
+        </w:rPr>
+        <w:t xml:space="preserve">}</w:t>
+      </w:r>
+    </w:p>
+    <w:bookmarkEnd w:id="29"/>
+    <w:bookmarkStart w:id="30" w:name="get-apistreams"/>
+    <w:p>
+      <w:pPr>
+        <w:pStyle w:val="Heading4"/>
+      </w:pPr>
+      <w:r>
+        <w:rPr>
+          <w:rStyle w:val="VerbatimChar"/>
+        </w:rPr>
         <w:t xml:space="preserve">GET /api/streams</w:t>
       </w:r>
     </w:p>
@@ -940,7 +1171,7 @@
       <w:pPr>
         <w:numPr>
           <w:ilvl w:val="0"/>
-          <w:numId w:val="1009"/>
+          <w:numId w:val="1010"/>
         </w:numPr>
         <w:pStyle w:val="Compact"/>
       </w:pPr>
@@ -952,7 +1183,7 @@
       <w:pPr>
         <w:numPr>
           <w:ilvl w:val="0"/>
-          <w:numId w:val="1009"/>
+          <w:numId w:val="1010"/>
         </w:numPr>
         <w:pStyle w:val="Compact"/>
       </w:pPr>
@@ -973,7 +1204,7 @@
       <w:pPr>
         <w:numPr>
           <w:ilvl w:val="0"/>
-          <w:numId w:val="1009"/>
+          <w:numId w:val="1010"/>
         </w:numPr>
         <w:pStyle w:val="Compact"/>
       </w:pPr>
@@ -994,7 +1225,7 @@
       <w:pPr>
         <w:numPr>
           <w:ilvl w:val="0"/>
-          <w:numId w:val="1009"/>
+          <w:numId w:val="1010"/>
         </w:numPr>
         <w:pStyle w:val="Compact"/>
       </w:pPr>
@@ -1021,7 +1252,7 @@
       <w:pPr>
         <w:numPr>
           <w:ilvl w:val="0"/>
-          <w:numId w:val="1009"/>
+          <w:numId w:val="1010"/>
         </w:numPr>
         <w:pStyle w:val="Compact"/>
       </w:pPr>
@@ -1053,8 +1284,8 @@
         <w:t xml:space="preserve">{ "error": "Failed to load stream data" }</w:t>
       </w:r>
     </w:p>
-    <w:bookmarkEnd w:id="29"/>
-    <w:bookmarkStart w:id="30" w:name="get-apistream-names"/>
+    <w:bookmarkEnd w:id="30"/>
+    <w:bookmarkStart w:id="31" w:name="get-apistream-names"/>
     <w:p>
       <w:pPr>
         <w:pStyle w:val="Heading4"/>
@@ -1070,7 +1301,7 @@
       <w:pPr>
         <w:numPr>
           <w:ilvl w:val="0"/>
-          <w:numId w:val="1010"/>
+          <w:numId w:val="1011"/>
         </w:numPr>
         <w:pStyle w:val="Compact"/>
       </w:pPr>
@@ -1082,7 +1313,7 @@
       <w:pPr>
         <w:numPr>
           <w:ilvl w:val="0"/>
-          <w:numId w:val="1010"/>
+          <w:numId w:val="1011"/>
         </w:numPr>
         <w:pStyle w:val="Compact"/>
       </w:pPr>
@@ -1127,7 +1358,7 @@
       <w:pPr>
         <w:numPr>
           <w:ilvl w:val="0"/>
-          <w:numId w:val="1010"/>
+          <w:numId w:val="1011"/>
         </w:numPr>
         <w:pStyle w:val="Compact"/>
       </w:pPr>
@@ -1148,7 +1379,7 @@
       <w:pPr>
         <w:numPr>
           <w:ilvl w:val="0"/>
-          <w:numId w:val="1010"/>
+          <w:numId w:val="1011"/>
         </w:numPr>
         <w:pStyle w:val="Compact"/>
       </w:pPr>
@@ -1169,7 +1400,7 @@
       <w:pPr>
         <w:numPr>
           <w:ilvl w:val="0"/>
-          <w:numId w:val="1010"/>
+          <w:numId w:val="1011"/>
         </w:numPr>
         <w:pStyle w:val="Compact"/>
       </w:pPr>
@@ -1196,7 +1427,7 @@
       <w:pPr>
         <w:numPr>
           <w:ilvl w:val="0"/>
-          <w:numId w:val="1010"/>
+          <w:numId w:val="1011"/>
         </w:numPr>
         <w:pStyle w:val="Compact"/>
       </w:pPr>
@@ -1232,7 +1463,7 @@
       <w:pPr>
         <w:numPr>
           <w:ilvl w:val="0"/>
-          <w:numId w:val="1010"/>
+          <w:numId w:val="1011"/>
         </w:numPr>
         <w:pStyle w:val="Compact"/>
       </w:pPr>
@@ -1264,8 +1495,8 @@
         <w:t xml:space="preserve">{ "error": "Failed to get stream names" }</w:t>
       </w:r>
     </w:p>
-    <w:bookmarkEnd w:id="30"/>
-    <w:bookmarkStart w:id="31" w:name="post-apifilter-streams"/>
+    <w:bookmarkEnd w:id="31"/>
+    <w:bookmarkStart w:id="32" w:name="post-apifilter-streams"/>
     <w:p>
       <w:pPr>
         <w:pStyle w:val="Heading4"/>
@@ -1281,7 +1512,7 @@
       <w:pPr>
         <w:numPr>
           <w:ilvl w:val="0"/>
-          <w:numId w:val="1011"/>
+          <w:numId w:val="1012"/>
         </w:numPr>
         <w:pStyle w:val="Compact"/>
       </w:pPr>
@@ -1293,7 +1524,7 @@
       <w:pPr>
         <w:numPr>
           <w:ilvl w:val="0"/>
-          <w:numId w:val="1011"/>
+          <w:numId w:val="1012"/>
         </w:numPr>
         <w:pStyle w:val="Compact"/>
       </w:pPr>
@@ -1388,7 +1619,7 @@
       <w:pPr>
         <w:numPr>
           <w:ilvl w:val="0"/>
-          <w:numId w:val="1012"/>
+          <w:numId w:val="1013"/>
         </w:numPr>
         <w:pStyle w:val="Compact"/>
       </w:pPr>
@@ -1400,49 +1631,179 @@
       <w:pPr>
         <w:numPr>
           <w:ilvl w:val="1"/>
+          <w:numId w:val="1014"/>
+        </w:numPr>
+        <w:pStyle w:val="Compact"/>
+      </w:pPr>
+      <w:r>
+        <w:rPr>
+          <w:rStyle w:val="VerbatimChar"/>
+        </w:rPr>
+        <w:t xml:space="preserve">streamNames</w:t>
+      </w:r>
+      <w:r>
+        <w:t xml:space="preserve"> </w:t>
+      </w:r>
+      <w:r>
+        <w:t xml:space="preserve">must be a non-empty array</w:t>
+      </w:r>
+    </w:p>
+    <w:p>
+      <w:pPr>
+        <w:numPr>
+          <w:ilvl w:val="1"/>
+          <w:numId w:val="1014"/>
+        </w:numPr>
+        <w:pStyle w:val="Compact"/>
+      </w:pPr>
+      <w:r>
+        <w:t xml:space="preserve">invalid payload returns</w:t>
+      </w:r>
+      <w:r>
+        <w:t xml:space="preserve"> </w:t>
+      </w:r>
+      <w:r>
+        <w:rPr>
+          <w:rStyle w:val="VerbatimChar"/>
+        </w:rPr>
+        <w:t xml:space="preserve">400</w:t>
+      </w:r>
+    </w:p>
+    <w:p>
+      <w:pPr>
+        <w:numPr>
+          <w:ilvl w:val="0"/>
           <w:numId w:val="1013"/>
         </w:numPr>
         <w:pStyle w:val="Compact"/>
       </w:pPr>
       <w:r>
-        <w:rPr>
-          <w:rStyle w:val="VerbatimChar"/>
-        </w:rPr>
-        <w:t xml:space="preserve">streamNames</w:t>
-      </w:r>
-      <w:r>
-        <w:t xml:space="preserve"> </w:t>
-      </w:r>
-      <w:r>
-        <w:t xml:space="preserve">must be a non-empty array</w:t>
-      </w:r>
-    </w:p>
-    <w:p>
-      <w:pPr>
-        <w:numPr>
-          <w:ilvl w:val="1"/>
+        <w:t xml:space="preserve">Success:</w:t>
+      </w:r>
+      <w:r>
+        <w:t xml:space="preserve"> </w:t>
+      </w:r>
+      <w:r>
+        <w:rPr>
+          <w:rStyle w:val="VerbatimChar"/>
+        </w:rPr>
+        <w:t xml:space="preserve">200</w:t>
+      </w:r>
+      <w:r>
+        <w:t xml:space="preserve"> </w:t>
+      </w:r>
+      <w:r>
+        <w:t xml:space="preserve">with filtered record array</w:t>
+      </w:r>
+    </w:p>
+    <w:p>
+      <w:pPr>
+        <w:numPr>
+          <w:ilvl w:val="0"/>
           <w:numId w:val="1013"/>
         </w:numPr>
         <w:pStyle w:val="Compact"/>
       </w:pPr>
       <w:r>
-        <w:t xml:space="preserve">invalid payload returns</w:t>
-      </w:r>
-      <w:r>
-        <w:t xml:space="preserve"> </w:t>
-      </w:r>
-      <w:r>
-        <w:rPr>
-          <w:rStyle w:val="VerbatimChar"/>
-        </w:rPr>
-        <w:t xml:space="preserve">400</w:t>
-      </w:r>
-    </w:p>
-    <w:p>
-      <w:pPr>
-        <w:numPr>
-          <w:ilvl w:val="0"/>
-          <w:numId w:val="1012"/>
+        <w:t xml:space="preserve">Failure:</w:t>
+      </w:r>
+      <w:r>
+        <w:t xml:space="preserve"> </w:t>
+      </w:r>
+      <w:r>
+        <w:rPr>
+          <w:rStyle w:val="VerbatimChar"/>
+        </w:rPr>
+        <w:t xml:space="preserve">500</w:t>
+      </w:r>
+      <w:r>
+        <w:t xml:space="preserve"> </w:t>
+      </w:r>
+      <w:r>
+        <w:t xml:space="preserve">with</w:t>
+      </w:r>
+      <w:r>
+        <w:t xml:space="preserve"> </w:t>
+      </w:r>
+      <w:r>
+        <w:rPr>
+          <w:rStyle w:val="VerbatimChar"/>
+        </w:rPr>
+        <w:t xml:space="preserve">{ "error": "Failed to filter stream data" }</w:t>
+      </w:r>
+    </w:p>
+    <w:bookmarkEnd w:id="32"/>
+    <w:bookmarkStart w:id="33" w:name="get-apidata-profile"/>
+    <w:p>
+      <w:pPr>
+        <w:pStyle w:val="Heading4"/>
+      </w:pPr>
+      <w:r>
+        <w:rPr>
+          <w:rStyle w:val="VerbatimChar"/>
+        </w:rPr>
+        <w:t xml:space="preserve">GET /api/data-profile</w:t>
+      </w:r>
+    </w:p>
+    <w:p>
+      <w:pPr>
+        <w:numPr>
+          <w:ilvl w:val="0"/>
+          <w:numId w:val="1015"/>
+        </w:numPr>
+        <w:pStyle w:val="Compact"/>
+      </w:pPr>
+      <w:r>
+        <w:t xml:space="preserve">Purpose: lightweight dataset quality/profile summary for analytics readiness</w:t>
+      </w:r>
+    </w:p>
+    <w:p>
+      <w:pPr>
+        <w:numPr>
+          <w:ilvl w:val="0"/>
+          <w:numId w:val="1015"/>
+        </w:numPr>
+        <w:pStyle w:val="Compact"/>
+      </w:pPr>
+      <w:r>
+        <w:t xml:space="preserve">Controller:</w:t>
+      </w:r>
+      <w:r>
+        <w:t xml:space="preserve"> </w:t>
+      </w:r>
+      <w:r>
+        <w:rPr>
+          <w:rStyle w:val="VerbatimChar"/>
+        </w:rPr>
+        <w:t xml:space="preserve">getDataProfileSummary</w:t>
+      </w:r>
+    </w:p>
+    <w:p>
+      <w:pPr>
+        <w:numPr>
+          <w:ilvl w:val="0"/>
+          <w:numId w:val="1015"/>
+        </w:numPr>
+        <w:pStyle w:val="Compact"/>
+      </w:pPr>
+      <w:r>
+        <w:t xml:space="preserve">Service:</w:t>
+      </w:r>
+      <w:r>
+        <w:t xml:space="preserve"> </w:t>
+      </w:r>
+      <w:r>
+        <w:rPr>
+          <w:rStyle w:val="VerbatimChar"/>
+        </w:rPr>
+        <w:t xml:space="preserve">getDataProfile</w:t>
+      </w:r>
+    </w:p>
+    <w:p>
+      <w:pPr>
+        <w:numPr>
+          <w:ilvl w:val="0"/>
+          <w:numId w:val="1015"/>
         </w:numPr>
         <w:pStyle w:val="Compact"/>
       </w:pPr>
@@ -1462,193 +1823,7 @@
         <w:t xml:space="preserve"> </w:t>
       </w:r>
       <w:r>
-        <w:t xml:space="preserve">with filtered record array</w:t>
-      </w:r>
-    </w:p>
-    <w:p>
-      <w:pPr>
-        <w:numPr>
-          <w:ilvl w:val="0"/>
-          <w:numId w:val="1012"/>
-        </w:numPr>
-        <w:pStyle w:val="Compact"/>
-      </w:pPr>
-      <w:r>
-        <w:t xml:space="preserve">Failure:</w:t>
-      </w:r>
-      <w:r>
-        <w:t xml:space="preserve"> </w:t>
-      </w:r>
-      <w:r>
-        <w:rPr>
-          <w:rStyle w:val="VerbatimChar"/>
-        </w:rPr>
-        <w:t xml:space="preserve">500</w:t>
-      </w:r>
-      <w:r>
-        <w:t xml:space="preserve"> </w:t>
-      </w:r>
-      <w:r>
-        <w:t xml:space="preserve">with</w:t>
-      </w:r>
-      <w:r>
-        <w:t xml:space="preserve"> </w:t>
-      </w:r>
-      <w:r>
-        <w:rPr>
-          <w:rStyle w:val="VerbatimChar"/>
-        </w:rPr>
-        <w:t xml:space="preserve">{ "error": "Failed to filter stream data" }</w:t>
-      </w:r>
-    </w:p>
-    <w:bookmarkEnd w:id="31"/>
-    <w:bookmarkEnd w:id="32"/>
-    <w:bookmarkStart w:id="36" w:name="layer-logic-details"/>
-    <w:p>
-      <w:pPr>
-        <w:pStyle w:val="Heading3"/>
-      </w:pPr>
-      <w:r>
-        <w:t xml:space="preserve">4.4 Layer logic details</w:t>
-      </w:r>
-    </w:p>
-    <w:bookmarkStart w:id="33" w:name="repository-mockrepository.js"/>
-    <w:p>
-      <w:pPr>
-        <w:pStyle w:val="Heading4"/>
-      </w:pPr>
-      <w:r>
-        <w:t xml:space="preserve">Repository:</w:t>
-      </w:r>
-      <w:r>
-        <w:t xml:space="preserve"> </w:t>
-      </w:r>
-      <w:r>
-        <w:rPr>
-          <w:rStyle w:val="VerbatimChar"/>
-        </w:rPr>
-        <w:t xml:space="preserve">mockRepository.js</w:t>
-      </w:r>
-    </w:p>
-    <w:p>
-      <w:pPr>
-        <w:numPr>
-          <w:ilvl w:val="0"/>
-          <w:numId w:val="1014"/>
-        </w:numPr>
-        <w:pStyle w:val="Compact"/>
-      </w:pPr>
-      <w:r>
-        <w:t xml:space="preserve">Resolves</w:t>
-      </w:r>
-      <w:r>
-        <w:t xml:space="preserve"> </w:t>
-      </w:r>
-      <w:r>
-        <w:rPr>
-          <w:rStyle w:val="VerbatimChar"/>
-        </w:rPr>
-        <w:t xml:space="preserve">this.filePath = path.resolve(process.env.PROCESSED_DATA_PATH)</w:t>
-      </w:r>
-    </w:p>
-    <w:p>
-      <w:pPr>
-        <w:numPr>
-          <w:ilvl w:val="0"/>
-          <w:numId w:val="1014"/>
-        </w:numPr>
-        <w:pStyle w:val="Compact"/>
-      </w:pPr>
-      <w:r>
-        <w:t xml:space="preserve">Reads file synchronously using</w:t>
-      </w:r>
-      <w:r>
-        <w:t xml:space="preserve"> </w:t>
-      </w:r>
-      <w:r>
-        <w:rPr>
-          <w:rStyle w:val="VerbatimChar"/>
-        </w:rPr>
-        <w:t xml:space="preserve">fs.readFileSync</w:t>
-      </w:r>
-    </w:p>
-    <w:p>
-      <w:pPr>
-        <w:numPr>
-          <w:ilvl w:val="0"/>
-          <w:numId w:val="1014"/>
-        </w:numPr>
-        <w:pStyle w:val="Compact"/>
-      </w:pPr>
-      <w:r>
-        <w:t xml:space="preserve">Parses JSON and returns array</w:t>
-      </w:r>
-    </w:p>
-    <w:p>
-      <w:pPr>
-        <w:numPr>
-          <w:ilvl w:val="0"/>
-          <w:numId w:val="1014"/>
-        </w:numPr>
-        <w:pStyle w:val="Compact"/>
-      </w:pPr>
-      <w:r>
-        <w:t xml:space="preserve">Throws on file/path/parse issues</w:t>
-      </w:r>
-    </w:p>
-    <w:bookmarkEnd w:id="33"/>
-    <w:bookmarkStart w:id="34" w:name="service-mockservice.js"/>
-    <w:p>
-      <w:pPr>
-        <w:pStyle w:val="Heading4"/>
-      </w:pPr>
-      <w:r>
-        <w:t xml:space="preserve">Service:</w:t>
-      </w:r>
-      <w:r>
-        <w:t xml:space="preserve"> </w:t>
-      </w:r>
-      <w:r>
-        <w:rPr>
-          <w:rStyle w:val="VerbatimChar"/>
-        </w:rPr>
-        <w:t xml:space="preserve">mockService.js</w:t>
-      </w:r>
-    </w:p>
-    <w:p>
-      <w:pPr>
-        <w:numPr>
-          <w:ilvl w:val="0"/>
-          <w:numId w:val="1015"/>
-        </w:numPr>
-        <w:pStyle w:val="Compact"/>
-      </w:pPr>
-      <w:r>
-        <w:rPr>
-          <w:rStyle w:val="VerbatimChar"/>
-        </w:rPr>
-        <w:t xml:space="preserve">readProcessedData()</w:t>
-      </w:r>
-      <w:r>
-        <w:t xml:space="preserve">: pass-through full dataset</w:t>
-      </w:r>
-    </w:p>
-    <w:p>
-      <w:pPr>
-        <w:numPr>
-          <w:ilvl w:val="0"/>
-          <w:numId w:val="1015"/>
-        </w:numPr>
-        <w:pStyle w:val="Compact"/>
-      </w:pPr>
-      <w:r>
-        <w:rPr>
-          <w:rStyle w:val="VerbatimChar"/>
-        </w:rPr>
-        <w:t xml:space="preserve">getAvailableStreamNames()</w:t>
-      </w:r>
-      <w:r>
-        <w:t xml:space="preserve">:</w:t>
+        <w:t xml:space="preserve">with profile payload containing:</w:t>
       </w:r>
     </w:p>
     <w:p>
@@ -1660,7 +1835,10 @@
         <w:pStyle w:val="Compact"/>
       </w:pPr>
       <w:r>
-        <w:t xml:space="preserve">reads dataset</w:t>
+        <w:rPr>
+          <w:rStyle w:val="VerbatimChar"/>
+        </w:rPr>
+        <w:t xml:space="preserve">rowCount</w:t>
       </w:r>
     </w:p>
     <w:p>
@@ -1672,22 +1850,10 @@
         <w:pStyle w:val="Compact"/>
       </w:pPr>
       <w:r>
-        <w:t xml:space="preserve">returns</w:t>
-      </w:r>
-      <w:r>
-        <w:t xml:space="preserve"> </w:t>
-      </w:r>
-      <w:r>
-        <w:rPr>
-          <w:rStyle w:val="VerbatimChar"/>
-        </w:rPr>
-        <w:t xml:space="preserve">[]</w:t>
-      </w:r>
-      <w:r>
-        <w:t xml:space="preserve"> </w:t>
-      </w:r>
-      <w:r>
-        <w:t xml:space="preserve">if empty</w:t>
+        <w:rPr>
+          <w:rStyle w:val="VerbatimChar"/>
+        </w:rPr>
+        <w:t xml:space="preserve">streamCount</w:t>
       </w:r>
     </w:p>
     <w:p>
@@ -1699,6 +1865,702 @@
         <w:pStyle w:val="Compact"/>
       </w:pPr>
       <w:r>
+        <w:rPr>
+          <w:rStyle w:val="VerbatimChar"/>
+        </w:rPr>
+        <w:t xml:space="preserve">streams[]</w:t>
+      </w:r>
+      <w:r>
+        <w:t xml:space="preserve"> </w:t>
+      </w:r>
+      <w:r>
+        <w:t xml:space="preserve">with</w:t>
+      </w:r>
+      <w:r>
+        <w:t xml:space="preserve"> </w:t>
+      </w:r>
+      <w:r>
+        <w:rPr>
+          <w:rStyle w:val="VerbatimChar"/>
+        </w:rPr>
+        <w:t xml:space="preserve">missingPercent</w:t>
+      </w:r>
+      <w:r>
+        <w:t xml:space="preserve">,</w:t>
+      </w:r>
+      <w:r>
+        <w:t xml:space="preserve"> </w:t>
+      </w:r>
+      <w:r>
+        <w:rPr>
+          <w:rStyle w:val="VerbatimChar"/>
+        </w:rPr>
+        <w:t xml:space="preserve">min</w:t>
+      </w:r>
+      <w:r>
+        <w:t xml:space="preserve">,</w:t>
+      </w:r>
+      <w:r>
+        <w:t xml:space="preserve"> </w:t>
+      </w:r>
+      <w:r>
+        <w:rPr>
+          <w:rStyle w:val="VerbatimChar"/>
+        </w:rPr>
+        <w:t xml:space="preserve">max</w:t>
+      </w:r>
+      <w:r>
+        <w:t xml:space="preserve">,</w:t>
+      </w:r>
+      <w:r>
+        <w:t xml:space="preserve"> </w:t>
+      </w:r>
+      <w:r>
+        <w:rPr>
+          <w:rStyle w:val="VerbatimChar"/>
+        </w:rPr>
+        <w:t xml:space="preserve">mean</w:t>
+      </w:r>
+    </w:p>
+    <w:p>
+      <w:pPr>
+        <w:numPr>
+          <w:ilvl w:val="1"/>
+          <w:numId w:val="1016"/>
+        </w:numPr>
+        <w:pStyle w:val="Compact"/>
+      </w:pPr>
+      <w:r>
+        <w:rPr>
+          <w:rStyle w:val="VerbatimChar"/>
+        </w:rPr>
+        <w:t xml:space="preserve">timeRange.start</w:t>
+      </w:r>
+      <w:r>
+        <w:t xml:space="preserve">,</w:t>
+      </w:r>
+      <w:r>
+        <w:t xml:space="preserve"> </w:t>
+      </w:r>
+      <w:r>
+        <w:rPr>
+          <w:rStyle w:val="VerbatimChar"/>
+        </w:rPr>
+        <w:t xml:space="preserve">timeRange.end</w:t>
+      </w:r>
+    </w:p>
+    <w:p>
+      <w:pPr>
+        <w:numPr>
+          <w:ilvl w:val="0"/>
+          <w:numId w:val="1015"/>
+        </w:numPr>
+        <w:pStyle w:val="Compact"/>
+      </w:pPr>
+      <w:r>
+        <w:t xml:space="preserve">Failure:</w:t>
+      </w:r>
+      <w:r>
+        <w:t xml:space="preserve"> </w:t>
+      </w:r>
+      <w:r>
+        <w:rPr>
+          <w:rStyle w:val="VerbatimChar"/>
+        </w:rPr>
+        <w:t xml:space="preserve">500</w:t>
+      </w:r>
+      <w:r>
+        <w:t xml:space="preserve"> </w:t>
+      </w:r>
+      <w:r>
+        <w:t xml:space="preserve">with</w:t>
+      </w:r>
+      <w:r>
+        <w:t xml:space="preserve"> </w:t>
+      </w:r>
+      <w:r>
+        <w:rPr>
+          <w:rStyle w:val="VerbatimChar"/>
+        </w:rPr>
+        <w:t xml:space="preserve">{ "error": "Failed to profile stream data" }</w:t>
+      </w:r>
+    </w:p>
+    <w:bookmarkEnd w:id="33"/>
+    <w:bookmarkStart w:id="34" w:name="post-apitop-correlated-pair"/>
+    <w:p>
+      <w:pPr>
+        <w:pStyle w:val="Heading4"/>
+      </w:pPr>
+      <w:r>
+        <w:rPr>
+          <w:rStyle w:val="VerbatimChar"/>
+        </w:rPr>
+        <w:t xml:space="preserve">POST /api/top-correlated-pair</w:t>
+      </w:r>
+    </w:p>
+    <w:p>
+      <w:pPr>
+        <w:numPr>
+          <w:ilvl w:val="0"/>
+          <w:numId w:val="1017"/>
+        </w:numPr>
+        <w:pStyle w:val="Compact"/>
+      </w:pPr>
+      <w:r>
+        <w:t xml:space="preserve">Purpose: return strongest correlated pair among provided stream names</w:t>
+      </w:r>
+    </w:p>
+    <w:p>
+      <w:pPr>
+        <w:numPr>
+          <w:ilvl w:val="0"/>
+          <w:numId w:val="1017"/>
+        </w:numPr>
+        <w:pStyle w:val="Compact"/>
+      </w:pPr>
+      <w:r>
+        <w:t xml:space="preserve">Request body:</w:t>
+      </w:r>
+    </w:p>
+    <w:p>
+      <w:pPr>
+        <w:pStyle w:val="SourceCode"/>
+      </w:pPr>
+      <w:r>
+        <w:rPr>
+          <w:rStyle w:val="FunctionTok"/>
+        </w:rPr>
+        <w:t xml:space="preserve">{</w:t>
+      </w:r>
+      <w:r>
+        <w:br/>
+      </w:r>
+      <w:r>
+        <w:rPr>
+          <w:rStyle w:val="NormalTok"/>
+        </w:rPr>
+        <w:t xml:space="preserve">  </w:t>
+      </w:r>
+      <w:r>
+        <w:rPr>
+          <w:rStyle w:val="DataTypeTok"/>
+        </w:rPr>
+        <w:t xml:space="preserve">"streamNames"</w:t>
+      </w:r>
+      <w:r>
+        <w:rPr>
+          <w:rStyle w:val="FunctionTok"/>
+        </w:rPr>
+        <w:t xml:space="preserve">:</w:t>
+      </w:r>
+      <w:r>
+        <w:rPr>
+          <w:rStyle w:val="NormalTok"/>
+        </w:rPr>
+        <w:t xml:space="preserve"> </w:t>
+      </w:r>
+      <w:r>
+        <w:rPr>
+          <w:rStyle w:val="OtherTok"/>
+        </w:rPr>
+        <w:t xml:space="preserve">[</w:t>
+      </w:r>
+      <w:r>
+        <w:rPr>
+          <w:rStyle w:val="StringTok"/>
+        </w:rPr>
+        <w:t xml:space="preserve">"Temperature"</w:t>
+      </w:r>
+      <w:r>
+        <w:rPr>
+          <w:rStyle w:val="OtherTok"/>
+        </w:rPr>
+        <w:t xml:space="preserve">,</w:t>
+      </w:r>
+      <w:r>
+        <w:rPr>
+          <w:rStyle w:val="NormalTok"/>
+        </w:rPr>
+        <w:t xml:space="preserve"> </w:t>
+      </w:r>
+      <w:r>
+        <w:rPr>
+          <w:rStyle w:val="StringTok"/>
+        </w:rPr>
+        <w:t xml:space="preserve">"Humidity"</w:t>
+      </w:r>
+      <w:r>
+        <w:rPr>
+          <w:rStyle w:val="OtherTok"/>
+        </w:rPr>
+        <w:t xml:space="preserve">,</w:t>
+      </w:r>
+      <w:r>
+        <w:rPr>
+          <w:rStyle w:val="NormalTok"/>
+        </w:rPr>
+        <w:t xml:space="preserve"> </w:t>
+      </w:r>
+      <w:r>
+        <w:rPr>
+          <w:rStyle w:val="StringTok"/>
+        </w:rPr>
+        <w:t xml:space="preserve">"Voltage Charge"</w:t>
+      </w:r>
+      <w:r>
+        <w:rPr>
+          <w:rStyle w:val="OtherTok"/>
+        </w:rPr>
+        <w:t xml:space="preserve">]</w:t>
+      </w:r>
+      <w:r>
+        <w:br/>
+      </w:r>
+      <w:r>
+        <w:rPr>
+          <w:rStyle w:val="FunctionTok"/>
+        </w:rPr>
+        <w:t xml:space="preserve">}</w:t>
+      </w:r>
+    </w:p>
+    <w:p>
+      <w:pPr>
+        <w:numPr>
+          <w:ilvl w:val="0"/>
+          <w:numId w:val="1018"/>
+        </w:numPr>
+        <w:pStyle w:val="Compact"/>
+      </w:pPr>
+      <w:r>
+        <w:t xml:space="preserve">Validation:</w:t>
+      </w:r>
+    </w:p>
+    <w:p>
+      <w:pPr>
+        <w:numPr>
+          <w:ilvl w:val="1"/>
+          <w:numId w:val="1019"/>
+        </w:numPr>
+        <w:pStyle w:val="Compact"/>
+      </w:pPr>
+      <w:r>
+        <w:rPr>
+          <w:rStyle w:val="VerbatimChar"/>
+        </w:rPr>
+        <w:t xml:space="preserve">streamNames</w:t>
+      </w:r>
+      <w:r>
+        <w:t xml:space="preserve"> </w:t>
+      </w:r>
+      <w:r>
+        <w:t xml:space="preserve">must be an array with at least two items</w:t>
+      </w:r>
+    </w:p>
+    <w:p>
+      <w:pPr>
+        <w:numPr>
+          <w:ilvl w:val="1"/>
+          <w:numId w:val="1019"/>
+        </w:numPr>
+        <w:pStyle w:val="Compact"/>
+      </w:pPr>
+      <w:r>
+        <w:t xml:space="preserve">invalid payload returns</w:t>
+      </w:r>
+      <w:r>
+        <w:t xml:space="preserve"> </w:t>
+      </w:r>
+      <w:r>
+        <w:rPr>
+          <w:rStyle w:val="VerbatimChar"/>
+        </w:rPr>
+        <w:t xml:space="preserve">400</w:t>
+      </w:r>
+    </w:p>
+    <w:p>
+      <w:pPr>
+        <w:numPr>
+          <w:ilvl w:val="0"/>
+          <w:numId w:val="1018"/>
+        </w:numPr>
+        <w:pStyle w:val="Compact"/>
+      </w:pPr>
+      <w:r>
+        <w:t xml:space="preserve">Success:</w:t>
+      </w:r>
+      <w:r>
+        <w:t xml:space="preserve"> </w:t>
+      </w:r>
+      <w:r>
+        <w:rPr>
+          <w:rStyle w:val="VerbatimChar"/>
+        </w:rPr>
+        <w:t xml:space="preserve">200</w:t>
+      </w:r>
+      <w:r>
+        <w:t xml:space="preserve"> </w:t>
+      </w:r>
+      <w:r>
+        <w:t xml:space="preserve">with:</w:t>
+      </w:r>
+    </w:p>
+    <w:p>
+      <w:pPr>
+        <w:numPr>
+          <w:ilvl w:val="1"/>
+          <w:numId w:val="1020"/>
+        </w:numPr>
+        <w:pStyle w:val="Compact"/>
+      </w:pPr>
+      <w:r>
+        <w:rPr>
+          <w:rStyle w:val="VerbatimChar"/>
+        </w:rPr>
+        <w:t xml:space="preserve">pair</w:t>
+      </w:r>
+      <w:r>
+        <w:t xml:space="preserve"> </w:t>
+      </w:r>
+      <w:r>
+        <w:t xml:space="preserve">(2 stream names)</w:t>
+      </w:r>
+    </w:p>
+    <w:p>
+      <w:pPr>
+        <w:numPr>
+          <w:ilvl w:val="1"/>
+          <w:numId w:val="1020"/>
+        </w:numPr>
+        <w:pStyle w:val="Compact"/>
+      </w:pPr>
+      <w:r>
+        <w:rPr>
+          <w:rStyle w:val="VerbatimChar"/>
+        </w:rPr>
+        <w:t xml:space="preserve">correlation</w:t>
+      </w:r>
+    </w:p>
+    <w:p>
+      <w:pPr>
+        <w:numPr>
+          <w:ilvl w:val="1"/>
+          <w:numId w:val="1020"/>
+        </w:numPr>
+        <w:pStyle w:val="Compact"/>
+      </w:pPr>
+      <w:r>
+        <w:rPr>
+          <w:rStyle w:val="VerbatimChar"/>
+        </w:rPr>
+        <w:t xml:space="preserve">sampleSize</w:t>
+      </w:r>
+    </w:p>
+    <w:p>
+      <w:pPr>
+        <w:numPr>
+          <w:ilvl w:val="1"/>
+          <w:numId w:val="1020"/>
+        </w:numPr>
+        <w:pStyle w:val="Compact"/>
+      </w:pPr>
+      <w:r>
+        <w:rPr>
+          <w:rStyle w:val="VerbatimChar"/>
+        </w:rPr>
+        <w:t xml:space="preserve">label</w:t>
+      </w:r>
+      <w:r>
+        <w:t xml:space="preserve"> </w:t>
+      </w:r>
+      <w:r>
+        <w:t xml:space="preserve">(</w:t>
+      </w:r>
+      <w:r>
+        <w:rPr>
+          <w:rStyle w:val="VerbatimChar"/>
+        </w:rPr>
+        <w:t xml:space="preserve">strong</w:t>
+      </w:r>
+      <w:r>
+        <w:t xml:space="preserve">,</w:t>
+      </w:r>
+      <w:r>
+        <w:t xml:space="preserve"> </w:t>
+      </w:r>
+      <w:r>
+        <w:rPr>
+          <w:rStyle w:val="VerbatimChar"/>
+        </w:rPr>
+        <w:t xml:space="preserve">moderate</w:t>
+      </w:r>
+      <w:r>
+        <w:t xml:space="preserve">,</w:t>
+      </w:r>
+      <w:r>
+        <w:t xml:space="preserve"> </w:t>
+      </w:r>
+      <w:r>
+        <w:rPr>
+          <w:rStyle w:val="VerbatimChar"/>
+        </w:rPr>
+        <w:t xml:space="preserve">weak</w:t>
+      </w:r>
+      <w:r>
+        <w:t xml:space="preserve">,</w:t>
+      </w:r>
+      <w:r>
+        <w:t xml:space="preserve"> </w:t>
+      </w:r>
+      <w:r>
+        <w:rPr>
+          <w:rStyle w:val="VerbatimChar"/>
+        </w:rPr>
+        <w:t xml:space="preserve">insufficient-data</w:t>
+      </w:r>
+      <w:r>
+        <w:t xml:space="preserve">)</w:t>
+      </w:r>
+    </w:p>
+    <w:p>
+      <w:pPr>
+        <w:numPr>
+          <w:ilvl w:val="0"/>
+          <w:numId w:val="1018"/>
+        </w:numPr>
+        <w:pStyle w:val="Compact"/>
+      </w:pPr>
+      <w:r>
+        <w:t xml:space="preserve">Compute failure (no usable pair):</w:t>
+      </w:r>
+      <w:r>
+        <w:t xml:space="preserve"> </w:t>
+      </w:r>
+      <w:r>
+        <w:rPr>
+          <w:rStyle w:val="VerbatimChar"/>
+        </w:rPr>
+        <w:t xml:space="preserve">422</w:t>
+      </w:r>
+    </w:p>
+    <w:p>
+      <w:pPr>
+        <w:numPr>
+          <w:ilvl w:val="0"/>
+          <w:numId w:val="1018"/>
+        </w:numPr>
+        <w:pStyle w:val="Compact"/>
+      </w:pPr>
+      <w:r>
+        <w:t xml:space="preserve">Internal error:</w:t>
+      </w:r>
+      <w:r>
+        <w:t xml:space="preserve"> </w:t>
+      </w:r>
+      <w:r>
+        <w:rPr>
+          <w:rStyle w:val="VerbatimChar"/>
+        </w:rPr>
+        <w:t xml:space="preserve">500</w:t>
+      </w:r>
+    </w:p>
+    <w:bookmarkEnd w:id="34"/>
+    <w:bookmarkEnd w:id="35"/>
+    <w:bookmarkStart w:id="39" w:name="layer-logic-details"/>
+    <w:p>
+      <w:pPr>
+        <w:pStyle w:val="Heading3"/>
+      </w:pPr>
+      <w:r>
+        <w:t xml:space="preserve">4.4 Layer logic details</w:t>
+      </w:r>
+    </w:p>
+    <w:bookmarkStart w:id="36" w:name="repository-mockrepository.js"/>
+    <w:p>
+      <w:pPr>
+        <w:pStyle w:val="Heading4"/>
+      </w:pPr>
+      <w:r>
+        <w:t xml:space="preserve">Repository:</w:t>
+      </w:r>
+      <w:r>
+        <w:t xml:space="preserve"> </w:t>
+      </w:r>
+      <w:r>
+        <w:rPr>
+          <w:rStyle w:val="VerbatimChar"/>
+        </w:rPr>
+        <w:t xml:space="preserve">mockRepository.js</w:t>
+      </w:r>
+    </w:p>
+    <w:p>
+      <w:pPr>
+        <w:numPr>
+          <w:ilvl w:val="0"/>
+          <w:numId w:val="1021"/>
+        </w:numPr>
+        <w:pStyle w:val="Compact"/>
+      </w:pPr>
+      <w:r>
+        <w:t xml:space="preserve">Resolves</w:t>
+      </w:r>
+      <w:r>
+        <w:t xml:space="preserve"> </w:t>
+      </w:r>
+      <w:r>
+        <w:rPr>
+          <w:rStyle w:val="VerbatimChar"/>
+        </w:rPr>
+        <w:t xml:space="preserve">this.filePath = path.resolve(process.env.PROCESSED_DATA_PATH)</w:t>
+      </w:r>
+    </w:p>
+    <w:p>
+      <w:pPr>
+        <w:numPr>
+          <w:ilvl w:val="0"/>
+          <w:numId w:val="1021"/>
+        </w:numPr>
+        <w:pStyle w:val="Compact"/>
+      </w:pPr>
+      <w:r>
+        <w:t xml:space="preserve">Reads file synchronously using</w:t>
+      </w:r>
+      <w:r>
+        <w:t xml:space="preserve"> </w:t>
+      </w:r>
+      <w:r>
+        <w:rPr>
+          <w:rStyle w:val="VerbatimChar"/>
+        </w:rPr>
+        <w:t xml:space="preserve">fs.readFileSync</w:t>
+      </w:r>
+    </w:p>
+    <w:p>
+      <w:pPr>
+        <w:numPr>
+          <w:ilvl w:val="0"/>
+          <w:numId w:val="1021"/>
+        </w:numPr>
+        <w:pStyle w:val="Compact"/>
+      </w:pPr>
+      <w:r>
+        <w:t xml:space="preserve">Parses JSON and returns array</w:t>
+      </w:r>
+    </w:p>
+    <w:p>
+      <w:pPr>
+        <w:numPr>
+          <w:ilvl w:val="0"/>
+          <w:numId w:val="1021"/>
+        </w:numPr>
+        <w:pStyle w:val="Compact"/>
+      </w:pPr>
+      <w:r>
+        <w:t xml:space="preserve">Throws on file/path/parse issues</w:t>
+      </w:r>
+    </w:p>
+    <w:bookmarkEnd w:id="36"/>
+    <w:bookmarkStart w:id="37" w:name="service-mockservice.js"/>
+    <w:p>
+      <w:pPr>
+        <w:pStyle w:val="Heading4"/>
+      </w:pPr>
+      <w:r>
+        <w:t xml:space="preserve">Service:</w:t>
+      </w:r>
+      <w:r>
+        <w:t xml:space="preserve"> </w:t>
+      </w:r>
+      <w:r>
+        <w:rPr>
+          <w:rStyle w:val="VerbatimChar"/>
+        </w:rPr>
+        <w:t xml:space="preserve">mockService.js</w:t>
+      </w:r>
+    </w:p>
+    <w:p>
+      <w:pPr>
+        <w:numPr>
+          <w:ilvl w:val="0"/>
+          <w:numId w:val="1022"/>
+        </w:numPr>
+        <w:pStyle w:val="Compact"/>
+      </w:pPr>
+      <w:r>
+        <w:rPr>
+          <w:rStyle w:val="VerbatimChar"/>
+        </w:rPr>
+        <w:t xml:space="preserve">readProcessedData()</w:t>
+      </w:r>
+      <w:r>
+        <w:t xml:space="preserve">: pass-through full dataset</w:t>
+      </w:r>
+    </w:p>
+    <w:p>
+      <w:pPr>
+        <w:numPr>
+          <w:ilvl w:val="0"/>
+          <w:numId w:val="1022"/>
+        </w:numPr>
+        <w:pStyle w:val="Compact"/>
+      </w:pPr>
+      <w:r>
+        <w:rPr>
+          <w:rStyle w:val="VerbatimChar"/>
+        </w:rPr>
+        <w:t xml:space="preserve">getAvailableStreamNames()</w:t>
+      </w:r>
+      <w:r>
+        <w:t xml:space="preserve">:</w:t>
+      </w:r>
+    </w:p>
+    <w:p>
+      <w:pPr>
+        <w:numPr>
+          <w:ilvl w:val="1"/>
+          <w:numId w:val="1023"/>
+        </w:numPr>
+        <w:pStyle w:val="Compact"/>
+      </w:pPr>
+      <w:r>
+        <w:t xml:space="preserve">reads dataset</w:t>
+      </w:r>
+    </w:p>
+    <w:p>
+      <w:pPr>
+        <w:numPr>
+          <w:ilvl w:val="1"/>
+          <w:numId w:val="1023"/>
+        </w:numPr>
+        <w:pStyle w:val="Compact"/>
+      </w:pPr>
+      <w:r>
+        <w:t xml:space="preserve">returns</w:t>
+      </w:r>
+      <w:r>
+        <w:t xml:space="preserve"> </w:t>
+      </w:r>
+      <w:r>
+        <w:rPr>
+          <w:rStyle w:val="VerbatimChar"/>
+        </w:rPr>
+        <w:t xml:space="preserve">[]</w:t>
+      </w:r>
+      <w:r>
+        <w:t xml:space="preserve"> </w:t>
+      </w:r>
+      <w:r>
+        <w:t xml:space="preserve">if empty</w:t>
+      </w:r>
+    </w:p>
+    <w:p>
+      <w:pPr>
+        <w:numPr>
+          <w:ilvl w:val="1"/>
+          <w:numId w:val="1023"/>
+        </w:numPr>
+        <w:pStyle w:val="Compact"/>
+      </w:pPr>
+      <w:r>
         <w:t xml:space="preserve">removes metadata keys</w:t>
       </w:r>
     </w:p>
@@ -1706,7 +2568,7 @@
       <w:pPr>
         <w:numPr>
           <w:ilvl w:val="0"/>
-          <w:numId w:val="1015"/>
+          <w:numId w:val="1022"/>
         </w:numPr>
         <w:pStyle w:val="Compact"/>
       </w:pPr>
@@ -1724,7 +2586,7 @@
       <w:pPr>
         <w:numPr>
           <w:ilvl w:val="1"/>
-          <w:numId w:val="1017"/>
+          <w:numId w:val="1024"/>
         </w:numPr>
         <w:pStyle w:val="Compact"/>
       </w:pPr>
@@ -1760,7 +2622,7 @@
       <w:pPr>
         <w:numPr>
           <w:ilvl w:val="1"/>
-          <w:numId w:val="1017"/>
+          <w:numId w:val="1024"/>
         </w:numPr>
         <w:pStyle w:val="Compact"/>
       </w:pPr>
@@ -1768,8 +2630,92 @@
         <w:t xml:space="preserve">conditionally adds each requested stream if key exists</w:t>
       </w:r>
     </w:p>
-    <w:bookmarkEnd w:id="34"/>
-    <w:bookmarkStart w:id="35" w:name="controller-mockcontroller.js"/>
+    <w:p>
+      <w:pPr>
+        <w:numPr>
+          <w:ilvl w:val="0"/>
+          <w:numId w:val="1022"/>
+        </w:numPr>
+        <w:pStyle w:val="Compact"/>
+      </w:pPr>
+      <w:r>
+        <w:rPr>
+          <w:rStyle w:val="VerbatimChar"/>
+        </w:rPr>
+        <w:t xml:space="preserve">getDataProfile()</w:t>
+      </w:r>
+      <w:r>
+        <w:t xml:space="preserve">:</w:t>
+      </w:r>
+    </w:p>
+    <w:p>
+      <w:pPr>
+        <w:numPr>
+          <w:ilvl w:val="1"/>
+          <w:numId w:val="1025"/>
+        </w:numPr>
+        <w:pStyle w:val="Compact"/>
+      </w:pPr>
+      <w:r>
+        <w:t xml:space="preserve">computes dataset-level summary and per-stream quality metrics</w:t>
+      </w:r>
+    </w:p>
+    <w:p>
+      <w:pPr>
+        <w:numPr>
+          <w:ilvl w:val="1"/>
+          <w:numId w:val="1025"/>
+        </w:numPr>
+        <w:pStyle w:val="Compact"/>
+      </w:pPr>
+      <w:r>
+        <w:t xml:space="preserve">outputs counts, missing rates, and basic descriptive statistics</w:t>
+      </w:r>
+    </w:p>
+    <w:p>
+      <w:pPr>
+        <w:numPr>
+          <w:ilvl w:val="0"/>
+          <w:numId w:val="1022"/>
+        </w:numPr>
+        <w:pStyle w:val="Compact"/>
+      </w:pPr>
+      <w:r>
+        <w:rPr>
+          <w:rStyle w:val="VerbatimChar"/>
+        </w:rPr>
+        <w:t xml:space="preserve">getTopCorrelatedPair(streamNames)</w:t>
+      </w:r>
+      <w:r>
+        <w:t xml:space="preserve">:</w:t>
+      </w:r>
+    </w:p>
+    <w:p>
+      <w:pPr>
+        <w:numPr>
+          <w:ilvl w:val="1"/>
+          <w:numId w:val="1026"/>
+        </w:numPr>
+        <w:pStyle w:val="Compact"/>
+      </w:pPr>
+      <w:r>
+        <w:t xml:space="preserve">computes pairwise Pearson correlation for selected valid streams</w:t>
+      </w:r>
+    </w:p>
+    <w:p>
+      <w:pPr>
+        <w:numPr>
+          <w:ilvl w:val="1"/>
+          <w:numId w:val="1026"/>
+        </w:numPr>
+        <w:pStyle w:val="Compact"/>
+      </w:pPr>
+      <w:r>
+        <w:t xml:space="preserve">returns highest absolute correlation pair and interpretation label</w:t>
+      </w:r>
+    </w:p>
+    <w:bookmarkEnd w:id="37"/>
+    <w:bookmarkStart w:id="38" w:name="controller-mockcontroller.js"/>
     <w:p>
       <w:pPr>
         <w:pStyle w:val="Heading4"/>
@@ -1791,7 +2737,7 @@
       <w:pPr>
         <w:numPr>
           <w:ilvl w:val="0"/>
-          <w:numId w:val="1018"/>
+          <w:numId w:val="1027"/>
         </w:numPr>
         <w:pStyle w:val="Compact"/>
       </w:pPr>
@@ -1812,7 +2758,7 @@
       <w:pPr>
         <w:numPr>
           <w:ilvl w:val="0"/>
-          <w:numId w:val="1018"/>
+          <w:numId w:val="1027"/>
         </w:numPr>
         <w:pStyle w:val="Compact"/>
       </w:pPr>
@@ -1833,7 +2779,28 @@
       <w:pPr>
         <w:numPr>
           <w:ilvl w:val="0"/>
-          <w:numId w:val="1018"/>
+          <w:numId w:val="1027"/>
+        </w:numPr>
+        <w:pStyle w:val="Compact"/>
+      </w:pPr>
+      <w:r>
+        <w:t xml:space="preserve">performs payload validation for</w:t>
+      </w:r>
+      <w:r>
+        <w:t xml:space="preserve"> </w:t>
+      </w:r>
+      <w:r>
+        <w:rPr>
+          <w:rStyle w:val="VerbatimChar"/>
+        </w:rPr>
+        <w:t xml:space="preserve">POST /api/top-correlated-pair</w:t>
+      </w:r>
+    </w:p>
+    <w:p>
+      <w:pPr>
+        <w:numPr>
+          <w:ilvl w:val="0"/>
+          <w:numId w:val="1027"/>
         </w:numPr>
         <w:pStyle w:val="Compact"/>
       </w:pPr>
@@ -1848,10 +2815,10 @@
         </w:pict>
       </w:r>
     </w:p>
-    <w:bookmarkEnd w:id="35"/>
-    <w:bookmarkEnd w:id="36"/>
-    <w:bookmarkEnd w:id="37"/>
-    <w:bookmarkStart w:id="50" w:name="frontend-lld-reactvite"/>
+    <w:bookmarkEnd w:id="38"/>
+    <w:bookmarkEnd w:id="39"/>
+    <w:bookmarkEnd w:id="40"/>
+    <w:bookmarkStart w:id="53" w:name="frontend-lld-reactvite"/>
     <w:p>
       <w:pPr>
         <w:pStyle w:val="Heading2"/>
@@ -1860,7 +2827,7 @@
         <w:t xml:space="preserve">5. Frontend LLD (React/Vite)</w:t>
       </w:r>
     </w:p>
-    <w:bookmarkStart w:id="38" w:name="routepage-composition"/>
+    <w:bookmarkStart w:id="41" w:name="routepage-composition"/>
     <w:p>
       <w:pPr>
         <w:pStyle w:val="Heading3"/>
@@ -1873,7 +2840,7 @@
       <w:pPr>
         <w:numPr>
           <w:ilvl w:val="0"/>
-          <w:numId w:val="1019"/>
+          <w:numId w:val="1028"/>
         </w:numPr>
         <w:pStyle w:val="Compact"/>
       </w:pPr>
@@ -1909,7 +2876,7 @@
       <w:pPr>
         <w:numPr>
           <w:ilvl w:val="0"/>
-          <w:numId w:val="1019"/>
+          <w:numId w:val="1028"/>
         </w:numPr>
         <w:pStyle w:val="Compact"/>
       </w:pPr>
@@ -1917,8 +2884,8 @@
         <w:t xml:space="preserve">Dashboard contains selection controls, charting, stats, and correlation insights</w:t>
       </w:r>
     </w:p>
-    <w:bookmarkEnd w:id="38"/>
-    <w:bookmarkStart w:id="42" w:name="hook-contracts"/>
+    <w:bookmarkEnd w:id="41"/>
+    <w:bookmarkStart w:id="45" w:name="hook-contracts"/>
     <w:p>
       <w:pPr>
         <w:pStyle w:val="Heading3"/>
@@ -1927,7 +2894,7 @@
         <w:t xml:space="preserve">5.2 Hook contracts</w:t>
       </w:r>
     </w:p>
-    <w:bookmarkStart w:id="39" w:name="usesensordatausemock-false"/>
+    <w:bookmarkStart w:id="42" w:name="usesensordatausemock-false"/>
     <w:p>
       <w:pPr>
         <w:pStyle w:val="Heading4"/>
@@ -1960,7 +2927,7 @@
       <w:pPr>
         <w:numPr>
           <w:ilvl w:val="0"/>
-          <w:numId w:val="1020"/>
+          <w:numId w:val="1029"/>
         </w:numPr>
         <w:pStyle w:val="Compact"/>
       </w:pPr>
@@ -1981,7 +2948,7 @@
       <w:pPr>
         <w:numPr>
           <w:ilvl w:val="0"/>
-          <w:numId w:val="1020"/>
+          <w:numId w:val="1029"/>
         </w:numPr>
         <w:pStyle w:val="Compact"/>
       </w:pPr>
@@ -2014,7 +2981,7 @@
       <w:pPr>
         <w:numPr>
           <w:ilvl w:val="0"/>
-          <w:numId w:val="1020"/>
+          <w:numId w:val="1029"/>
         </w:numPr>
         <w:pStyle w:val="Compact"/>
       </w:pPr>
@@ -2037,8 +3004,8 @@
         <w:t xml:space="preserve">(currently not aligned with Node routes)</w:t>
       </w:r>
     </w:p>
-    <w:bookmarkEnd w:id="39"/>
-    <w:bookmarkStart w:id="40" w:name="usestreamnamesdata"/>
+    <w:bookmarkEnd w:id="42"/>
+    <w:bookmarkStart w:id="43" w:name="usestreamnamesdata"/>
     <w:p>
       <w:pPr>
         <w:pStyle w:val="Heading4"/>
@@ -2071,7 +3038,7 @@
       <w:pPr>
         <w:numPr>
           <w:ilvl w:val="0"/>
-          <w:numId w:val="1021"/>
+          <w:numId w:val="1030"/>
         </w:numPr>
         <w:pStyle w:val="Compact"/>
       </w:pPr>
@@ -2083,7 +3050,7 @@
       <w:pPr>
         <w:numPr>
           <w:ilvl w:val="0"/>
-          <w:numId w:val="1021"/>
+          <w:numId w:val="1030"/>
         </w:numPr>
         <w:pStyle w:val="Compact"/>
       </w:pPr>
@@ -2116,7 +3083,7 @@
       <w:pPr>
         <w:numPr>
           <w:ilvl w:val="0"/>
-          <w:numId w:val="1021"/>
+          <w:numId w:val="1030"/>
         </w:numPr>
         <w:pStyle w:val="Compact"/>
       </w:pPr>
@@ -2133,8 +3100,8 @@
         <w:t xml:space="preserve">{ id: key, name: key }</w:t>
       </w:r>
     </w:p>
-    <w:bookmarkEnd w:id="40"/>
-    <w:bookmarkStart w:id="41" w:name="usefiltereddatadata-filters"/>
+    <w:bookmarkEnd w:id="43"/>
+    <w:bookmarkStart w:id="44" w:name="usefiltereddatadata-filters"/>
     <w:p>
       <w:pPr>
         <w:pStyle w:val="Heading4"/>
@@ -2167,7 +3134,7 @@
       <w:pPr>
         <w:numPr>
           <w:ilvl w:val="0"/>
-          <w:numId w:val="1022"/>
+          <w:numId w:val="1031"/>
         </w:numPr>
         <w:pStyle w:val="Compact"/>
       </w:pPr>
@@ -2179,7 +3146,7 @@
       <w:pPr>
         <w:numPr>
           <w:ilvl w:val="1"/>
-          <w:numId w:val="1023"/>
+          <w:numId w:val="1032"/>
         </w:numPr>
         <w:pStyle w:val="Compact"/>
       </w:pPr>
@@ -2212,7 +3179,7 @@
       <w:pPr>
         <w:numPr>
           <w:ilvl w:val="1"/>
-          <w:numId w:val="1023"/>
+          <w:numId w:val="1032"/>
         </w:numPr>
         <w:pStyle w:val="Compact"/>
       </w:pPr>
@@ -2245,7 +3212,7 @@
       <w:pPr>
         <w:numPr>
           <w:ilvl w:val="0"/>
-          <w:numId w:val="1022"/>
+          <w:numId w:val="1031"/>
         </w:numPr>
         <w:pStyle w:val="Compact"/>
       </w:pPr>
@@ -2253,9 +3220,9 @@
         <w:t xml:space="preserve">Projects output to selected stream keys + identifiers</w:t>
       </w:r>
     </w:p>
-    <w:bookmarkEnd w:id="41"/>
-    <w:bookmarkEnd w:id="42"/>
-    <w:bookmarkStart w:id="43" w:name="dashboard-interaction-state-machine"/>
+    <w:bookmarkEnd w:id="44"/>
+    <w:bookmarkEnd w:id="45"/>
+    <w:bookmarkStart w:id="46" w:name="dashboard-interaction-state-machine"/>
     <w:p>
       <w:pPr>
         <w:pStyle w:val="Heading3"/>
@@ -2285,7 +3252,7 @@
       <w:pPr>
         <w:numPr>
           <w:ilvl w:val="0"/>
-          <w:numId w:val="1024"/>
+          <w:numId w:val="1033"/>
         </w:numPr>
         <w:pStyle w:val="Compact"/>
       </w:pPr>
@@ -2303,7 +3270,7 @@
       <w:pPr>
         <w:numPr>
           <w:ilvl w:val="0"/>
-          <w:numId w:val="1024"/>
+          <w:numId w:val="1033"/>
         </w:numPr>
         <w:pStyle w:val="Compact"/>
       </w:pPr>
@@ -2321,7 +3288,7 @@
       <w:pPr>
         <w:numPr>
           <w:ilvl w:val="0"/>
-          <w:numId w:val="1024"/>
+          <w:numId w:val="1033"/>
         </w:numPr>
         <w:pStyle w:val="Compact"/>
       </w:pPr>
@@ -2339,7 +3306,7 @@
       <w:pPr>
         <w:numPr>
           <w:ilvl w:val="0"/>
-          <w:numId w:val="1024"/>
+          <w:numId w:val="1033"/>
         </w:numPr>
         <w:pStyle w:val="Compact"/>
       </w:pPr>
@@ -2365,7 +3332,7 @@
       <w:pPr>
         <w:numPr>
           <w:ilvl w:val="0"/>
-          <w:numId w:val="1025"/>
+          <w:numId w:val="1034"/>
         </w:numPr>
         <w:pStyle w:val="Compact"/>
       </w:pPr>
@@ -2386,7 +3353,7 @@
       <w:pPr>
         <w:numPr>
           <w:ilvl w:val="0"/>
-          <w:numId w:val="1025"/>
+          <w:numId w:val="1034"/>
         </w:numPr>
         <w:pStyle w:val="Compact"/>
       </w:pPr>
@@ -2403,8 +3370,8 @@
         <w:t xml:space="preserve">)</w:t>
       </w:r>
     </w:p>
-    <w:bookmarkEnd w:id="43"/>
-    <w:bookmarkStart w:id="48" w:name="correlation-and-trendline-internals"/>
+    <w:bookmarkEnd w:id="46"/>
+    <w:bookmarkStart w:id="51" w:name="correlation-and-trendline-internals"/>
     <w:p>
       <w:pPr>
         <w:pStyle w:val="Heading3"/>
@@ -2413,7 +3380,7 @@
         <w:t xml:space="preserve">5.4 Correlation and trendline internals</w:t>
       </w:r>
     </w:p>
-    <w:bookmarkStart w:id="44" w:name="pearson-correlation"/>
+    <w:bookmarkStart w:id="47" w:name="pearson-correlation"/>
     <w:p>
       <w:pPr>
         <w:pStyle w:val="Heading4"/>
@@ -2460,7 +3427,7 @@
       <w:pPr>
         <w:numPr>
           <w:ilvl w:val="0"/>
-          <w:numId w:val="1026"/>
+          <w:numId w:val="1035"/>
         </w:numPr>
         <w:pStyle w:val="Compact"/>
       </w:pPr>
@@ -2472,7 +3439,7 @@
       <w:pPr>
         <w:numPr>
           <w:ilvl w:val="0"/>
-          <w:numId w:val="1026"/>
+          <w:numId w:val="1035"/>
         </w:numPr>
         <w:pStyle w:val="Compact"/>
       </w:pPr>
@@ -2493,7 +3460,7 @@
       <w:pPr>
         <w:numPr>
           <w:ilvl w:val="0"/>
-          <w:numId w:val="1026"/>
+          <w:numId w:val="1035"/>
         </w:numPr>
         <w:pStyle w:val="Compact"/>
       </w:pPr>
@@ -2514,7 +3481,7 @@
       <w:pPr>
         <w:numPr>
           <w:ilvl w:val="0"/>
-          <w:numId w:val="1026"/>
+          <w:numId w:val="1035"/>
         </w:numPr>
         <w:pStyle w:val="Compact"/>
       </w:pPr>
@@ -2537,8 +3504,8 @@
         <w:t xml:space="preserve">(subject to finite denominator)</w:t>
       </w:r>
     </w:p>
-    <w:bookmarkEnd w:id="44"/>
-    <w:bookmarkStart w:id="45" w:name="best-pair-selection"/>
+    <w:bookmarkEnd w:id="47"/>
+    <w:bookmarkStart w:id="48" w:name="best-pair-selection"/>
     <w:p>
       <w:pPr>
         <w:pStyle w:val="Heading4"/>
@@ -2565,7 +3532,7 @@
       <w:pPr>
         <w:numPr>
           <w:ilvl w:val="0"/>
-          <w:numId w:val="1027"/>
+          <w:numId w:val="1036"/>
         </w:numPr>
         <w:pStyle w:val="Compact"/>
       </w:pPr>
@@ -2586,7 +3553,7 @@
       <w:pPr>
         <w:numPr>
           <w:ilvl w:val="0"/>
-          <w:numId w:val="1027"/>
+          <w:numId w:val="1036"/>
         </w:numPr>
         <w:pStyle w:val="Compact"/>
       </w:pPr>
@@ -2598,7 +3565,7 @@
       <w:pPr>
         <w:numPr>
           <w:ilvl w:val="0"/>
-          <w:numId w:val="1027"/>
+          <w:numId w:val="1036"/>
         </w:numPr>
         <w:pStyle w:val="Compact"/>
       </w:pPr>
@@ -2619,7 +3586,7 @@
       <w:pPr>
         <w:numPr>
           <w:ilvl w:val="0"/>
-          <w:numId w:val="1027"/>
+          <w:numId w:val="1036"/>
         </w:numPr>
         <w:pStyle w:val="Compact"/>
       </w:pPr>
@@ -2648,7 +3615,7 @@
       <w:pPr>
         <w:numPr>
           <w:ilvl w:val="0"/>
-          <w:numId w:val="1028"/>
+          <w:numId w:val="1037"/>
         </w:numPr>
         <w:pStyle w:val="Compact"/>
       </w:pPr>
@@ -2684,7 +3651,7 @@
       <w:pPr>
         <w:numPr>
           <w:ilvl w:val="0"/>
-          <w:numId w:val="1028"/>
+          <w:numId w:val="1037"/>
         </w:numPr>
         <w:pStyle w:val="Compact"/>
       </w:pPr>
@@ -2705,7 +3672,7 @@
       <w:pPr>
         <w:numPr>
           <w:ilvl w:val="0"/>
-          <w:numId w:val="1028"/>
+          <w:numId w:val="1037"/>
         </w:numPr>
         <w:pStyle w:val="Compact"/>
       </w:pPr>
@@ -2722,8 +3689,8 @@
         <w:t xml:space="preserve">O(k^2 * n)</w:t>
       </w:r>
     </w:p>
-    <w:bookmarkEnd w:id="45"/>
-    <w:bookmarkStart w:id="46" w:name="variance-guard"/>
+    <w:bookmarkEnd w:id="48"/>
+    <w:bookmarkStart w:id="49" w:name="variance-guard"/>
     <w:p>
       <w:pPr>
         <w:pStyle w:val="Heading4"/>
@@ -2753,7 +3720,7 @@
       <w:pPr>
         <w:numPr>
           <w:ilvl w:val="0"/>
-          <w:numId w:val="1029"/>
+          <w:numId w:val="1038"/>
         </w:numPr>
         <w:pStyle w:val="Compact"/>
       </w:pPr>
@@ -2774,7 +3741,7 @@
       <w:pPr>
         <w:numPr>
           <w:ilvl w:val="0"/>
-          <w:numId w:val="1029"/>
+          <w:numId w:val="1038"/>
         </w:numPr>
         <w:pStyle w:val="Compact"/>
       </w:pPr>
@@ -2782,8 +3749,8 @@
         <w:t xml:space="preserve">prevents meaningless scatter interpretation when stream is constant</w:t>
       </w:r>
     </w:p>
-    <w:bookmarkEnd w:id="46"/>
-    <w:bookmarkStart w:id="47" w:name="trendline-generation"/>
+    <w:bookmarkEnd w:id="49"/>
+    <w:bookmarkStart w:id="50" w:name="trendline-generation"/>
     <w:p>
       <w:pPr>
         <w:pStyle w:val="Heading4"/>
@@ -2813,7 +3780,7 @@
       <w:pPr>
         <w:numPr>
           <w:ilvl w:val="0"/>
-          <w:numId w:val="1030"/>
+          <w:numId w:val="1039"/>
         </w:numPr>
         <w:pStyle w:val="Compact"/>
       </w:pPr>
@@ -2825,7 +3792,7 @@
       <w:pPr>
         <w:numPr>
           <w:ilvl w:val="0"/>
-          <w:numId w:val="1030"/>
+          <w:numId w:val="1039"/>
         </w:numPr>
         <w:pStyle w:val="Compact"/>
       </w:pPr>
@@ -2837,7 +3804,7 @@
       <w:pPr>
         <w:numPr>
           <w:ilvl w:val="0"/>
-          <w:numId w:val="1030"/>
+          <w:numId w:val="1039"/>
         </w:numPr>
         <w:pStyle w:val="Compact"/>
       </w:pPr>
@@ -2866,9 +3833,9 @@
         <w:t xml:space="preserve">(xMax, yMaxFit)</w:t>
       </w:r>
     </w:p>
-    <w:bookmarkEnd w:id="47"/>
-    <w:bookmarkEnd w:id="48"/>
-    <w:bookmarkStart w:id="49" w:name="known-implementation-notes"/>
+    <w:bookmarkEnd w:id="50"/>
+    <w:bookmarkEnd w:id="51"/>
+    <w:bookmarkStart w:id="52" w:name="known-implementation-notes"/>
     <w:p>
       <w:pPr>
         <w:pStyle w:val="Heading3"/>
@@ -2881,7 +3848,7 @@
       <w:pPr>
         <w:numPr>
           <w:ilvl w:val="0"/>
-          <w:numId w:val="1031"/>
+          <w:numId w:val="1040"/>
         </w:numPr>
         <w:pStyle w:val="Compact"/>
       </w:pPr>
@@ -2902,7 +3869,7 @@
       <w:pPr>
         <w:numPr>
           <w:ilvl w:val="0"/>
-          <w:numId w:val="1031"/>
+          <w:numId w:val="1040"/>
         </w:numPr>
         <w:pStyle w:val="Compact"/>
       </w:pPr>
@@ -2917,9 +3884,9 @@
         </w:pict>
       </w:r>
     </w:p>
-    <w:bookmarkEnd w:id="49"/>
-    <w:bookmarkEnd w:id="50"/>
-    <w:bookmarkStart w:id="54" w:name="data-model-and-contract"/>
+    <w:bookmarkEnd w:id="52"/>
+    <w:bookmarkEnd w:id="53"/>
+    <w:bookmarkStart w:id="57" w:name="data-model-and-contract"/>
     <w:p>
       <w:pPr>
         <w:pStyle w:val="Heading2"/>
@@ -2928,7 +3895,7 @@
         <w:t xml:space="preserve">6. Data Model and Contract</w:t>
       </w:r>
     </w:p>
-    <w:bookmarkStart w:id="51" w:name="canonical-record"/>
+    <w:bookmarkStart w:id="54" w:name="canonical-record"/>
     <w:p>
       <w:pPr>
         <w:pStyle w:val="Heading3"/>
@@ -3185,8 +4152,8 @@
         <w:t xml:space="preserve">}</w:t>
       </w:r>
     </w:p>
-    <w:bookmarkEnd w:id="51"/>
-    <w:bookmarkStart w:id="52" w:name="field-semantics"/>
+    <w:bookmarkEnd w:id="54"/>
+    <w:bookmarkStart w:id="55" w:name="field-semantics"/>
     <w:p>
       <w:pPr>
         <w:pStyle w:val="Heading3"/>
@@ -3199,7 +4166,7 @@
       <w:pPr>
         <w:numPr>
           <w:ilvl w:val="0"/>
-          <w:numId w:val="1032"/>
+          <w:numId w:val="1041"/>
         </w:numPr>
         <w:pStyle w:val="Compact"/>
       </w:pPr>
@@ -3217,7 +4184,7 @@
       <w:pPr>
         <w:numPr>
           <w:ilvl w:val="0"/>
-          <w:numId w:val="1032"/>
+          <w:numId w:val="1041"/>
         </w:numPr>
         <w:pStyle w:val="Compact"/>
       </w:pPr>
@@ -3235,7 +4202,7 @@
       <w:pPr>
         <w:numPr>
           <w:ilvl w:val="0"/>
-          <w:numId w:val="1032"/>
+          <w:numId w:val="1041"/>
         </w:numPr>
         <w:pStyle w:val="Compact"/>
       </w:pPr>
@@ -3247,7 +4214,7 @@
       <w:pPr>
         <w:numPr>
           <w:ilvl w:val="0"/>
-          <w:numId w:val="1032"/>
+          <w:numId w:val="1041"/>
         </w:numPr>
         <w:pStyle w:val="Compact"/>
       </w:pPr>
@@ -3261,8 +4228,8 @@
         <w:t xml:space="preserve">: optional preprocessing marker</w:t>
       </w:r>
     </w:p>
-    <w:bookmarkEnd w:id="52"/>
-    <w:bookmarkStart w:id="53" w:name="data-validation-expectations"/>
+    <w:bookmarkEnd w:id="55"/>
+    <w:bookmarkStart w:id="56" w:name="data-validation-expectations"/>
     <w:p>
       <w:pPr>
         <w:pStyle w:val="Heading3"/>
@@ -3275,7 +4242,7 @@
       <w:pPr>
         <w:numPr>
           <w:ilvl w:val="0"/>
-          <w:numId w:val="1033"/>
+          <w:numId w:val="1042"/>
         </w:numPr>
         <w:pStyle w:val="Compact"/>
       </w:pPr>
@@ -3308,7 +4275,7 @@
       <w:pPr>
         <w:numPr>
           <w:ilvl w:val="0"/>
-          <w:numId w:val="1033"/>
+          <w:numId w:val="1042"/>
         </w:numPr>
         <w:pStyle w:val="Compact"/>
       </w:pPr>
@@ -3320,7 +4287,7 @@
       <w:pPr>
         <w:numPr>
           <w:ilvl w:val="0"/>
-          <w:numId w:val="1033"/>
+          <w:numId w:val="1042"/>
         </w:numPr>
         <w:pStyle w:val="Compact"/>
       </w:pPr>
@@ -3350,9 +4317,9 @@
         </w:pict>
       </w:r>
     </w:p>
-    <w:bookmarkEnd w:id="53"/>
-    <w:bookmarkEnd w:id="54"/>
-    <w:bookmarkStart w:id="58" w:name="low-level-sequence-flows"/>
+    <w:bookmarkEnd w:id="56"/>
+    <w:bookmarkEnd w:id="57"/>
+    <w:bookmarkStart w:id="61" w:name="low-level-sequence-flows"/>
     <w:p>
       <w:pPr>
         <w:pStyle w:val="Heading2"/>
@@ -3361,7 +4328,7 @@
         <w:t xml:space="preserve">7. Low-Level Sequence Flows</w:t>
       </w:r>
     </w:p>
-    <w:bookmarkStart w:id="55" w:name="stream-selection-and-filtering"/>
+    <w:bookmarkStart w:id="58" w:name="stream-selection-and-filtering"/>
     <w:p>
       <w:pPr>
         <w:pStyle w:val="Heading3"/>
@@ -3374,7 +4341,7 @@
       <w:pPr>
         <w:numPr>
           <w:ilvl w:val="0"/>
-          <w:numId w:val="1034"/>
+          <w:numId w:val="1043"/>
         </w:numPr>
         <w:pStyle w:val="Compact"/>
       </w:pPr>
@@ -3395,7 +4362,7 @@
       <w:pPr>
         <w:numPr>
           <w:ilvl w:val="0"/>
-          <w:numId w:val="1034"/>
+          <w:numId w:val="1043"/>
         </w:numPr>
         <w:pStyle w:val="Compact"/>
       </w:pPr>
@@ -3422,7 +4389,7 @@
       <w:pPr>
         <w:numPr>
           <w:ilvl w:val="0"/>
-          <w:numId w:val="1034"/>
+          <w:numId w:val="1043"/>
         </w:numPr>
         <w:pStyle w:val="Compact"/>
       </w:pPr>
@@ -3443,7 +4410,7 @@
       <w:pPr>
         <w:numPr>
           <w:ilvl w:val="0"/>
-          <w:numId w:val="1034"/>
+          <w:numId w:val="1043"/>
         </w:numPr>
         <w:pStyle w:val="Compact"/>
       </w:pPr>
@@ -3475,8 +4442,8 @@
         <w:t xml:space="preserve">re-render from filtered output</w:t>
       </w:r>
     </w:p>
-    <w:bookmarkEnd w:id="55"/>
-    <w:bookmarkStart w:id="56" w:name="two-stream-insight-path"/>
+    <w:bookmarkEnd w:id="58"/>
+    <w:bookmarkStart w:id="59" w:name="two-stream-insight-path"/>
     <w:p>
       <w:pPr>
         <w:pStyle w:val="Heading3"/>
@@ -3489,7 +4456,7 @@
       <w:pPr>
         <w:numPr>
           <w:ilvl w:val="0"/>
-          <w:numId w:val="1035"/>
+          <w:numId w:val="1044"/>
         </w:numPr>
         <w:pStyle w:val="Compact"/>
       </w:pPr>
@@ -3501,7 +4468,7 @@
       <w:pPr>
         <w:numPr>
           <w:ilvl w:val="0"/>
-          <w:numId w:val="1035"/>
+          <w:numId w:val="1044"/>
         </w:numPr>
         <w:pStyle w:val="Compact"/>
       </w:pPr>
@@ -3531,7 +4498,7 @@
       <w:pPr>
         <w:numPr>
           <w:ilvl w:val="0"/>
-          <w:numId w:val="1035"/>
+          <w:numId w:val="1044"/>
         </w:numPr>
         <w:pStyle w:val="Compact"/>
       </w:pPr>
@@ -3552,7 +4519,7 @@
       <w:pPr>
         <w:numPr>
           <w:ilvl w:val="0"/>
-          <w:numId w:val="1035"/>
+          <w:numId w:val="1044"/>
         </w:numPr>
         <w:pStyle w:val="Compact"/>
       </w:pPr>
@@ -3560,8 +4527,8 @@
         <w:t xml:space="preserve">Recharts renders points and trendline</w:t>
       </w:r>
     </w:p>
-    <w:bookmarkEnd w:id="56"/>
-    <w:bookmarkStart w:id="57" w:name="three-or-more-stream-insight-path"/>
+    <w:bookmarkEnd w:id="59"/>
+    <w:bookmarkStart w:id="60" w:name="three-or-more-stream-insight-path"/>
     <w:p>
       <w:pPr>
         <w:pStyle w:val="Heading3"/>
@@ -3574,7 +4541,7 @@
       <w:pPr>
         <w:numPr>
           <w:ilvl w:val="0"/>
-          <w:numId w:val="1036"/>
+          <w:numId w:val="1045"/>
         </w:numPr>
         <w:pStyle w:val="Compact"/>
       </w:pPr>
@@ -3586,7 +4553,7 @@
       <w:pPr>
         <w:numPr>
           <w:ilvl w:val="0"/>
-          <w:numId w:val="1036"/>
+          <w:numId w:val="1045"/>
         </w:numPr>
         <w:pStyle w:val="Compact"/>
       </w:pPr>
@@ -3607,7 +4574,7 @@
       <w:pPr>
         <w:numPr>
           <w:ilvl w:val="0"/>
-          <w:numId w:val="1036"/>
+          <w:numId w:val="1045"/>
         </w:numPr>
         <w:pStyle w:val="Compact"/>
       </w:pPr>
@@ -3628,7 +4595,7 @@
       <w:pPr>
         <w:numPr>
           <w:ilvl w:val="0"/>
-          <w:numId w:val="1036"/>
+          <w:numId w:val="1045"/>
         </w:numPr>
         <w:pStyle w:val="Compact"/>
       </w:pPr>
@@ -3643,9 +4610,9 @@
         </w:pict>
       </w:r>
     </w:p>
-    <w:bookmarkEnd w:id="57"/>
-    <w:bookmarkEnd w:id="58"/>
-    <w:bookmarkStart w:id="62" w:name="error-handling-and-resilience"/>
+    <w:bookmarkEnd w:id="60"/>
+    <w:bookmarkEnd w:id="61"/>
+    <w:bookmarkStart w:id="65" w:name="error-handling-and-resilience"/>
     <w:p>
       <w:pPr>
         <w:pStyle w:val="Heading2"/>
@@ -3654,7 +4621,7 @@
         <w:t xml:space="preserve">8. Error Handling and Resilience</w:t>
       </w:r>
     </w:p>
-    <w:bookmarkStart w:id="59" w:name="backend"/>
+    <w:bookmarkStart w:id="62" w:name="backend"/>
     <w:p>
       <w:pPr>
         <w:pStyle w:val="Heading3"/>
@@ -3667,7 +4634,7 @@
       <w:pPr>
         <w:numPr>
           <w:ilvl w:val="0"/>
-          <w:numId w:val="1037"/>
+          <w:numId w:val="1046"/>
         </w:numPr>
         <w:pStyle w:val="Compact"/>
       </w:pPr>
@@ -3688,7 +4655,7 @@
       <w:pPr>
         <w:numPr>
           <w:ilvl w:val="0"/>
-          <w:numId w:val="1037"/>
+          <w:numId w:val="1046"/>
         </w:numPr>
         <w:pStyle w:val="Compact"/>
       </w:pPr>
@@ -3709,7 +4676,7 @@
       <w:pPr>
         <w:numPr>
           <w:ilvl w:val="0"/>
-          <w:numId w:val="1037"/>
+          <w:numId w:val="1046"/>
         </w:numPr>
         <w:pStyle w:val="Compact"/>
       </w:pPr>
@@ -3726,8 +4693,8 @@
         <w:t xml:space="preserve">404</w:t>
       </w:r>
     </w:p>
-    <w:bookmarkEnd w:id="59"/>
-    <w:bookmarkStart w:id="60" w:name="frontend"/>
+    <w:bookmarkEnd w:id="62"/>
+    <w:bookmarkStart w:id="63" w:name="frontend"/>
     <w:p>
       <w:pPr>
         <w:pStyle w:val="Heading3"/>
@@ -3740,7 +4707,7 @@
       <w:pPr>
         <w:numPr>
           <w:ilvl w:val="0"/>
-          <w:numId w:val="1038"/>
+          <w:numId w:val="1047"/>
         </w:numPr>
         <w:pStyle w:val="Compact"/>
       </w:pPr>
@@ -3752,7 +4719,7 @@
       <w:pPr>
         <w:numPr>
           <w:ilvl w:val="0"/>
-          <w:numId w:val="1038"/>
+          <w:numId w:val="1047"/>
         </w:numPr>
         <w:pStyle w:val="Compact"/>
       </w:pPr>
@@ -3760,8 +4727,8 @@
         <w:t xml:space="preserve">when variance is insufficient, component returns explanatory text instead of chart</w:t>
       </w:r>
     </w:p>
-    <w:bookmarkEnd w:id="60"/>
-    <w:bookmarkStart w:id="61" w:name="operational-guardrails"/>
+    <w:bookmarkEnd w:id="63"/>
+    <w:bookmarkStart w:id="64" w:name="operational-guardrails"/>
     <w:p>
       <w:pPr>
         <w:pStyle w:val="Heading3"/>
@@ -3774,7 +4741,7 @@
       <w:pPr>
         <w:numPr>
           <w:ilvl w:val="0"/>
-          <w:numId w:val="1039"/>
+          <w:numId w:val="1048"/>
         </w:numPr>
         <w:pStyle w:val="Compact"/>
       </w:pPr>
@@ -3801,7 +4768,7 @@
       <w:pPr>
         <w:numPr>
           <w:ilvl w:val="0"/>
-          <w:numId w:val="1039"/>
+          <w:numId w:val="1048"/>
         </w:numPr>
         <w:pStyle w:val="Compact"/>
       </w:pPr>
@@ -3813,7 +4780,7 @@
       <w:pPr>
         <w:numPr>
           <w:ilvl w:val="0"/>
-          <w:numId w:val="1039"/>
+          <w:numId w:val="1048"/>
         </w:numPr>
         <w:pStyle w:val="Compact"/>
       </w:pPr>
@@ -3828,9 +4795,9 @@
         </w:pict>
       </w:r>
     </w:p>
-    <w:bookmarkEnd w:id="61"/>
-    <w:bookmarkEnd w:id="62"/>
-    <w:bookmarkStart w:id="65" w:name="X135cda126bc3bb6426e45f076c3e3a1689333b0"/>
+    <w:bookmarkEnd w:id="64"/>
+    <w:bookmarkEnd w:id="65"/>
+    <w:bookmarkStart w:id="68" w:name="X135cda126bc3bb6426e45f076c3e3a1689333b0"/>
     <w:p>
       <w:pPr>
         <w:pStyle w:val="Heading2"/>
@@ -3851,7 +4818,7 @@
       <w:pPr>
         <w:numPr>
           <w:ilvl w:val="0"/>
-          <w:numId w:val="1040"/>
+          <w:numId w:val="1049"/>
         </w:numPr>
         <w:pStyle w:val="Compact"/>
       </w:pPr>
@@ -3887,7 +4854,7 @@
       <w:pPr>
         <w:numPr>
           <w:ilvl w:val="0"/>
-          <w:numId w:val="1040"/>
+          <w:numId w:val="1049"/>
         </w:numPr>
         <w:pStyle w:val="Compact"/>
       </w:pPr>
@@ -3919,7 +4886,7 @@
         <w:t xml:space="preserve">)</w:t>
       </w:r>
     </w:p>
-    <w:bookmarkStart w:id="63" w:name="why-they-are-separate-currently"/>
+    <w:bookmarkStart w:id="66" w:name="why-they-are-separate-currently"/>
     <w:p>
       <w:pPr>
         <w:pStyle w:val="Heading3"/>
@@ -3932,7 +4899,7 @@
       <w:pPr>
         <w:numPr>
           <w:ilvl w:val="0"/>
-          <w:numId w:val="1041"/>
+          <w:numId w:val="1050"/>
         </w:numPr>
         <w:pStyle w:val="Compact"/>
       </w:pPr>
@@ -3944,7 +4911,7 @@
       <w:pPr>
         <w:numPr>
           <w:ilvl w:val="0"/>
-          <w:numId w:val="1041"/>
+          <w:numId w:val="1050"/>
         </w:numPr>
         <w:pStyle w:val="Compact"/>
       </w:pPr>
@@ -3956,7 +4923,7 @@
       <w:pPr>
         <w:numPr>
           <w:ilvl w:val="0"/>
-          <w:numId w:val="1041"/>
+          <w:numId w:val="1050"/>
         </w:numPr>
         <w:pStyle w:val="Compact"/>
       </w:pPr>
@@ -3964,8 +4931,8 @@
         <w:t xml:space="preserve">primary Node path is lightweight demo API over local processed JSON</w:t>
       </w:r>
     </w:p>
-    <w:bookmarkEnd w:id="63"/>
-    <w:bookmarkStart w:id="64" w:name="contract-mismatch-to-note"/>
+    <w:bookmarkEnd w:id="66"/>
+    <w:bookmarkStart w:id="67" w:name="contract-mismatch-to-note"/>
     <w:p>
       <w:pPr>
         <w:pStyle w:val="Heading3"/>
@@ -3978,7 +4945,7 @@
       <w:pPr>
         <w:numPr>
           <w:ilvl w:val="0"/>
-          <w:numId w:val="1042"/>
+          <w:numId w:val="1051"/>
         </w:numPr>
         <w:pStyle w:val="Compact"/>
       </w:pPr>
@@ -4008,7 +4975,7 @@
       <w:pPr>
         <w:numPr>
           <w:ilvl w:val="0"/>
-          <w:numId w:val="1042"/>
+          <w:numId w:val="1051"/>
         </w:numPr>
         <w:pStyle w:val="Compact"/>
       </w:pPr>
@@ -4050,7 +5017,7 @@
       <w:pPr>
         <w:numPr>
           <w:ilvl w:val="0"/>
-          <w:numId w:val="1042"/>
+          <w:numId w:val="1051"/>
         </w:numPr>
         <w:pStyle w:val="Compact"/>
       </w:pPr>
@@ -4065,9 +5032,9 @@
         </w:pict>
       </w:r>
     </w:p>
-    <w:bookmarkEnd w:id="64"/>
-    <w:bookmarkEnd w:id="65"/>
-    <w:bookmarkStart w:id="69" w:name="testing-strategy-low-level"/>
+    <w:bookmarkEnd w:id="67"/>
+    <w:bookmarkEnd w:id="68"/>
+    <w:bookmarkStart w:id="72" w:name="testing-strategy-low-level"/>
     <w:p>
       <w:pPr>
         <w:pStyle w:val="Heading2"/>
@@ -4076,7 +5043,7 @@
         <w:t xml:space="preserve">10. Testing Strategy (Low-Level)</w:t>
       </w:r>
     </w:p>
-    <w:bookmarkStart w:id="66" w:name="backend-unitintegration-tests"/>
+    <w:bookmarkStart w:id="69" w:name="backend-unitintegration-tests"/>
     <w:p>
       <w:pPr>
         <w:pStyle w:val="Heading3"/>
@@ -4089,7 +5056,7 @@
       <w:pPr>
         <w:numPr>
           <w:ilvl w:val="0"/>
-          <w:numId w:val="1043"/>
+          <w:numId w:val="1052"/>
         </w:numPr>
         <w:pStyle w:val="Compact"/>
       </w:pPr>
@@ -4101,7 +5068,7 @@
       <w:pPr>
         <w:numPr>
           <w:ilvl w:val="1"/>
-          <w:numId w:val="1044"/>
+          <w:numId w:val="1053"/>
         </w:numPr>
         <w:pStyle w:val="Compact"/>
       </w:pPr>
@@ -4113,7 +5080,7 @@
       <w:pPr>
         <w:numPr>
           <w:ilvl w:val="1"/>
-          <w:numId w:val="1044"/>
+          <w:numId w:val="1053"/>
         </w:numPr>
         <w:pStyle w:val="Compact"/>
       </w:pPr>
@@ -4125,7 +5092,7 @@
       <w:pPr>
         <w:numPr>
           <w:ilvl w:val="0"/>
-          <w:numId w:val="1043"/>
+          <w:numId w:val="1052"/>
         </w:numPr>
         <w:pStyle w:val="Compact"/>
       </w:pPr>
@@ -4137,7 +5104,7 @@
       <w:pPr>
         <w:numPr>
           <w:ilvl w:val="1"/>
-          <w:numId w:val="1045"/>
+          <w:numId w:val="1054"/>
         </w:numPr>
         <w:pStyle w:val="Compact"/>
       </w:pPr>
@@ -4149,7 +5116,7 @@
       <w:pPr>
         <w:numPr>
           <w:ilvl w:val="1"/>
-          <w:numId w:val="1045"/>
+          <w:numId w:val="1054"/>
         </w:numPr>
         <w:pStyle w:val="Compact"/>
       </w:pPr>
@@ -4161,7 +5128,7 @@
       <w:pPr>
         <w:numPr>
           <w:ilvl w:val="0"/>
-          <w:numId w:val="1043"/>
+          <w:numId w:val="1052"/>
         </w:numPr>
         <w:pStyle w:val="Compact"/>
       </w:pPr>
@@ -4173,15 +5140,15 @@
       <w:pPr>
         <w:numPr>
           <w:ilvl w:val="1"/>
-          <w:numId w:val="1046"/>
-        </w:numPr>
-        <w:pStyle w:val="Compact"/>
-      </w:pPr>
-      <w:r>
-        <w:rPr>
-          <w:rStyle w:val="VerbatimChar"/>
-        </w:rPr>
-        <w:t xml:space="preserve">GET /api/streams</w:t>
+          <w:numId w:val="1055"/>
+        </w:numPr>
+        <w:pStyle w:val="Compact"/>
+      </w:pPr>
+      <w:r>
+        <w:rPr>
+          <w:rStyle w:val="VerbatimChar"/>
+        </w:rPr>
+        <w:t xml:space="preserve">GET /</w:t>
       </w:r>
       <w:r>
         <w:t xml:space="preserve"> </w:t>
@@ -4202,14 +5169,50 @@
         <w:t xml:space="preserve"> </w:t>
       </w:r>
       <w:r>
-        <w:t xml:space="preserve">and non-empty array</w:t>
+        <w:t xml:space="preserve">and status text</w:t>
       </w:r>
     </w:p>
     <w:p>
       <w:pPr>
         <w:numPr>
           <w:ilvl w:val="1"/>
-          <w:numId w:val="1046"/>
+          <w:numId w:val="1055"/>
+        </w:numPr>
+        <w:pStyle w:val="Compact"/>
+      </w:pPr>
+      <w:r>
+        <w:rPr>
+          <w:rStyle w:val="VerbatimChar"/>
+        </w:rPr>
+        <w:t xml:space="preserve">GET /health</w:t>
+      </w:r>
+      <w:r>
+        <w:t xml:space="preserve"> </w:t>
+      </w:r>
+      <w:r>
+        <w:t xml:space="preserve">-&gt;</w:t>
+      </w:r>
+      <w:r>
+        <w:t xml:space="preserve"> </w:t>
+      </w:r>
+      <w:r>
+        <w:rPr>
+          <w:rStyle w:val="VerbatimChar"/>
+        </w:rPr>
+        <w:t xml:space="preserve">200</w:t>
+      </w:r>
+      <w:r>
+        <w:t xml:space="preserve"> </w:t>
+      </w:r>
+      <w:r>
+        <w:t xml:space="preserve">and health payload</w:t>
+      </w:r>
+    </w:p>
+    <w:p>
+      <w:pPr>
+        <w:numPr>
+          <w:ilvl w:val="1"/>
+          <w:numId w:val="1055"/>
         </w:numPr>
         <w:pStyle w:val="Compact"/>
       </w:pPr>
@@ -4238,29 +5241,14 @@
         <w:t xml:space="preserve"> </w:t>
       </w:r>
       <w:r>
-        <w:t xml:space="preserve">or</w:t>
-      </w:r>
-      <w:r>
-        <w:t xml:space="preserve"> </w:t>
-      </w:r>
-      <w:r>
-        <w:rPr>
-          <w:rStyle w:val="VerbatimChar"/>
-        </w:rPr>
-        <w:t xml:space="preserve">404</w:t>
-      </w:r>
-      <w:r>
-        <w:t xml:space="preserve"> </w:t>
-      </w:r>
-      <w:r>
-        <w:t xml:space="preserve">on empty data</w:t>
+        <w:t xml:space="preserve">and non-empty stream array</w:t>
       </w:r>
     </w:p>
     <w:p>
       <w:pPr>
         <w:numPr>
           <w:ilvl w:val="1"/>
-          <w:numId w:val="1046"/>
+          <w:numId w:val="1055"/>
         </w:numPr>
         <w:pStyle w:val="Compact"/>
       </w:pPr>
@@ -4286,8 +5274,104 @@
         <w:t xml:space="preserve">400</w:t>
       </w:r>
     </w:p>
-    <w:bookmarkEnd w:id="66"/>
-    <w:bookmarkStart w:id="67" w:name="frontend-tests"/>
+    <w:p>
+      <w:pPr>
+        <w:numPr>
+          <w:ilvl w:val="1"/>
+          <w:numId w:val="1055"/>
+        </w:numPr>
+        <w:pStyle w:val="Compact"/>
+      </w:pPr>
+      <w:r>
+        <w:rPr>
+          <w:rStyle w:val="VerbatimChar"/>
+        </w:rPr>
+        <w:t xml:space="preserve">GET /api/data-profile</w:t>
+      </w:r>
+      <w:r>
+        <w:t xml:space="preserve"> </w:t>
+      </w:r>
+      <w:r>
+        <w:t xml:space="preserve">-&gt;</w:t>
+      </w:r>
+      <w:r>
+        <w:t xml:space="preserve"> </w:t>
+      </w:r>
+      <w:r>
+        <w:rPr>
+          <w:rStyle w:val="VerbatimChar"/>
+        </w:rPr>
+        <w:t xml:space="preserve">200</w:t>
+      </w:r>
+      <w:r>
+        <w:t xml:space="preserve"> </w:t>
+      </w:r>
+      <w:r>
+        <w:t xml:space="preserve">and profile payload</w:t>
+      </w:r>
+    </w:p>
+    <w:p>
+      <w:pPr>
+        <w:numPr>
+          <w:ilvl w:val="1"/>
+          <w:numId w:val="1055"/>
+        </w:numPr>
+        <w:pStyle w:val="Compact"/>
+      </w:pPr>
+      <w:r>
+        <w:rPr>
+          <w:rStyle w:val="VerbatimChar"/>
+        </w:rPr>
+        <w:t xml:space="preserve">POST /api/top-correlated-pair</w:t>
+      </w:r>
+      <w:r>
+        <w:t xml:space="preserve"> </w:t>
+      </w:r>
+      <w:r>
+        <w:t xml:space="preserve">valid payload -&gt;</w:t>
+      </w:r>
+      <w:r>
+        <w:t xml:space="preserve"> </w:t>
+      </w:r>
+      <w:r>
+        <w:rPr>
+          <w:rStyle w:val="VerbatimChar"/>
+        </w:rPr>
+        <w:t xml:space="preserve">200</w:t>
+      </w:r>
+    </w:p>
+    <w:p>
+      <w:pPr>
+        <w:numPr>
+          <w:ilvl w:val="1"/>
+          <w:numId w:val="1055"/>
+        </w:numPr>
+        <w:pStyle w:val="Compact"/>
+      </w:pPr>
+      <w:r>
+        <w:rPr>
+          <w:rStyle w:val="VerbatimChar"/>
+        </w:rPr>
+        <w:t xml:space="preserve">POST /api/top-correlated-pair</w:t>
+      </w:r>
+      <w:r>
+        <w:t xml:space="preserve"> </w:t>
+      </w:r>
+      <w:r>
+        <w:t xml:space="preserve">short list payload -&gt;</w:t>
+      </w:r>
+      <w:r>
+        <w:t xml:space="preserve"> </w:t>
+      </w:r>
+      <w:r>
+        <w:rPr>
+          <w:rStyle w:val="VerbatimChar"/>
+        </w:rPr>
+        <w:t xml:space="preserve">400</w:t>
+      </w:r>
+    </w:p>
+    <w:bookmarkEnd w:id="69"/>
+    <w:bookmarkStart w:id="70" w:name="frontend-tests"/>
     <w:p>
       <w:pPr>
         <w:pStyle w:val="Heading3"/>
@@ -4300,7 +5384,7 @@
       <w:pPr>
         <w:numPr>
           <w:ilvl w:val="0"/>
-          <w:numId w:val="1047"/>
+          <w:numId w:val="1056"/>
         </w:numPr>
         <w:pStyle w:val="Compact"/>
       </w:pPr>
@@ -4312,7 +5396,7 @@
       <w:pPr>
         <w:numPr>
           <w:ilvl w:val="1"/>
-          <w:numId w:val="1048"/>
+          <w:numId w:val="1057"/>
         </w:numPr>
         <w:pStyle w:val="Compact"/>
       </w:pPr>
@@ -4333,7 +5417,7 @@
       <w:pPr>
         <w:numPr>
           <w:ilvl w:val="1"/>
-          <w:numId w:val="1048"/>
+          <w:numId w:val="1057"/>
         </w:numPr>
         <w:pStyle w:val="Compact"/>
       </w:pPr>
@@ -4354,7 +5438,7 @@
       <w:pPr>
         <w:numPr>
           <w:ilvl w:val="0"/>
-          <w:numId w:val="1047"/>
+          <w:numId w:val="1056"/>
         </w:numPr>
         <w:pStyle w:val="Compact"/>
       </w:pPr>
@@ -4366,7 +5450,7 @@
       <w:pPr>
         <w:numPr>
           <w:ilvl w:val="1"/>
-          <w:numId w:val="1049"/>
+          <w:numId w:val="1058"/>
         </w:numPr>
         <w:pStyle w:val="Compact"/>
       </w:pPr>
@@ -4378,7 +5462,7 @@
       <w:pPr>
         <w:numPr>
           <w:ilvl w:val="1"/>
-          <w:numId w:val="1049"/>
+          <w:numId w:val="1058"/>
         </w:numPr>
         <w:pStyle w:val="Compact"/>
       </w:pPr>
@@ -4390,7 +5474,7 @@
       <w:pPr>
         <w:numPr>
           <w:ilvl w:val="1"/>
-          <w:numId w:val="1049"/>
+          <w:numId w:val="1058"/>
         </w:numPr>
         <w:pStyle w:val="Compact"/>
       </w:pPr>
@@ -4402,7 +5486,7 @@
       <w:pPr>
         <w:numPr>
           <w:ilvl w:val="0"/>
-          <w:numId w:val="1047"/>
+          <w:numId w:val="1056"/>
         </w:numPr>
         <w:pStyle w:val="Compact"/>
       </w:pPr>
@@ -4414,7 +5498,7 @@
       <w:pPr>
         <w:numPr>
           <w:ilvl w:val="1"/>
-          <w:numId w:val="1050"/>
+          <w:numId w:val="1059"/>
         </w:numPr>
         <w:pStyle w:val="Compact"/>
       </w:pPr>
@@ -4422,8 +5506,8 @@
         <w:t xml:space="preserve">dashboard conditionally renders sections by stream count</w:t>
       </w:r>
     </w:p>
-    <w:bookmarkEnd w:id="67"/>
-    <w:bookmarkStart w:id="68" w:name="suggested-tooling"/>
+    <w:bookmarkEnd w:id="70"/>
+    <w:bookmarkStart w:id="71" w:name="suggested-tooling"/>
     <w:p>
       <w:pPr>
         <w:pStyle w:val="Heading3"/>
@@ -4436,7 +5520,7 @@
       <w:pPr>
         <w:numPr>
           <w:ilvl w:val="0"/>
-          <w:numId w:val="1051"/>
+          <w:numId w:val="1060"/>
         </w:numPr>
         <w:pStyle w:val="Compact"/>
       </w:pPr>
@@ -4472,7 +5556,7 @@
       <w:pPr>
         <w:numPr>
           <w:ilvl w:val="0"/>
-          <w:numId w:val="1051"/>
+          <w:numId w:val="1060"/>
         </w:numPr>
         <w:pStyle w:val="Compact"/>
       </w:pPr>
@@ -4511,9 +5595,9 @@
         </w:pict>
       </w:r>
     </w:p>
-    <w:bookmarkEnd w:id="68"/>
-    <w:bookmarkEnd w:id="69"/>
-    <w:bookmarkStart w:id="70" w:name="performance-and-scaling-notes"/>
+    <w:bookmarkEnd w:id="71"/>
+    <w:bookmarkEnd w:id="72"/>
+    <w:bookmarkStart w:id="73" w:name="performance-and-scaling-notes"/>
     <w:p>
       <w:pPr>
         <w:pStyle w:val="Heading2"/>
@@ -4526,7 +5610,7 @@
       <w:pPr>
         <w:numPr>
           <w:ilvl w:val="0"/>
-          <w:numId w:val="1052"/>
+          <w:numId w:val="1061"/>
         </w:numPr>
         <w:pStyle w:val="Compact"/>
       </w:pPr>
@@ -4538,7 +5622,7 @@
       <w:pPr>
         <w:numPr>
           <w:ilvl w:val="0"/>
-          <w:numId w:val="1052"/>
+          <w:numId w:val="1061"/>
         </w:numPr>
         <w:pStyle w:val="Compact"/>
       </w:pPr>
@@ -4550,7 +5634,7 @@
       <w:pPr>
         <w:numPr>
           <w:ilvl w:val="0"/>
-          <w:numId w:val="1052"/>
+          <w:numId w:val="1061"/>
         </w:numPr>
         <w:pStyle w:val="Compact"/>
       </w:pPr>
@@ -4583,7 +5667,7 @@
       <w:pPr>
         <w:numPr>
           <w:ilvl w:val="0"/>
-          <w:numId w:val="1052"/>
+          <w:numId w:val="1061"/>
         </w:numPr>
         <w:pStyle w:val="Compact"/>
       </w:pPr>
@@ -4598,8 +5682,8 @@
         </w:pict>
       </w:r>
     </w:p>
-    <w:bookmarkEnd w:id="70"/>
-    <w:bookmarkStart w:id="73" w:name="runbook-developer"/>
+    <w:bookmarkEnd w:id="73"/>
+    <w:bookmarkStart w:id="76" w:name="runbook-developer"/>
     <w:p>
       <w:pPr>
         <w:pStyle w:val="Heading2"/>
@@ -4608,7 +5692,7 @@
         <w:t xml:space="preserve">12. Runbook (Developer)</w:t>
       </w:r>
     </w:p>
-    <w:bookmarkStart w:id="71" w:name="primary-converged-path"/>
+    <w:bookmarkStart w:id="74" w:name="primary-converged-path"/>
     <w:p>
       <w:pPr>
         <w:pStyle w:val="Heading3"/>
@@ -4742,8 +5826,8 @@
         <w:t xml:space="preserve"> run dev</w:t>
       </w:r>
     </w:p>
-    <w:bookmarkEnd w:id="71"/>
-    <w:bookmarkStart w:id="72" w:name="optional-analytics-path"/>
+    <w:bookmarkEnd w:id="74"/>
+    <w:bookmarkStart w:id="75" w:name="optional-analytics-path"/>
     <w:p>
       <w:pPr>
         <w:pStyle w:val="Heading3"/>
@@ -4833,9 +5917,9 @@
         </w:pict>
       </w:r>
     </w:p>
-    <w:bookmarkEnd w:id="72"/>
-    <w:bookmarkEnd w:id="73"/>
-    <w:bookmarkStart w:id="74" w:name="Xc5bcb3243cad40239a8e0033af637955e44e197"/>
+    <w:bookmarkEnd w:id="75"/>
+    <w:bookmarkEnd w:id="76"/>
+    <w:bookmarkStart w:id="77" w:name="Xc5bcb3243cad40239a8e0033af637955e44e197"/>
     <w:p>
       <w:pPr>
         <w:pStyle w:val="Heading2"/>
@@ -4848,34 +5932,7 @@
       <w:pPr>
         <w:numPr>
           <w:ilvl w:val="0"/>
-          <w:numId w:val="1053"/>
-        </w:numPr>
-        <w:pStyle w:val="Compact"/>
-      </w:pPr>
-      <w:r>
-        <w:t xml:space="preserve">add</w:t>
-      </w:r>
-      <w:r>
-        <w:t xml:space="preserve"> </w:t>
-      </w:r>
-      <w:r>
-        <w:rPr>
-          <w:rStyle w:val="VerbatimChar"/>
-        </w:rPr>
-        <w:t xml:space="preserve">/health</w:t>
-      </w:r>
-      <w:r>
-        <w:t xml:space="preserve"> </w:t>
-      </w:r>
-      <w:r>
-        <w:t xml:space="preserve">endpoint for backend operational checks</w:t>
-      </w:r>
-    </w:p>
-    <w:p>
-      <w:pPr>
-        <w:numPr>
-          <w:ilvl w:val="0"/>
-          <w:numId w:val="1053"/>
+          <w:numId w:val="1062"/>
         </w:numPr>
         <w:pStyle w:val="Compact"/>
       </w:pPr>
@@ -4887,7 +5944,7 @@
       <w:pPr>
         <w:numPr>
           <w:ilvl w:val="0"/>
-          <w:numId w:val="1053"/>
+          <w:numId w:val="1062"/>
         </w:numPr>
         <w:pStyle w:val="Compact"/>
       </w:pPr>
@@ -4926,7 +5983,7 @@
       <w:pPr>
         <w:numPr>
           <w:ilvl w:val="0"/>
-          <w:numId w:val="1053"/>
+          <w:numId w:val="1062"/>
         </w:numPr>
         <w:pStyle w:val="Compact"/>
       </w:pPr>
@@ -4938,7 +5995,7 @@
       <w:pPr>
         <w:numPr>
           <w:ilvl w:val="0"/>
-          <w:numId w:val="1053"/>
+          <w:numId w:val="1062"/>
         </w:numPr>
         <w:pStyle w:val="Compact"/>
       </w:pPr>
@@ -4950,7 +6007,7 @@
       <w:pPr>
         <w:numPr>
           <w:ilvl w:val="0"/>
-          <w:numId w:val="1053"/>
+          <w:numId w:val="1062"/>
         </w:numPr>
         <w:pStyle w:val="Compact"/>
       </w:pPr>
@@ -4965,8 +6022,8 @@
         </w:pict>
       </w:r>
     </w:p>
-    <w:bookmarkEnd w:id="74"/>
-    <w:bookmarkStart w:id="75" w:name="definition-of-done-for-lld-compliance"/>
+    <w:bookmarkEnd w:id="77"/>
+    <w:bookmarkStart w:id="78" w:name="definition-of-done-for-lld-compliance"/>
     <w:p>
       <w:pPr>
         <w:pStyle w:val="Heading2"/>
@@ -4987,7 +6044,7 @@
       <w:pPr>
         <w:numPr>
           <w:ilvl w:val="0"/>
-          <w:numId w:val="1054"/>
+          <w:numId w:val="1063"/>
         </w:numPr>
         <w:pStyle w:val="Compact"/>
       </w:pPr>
@@ -4999,7 +6056,7 @@
       <w:pPr>
         <w:numPr>
           <w:ilvl w:val="0"/>
-          <w:numId w:val="1054"/>
+          <w:numId w:val="1063"/>
         </w:numPr>
         <w:pStyle w:val="Compact"/>
       </w:pPr>
@@ -5011,7 +6068,7 @@
       <w:pPr>
         <w:numPr>
           <w:ilvl w:val="0"/>
-          <w:numId w:val="1054"/>
+          <w:numId w:val="1063"/>
         </w:numPr>
         <w:pStyle w:val="Compact"/>
       </w:pPr>
@@ -5023,7 +6080,7 @@
       <w:pPr>
         <w:numPr>
           <w:ilvl w:val="0"/>
-          <w:numId w:val="1054"/>
+          <w:numId w:val="1063"/>
         </w:numPr>
         <w:pStyle w:val="Compact"/>
       </w:pPr>
@@ -5035,7 +6092,7 @@
       <w:pPr>
         <w:numPr>
           <w:ilvl w:val="0"/>
-          <w:numId w:val="1054"/>
+          <w:numId w:val="1063"/>
         </w:numPr>
         <w:pStyle w:val="Compact"/>
       </w:pPr>
@@ -5043,8 +6100,8 @@
         <w:t xml:space="preserve">test coverage includes critical utility, service, and route behavior</w:t>
       </w:r>
     </w:p>
-    <w:bookmarkEnd w:id="75"/>
-    <w:bookmarkEnd w:id="76"/>
+    <w:bookmarkEnd w:id="78"/>
+    <w:bookmarkEnd w:id="79"/>
     <w:sectPr/>
   </w:body>
 </w:document>
@@ -5442,6 +6499,33 @@
     <w:abstractNumId w:val="991"/>
   </w:num>
   <w:num w:numId="1034">
+    <w:abstractNumId w:val="991"/>
+  </w:num>
+  <w:num w:numId="1035">
+    <w:abstractNumId w:val="991"/>
+  </w:num>
+  <w:num w:numId="1036">
+    <w:abstractNumId w:val="991"/>
+  </w:num>
+  <w:num w:numId="1037">
+    <w:abstractNumId w:val="991"/>
+  </w:num>
+  <w:num w:numId="1038">
+    <w:abstractNumId w:val="991"/>
+  </w:num>
+  <w:num w:numId="1039">
+    <w:abstractNumId w:val="991"/>
+  </w:num>
+  <w:num w:numId="1040">
+    <w:abstractNumId w:val="991"/>
+  </w:num>
+  <w:num w:numId="1041">
+    <w:abstractNumId w:val="991"/>
+  </w:num>
+  <w:num w:numId="1042">
+    <w:abstractNumId w:val="991"/>
+  </w:num>
+  <w:num w:numId="1043">
     <w:abstractNumId w:val="99411"/>
     <w:lvlOverride w:ilvl="0">
       <w:startOverride w:val="1"/>
@@ -5471,7 +6555,7 @@
       <w:startOverride w:val="1"/>
     </w:lvlOverride>
   </w:num>
-  <w:num w:numId="1035">
+  <w:num w:numId="1044">
     <w:abstractNumId w:val="99411"/>
     <w:lvlOverride w:ilvl="0">
       <w:startOverride w:val="1"/>
@@ -5501,7 +6585,7 @@
       <w:startOverride w:val="1"/>
     </w:lvlOverride>
   </w:num>
-  <w:num w:numId="1036">
+  <w:num w:numId="1045">
     <w:abstractNumId w:val="99411"/>
     <w:lvlOverride w:ilvl="0">
       <w:startOverride w:val="1"/>
@@ -5531,33 +6615,6 @@
       <w:startOverride w:val="1"/>
     </w:lvlOverride>
   </w:num>
-  <w:num w:numId="1037">
-    <w:abstractNumId w:val="991"/>
-  </w:num>
-  <w:num w:numId="1038">
-    <w:abstractNumId w:val="991"/>
-  </w:num>
-  <w:num w:numId="1039">
-    <w:abstractNumId w:val="991"/>
-  </w:num>
-  <w:num w:numId="1040">
-    <w:abstractNumId w:val="991"/>
-  </w:num>
-  <w:num w:numId="1041">
-    <w:abstractNumId w:val="991"/>
-  </w:num>
-  <w:num w:numId="1042">
-    <w:abstractNumId w:val="991"/>
-  </w:num>
-  <w:num w:numId="1043">
-    <w:abstractNumId w:val="991"/>
-  </w:num>
-  <w:num w:numId="1044">
-    <w:abstractNumId w:val="991"/>
-  </w:num>
-  <w:num w:numId="1045">
-    <w:abstractNumId w:val="991"/>
-  </w:num>
   <w:num w:numId="1046">
     <w:abstractNumId w:val="991"/>
   </w:num>
@@ -5583,6 +6640,33 @@
     <w:abstractNumId w:val="991"/>
   </w:num>
   <w:num w:numId="1054">
+    <w:abstractNumId w:val="991"/>
+  </w:num>
+  <w:num w:numId="1055">
+    <w:abstractNumId w:val="991"/>
+  </w:num>
+  <w:num w:numId="1056">
+    <w:abstractNumId w:val="991"/>
+  </w:num>
+  <w:num w:numId="1057">
+    <w:abstractNumId w:val="991"/>
+  </w:num>
+  <w:num w:numId="1058">
+    <w:abstractNumId w:val="991"/>
+  </w:num>
+  <w:num w:numId="1059">
+    <w:abstractNumId w:val="991"/>
+  </w:num>
+  <w:num w:numId="1060">
+    <w:abstractNumId w:val="991"/>
+  </w:num>
+  <w:num w:numId="1061">
+    <w:abstractNumId w:val="991"/>
+  </w:num>
+  <w:num w:numId="1062">
+    <w:abstractNumId w:val="991"/>
+  </w:num>
+  <w:num w:numId="1063">
     <w:abstractNumId w:val="991"/>
   </w:num>
 </w:numbering>

</xml_diff>

<commit_message>
New updated as per other Team Implementations
</commit_message>
<xml_diff>
--- a/docs/LLD.docx
+++ b/docs/LLD.docx
@@ -2,7 +2,7 @@
 <file path=word/document.xml><?xml version="1.0" encoding="utf-8"?>
 <w:document xmlns:w="http://schemas.openxmlformats.org/wordprocessingml/2006/main" xmlns:m="http://schemas.openxmlformats.org/officeDocument/2006/math" xmlns:r="http://schemas.openxmlformats.org/officeDocument/2006/relationships" xmlns:o="urn:schemas-microsoft-com:office:office" xmlns:v="urn:schemas-microsoft-com:vml" xmlns:w10="urn:schemas-microsoft-com:office:word" xmlns:a="http://schemas.openxmlformats.org/drawingml/2006/main" xmlns:pic="http://schemas.openxmlformats.org/drawingml/2006/picture" xmlns:wp="http://schemas.openxmlformats.org/drawingml/2006/wordprocessingDrawing">
   <w:body>
-    <w:bookmarkStart w:id="79" w:name="X76f88b2687ad45cf359f79bc4105a81cfd3547f"/>
+    <w:bookmarkStart w:id="83" w:name="X76f88b2687ad45cf359f79bc4105a81cfd3547f"/>
     <w:p>
       <w:pPr>
         <w:pStyle w:val="Heading1"/>
@@ -121,6 +121,29 @@
     <w:p>
       <w:pPr>
         <w:pStyle w:val="FirstParagraph"/>
+      </w:pPr>
+      <w:r>
+        <w:t xml:space="preserve">Repository sync note (2026-05-14): this LLD reflects latest merged team contributions currently present in the monorepo, including the parallel</w:t>
+      </w:r>
+      <w:r>
+        <w:t xml:space="preserve"> </w:t>
+      </w:r>
+      <w:r>
+        <w:rPr>
+          <w:rStyle w:val="VerbatimChar"/>
+        </w:rPr>
+        <w:t xml:space="preserve">frontend</w:t>
+      </w:r>
+      <w:r>
+        <w:t xml:space="preserve"> </w:t>
+      </w:r>
+      <w:r>
+        <w:t xml:space="preserve">app and Dockerized Django stack assets.</w:t>
+      </w:r>
+    </w:p>
+    <w:p>
+      <w:pPr>
+        <w:pStyle w:val="BodyText"/>
       </w:pPr>
       <w:r>
         <w:t xml:space="preserve">The goal is to provide implementation-ready detail for API contracts, module responsibilities, runtime flow, algorithms, testing, and operational behavior.</w:t>
@@ -385,7 +408,43 @@
         <w:t xml:space="preserve">pages/</w:t>
       </w:r>
       <w:r>
-        <w:t xml:space="preserve">: top-level route pages (</w:t>
+        <w:t xml:space="preserve">: route pages (</w:t>
+      </w:r>
+      <w:r>
+        <w:rPr>
+          <w:rStyle w:val="VerbatimChar"/>
+        </w:rPr>
+        <w:t xml:space="preserve">Login</w:t>
+      </w:r>
+      <w:r>
+        <w:t xml:space="preserve">,</w:t>
+      </w:r>
+      <w:r>
+        <w:t xml:space="preserve"> </w:t>
+      </w:r>
+      <w:r>
+        <w:rPr>
+          <w:rStyle w:val="VerbatimChar"/>
+        </w:rPr>
+        <w:t xml:space="preserve">RegistrationPage</w:t>
+      </w:r>
+      <w:r>
+        <w:t xml:space="preserve">,</w:t>
+      </w:r>
+      <w:r>
+        <w:t xml:space="preserve"> </w:t>
+      </w:r>
+      <w:r>
+        <w:rPr>
+          <w:rStyle w:val="VerbatimChar"/>
+        </w:rPr>
+        <w:t xml:space="preserve">ForgotPassword</w:t>
+      </w:r>
+      <w:r>
+        <w:t xml:space="preserve">,</w:t>
+      </w:r>
+      <w:r>
+        <w:t xml:space="preserve"> </w:t>
       </w:r>
       <w:r>
         <w:rPr>
@@ -424,7 +483,7 @@
         <w:t xml:space="preserve">components/</w:t>
       </w:r>
       <w:r>
-        <w:t xml:space="preserve">: rendering and interaction units (selectors, charts, stats, correlation cards)</w:t>
+        <w:t xml:space="preserve">: rendering and interaction units (selectors, charts, stats, correlation cards, shared layout/navbar/footer, dataset card, route guard)</w:t>
       </w:r>
     </w:p>
     <w:p>
@@ -481,6 +540,33 @@
         <w:t xml:space="preserve">: mock datasets for offline mode</w:t>
       </w:r>
     </w:p>
+    <w:p>
+      <w:pPr>
+        <w:numPr>
+          <w:ilvl w:val="0"/>
+          <w:numId w:val="1004"/>
+        </w:numPr>
+        <w:pStyle w:val="Compact"/>
+      </w:pPr>
+      <w:r>
+        <w:rPr>
+          <w:rStyle w:val="VerbatimChar"/>
+        </w:rPr>
+        <w:t xml:space="preserve">services/</w:t>
+      </w:r>
+      <w:r>
+        <w:t xml:space="preserve">: auth integration seam (</w:t>
+      </w:r>
+      <w:r>
+        <w:rPr>
+          <w:rStyle w:val="VerbatimChar"/>
+        </w:rPr>
+        <w:t xml:space="preserve">authClient.js</w:t>
+      </w:r>
+      <w:r>
+        <w:t xml:space="preserve">)</w:t>
+      </w:r>
+    </w:p>
     <w:bookmarkStart w:id="25" w:name="Xc1f31469460d1b87d24545d5332943734517685"/>
     <w:p>
       <w:pPr>
@@ -587,6 +673,60 @@
       </w:r>
       <w:r>
         <w:t xml:space="preserve">: file-based data access</w:t>
+      </w:r>
+    </w:p>
+    <w:p>
+      <w:pPr>
+        <w:numPr>
+          <w:ilvl w:val="0"/>
+          <w:numId w:val="1005"/>
+        </w:numPr>
+        <w:pStyle w:val="Compact"/>
+      </w:pPr>
+      <w:r>
+        <w:rPr>
+          <w:rStyle w:val="VerbatimChar"/>
+        </w:rPr>
+        <w:t xml:space="preserve">middleware/</w:t>
+      </w:r>
+      <w:r>
+        <w:t xml:space="preserve">: request guards (JWT verification middleware from PR #70)</w:t>
+      </w:r>
+    </w:p>
+    <w:p>
+      <w:pPr>
+        <w:numPr>
+          <w:ilvl w:val="0"/>
+          <w:numId w:val="1005"/>
+        </w:numPr>
+        <w:pStyle w:val="Compact"/>
+      </w:pPr>
+      <w:r>
+        <w:rPr>
+          <w:rStyle w:val="VerbatimChar"/>
+        </w:rPr>
+        <w:t xml:space="preserve">utils/</w:t>
+      </w:r>
+      <w:r>
+        <w:t xml:space="preserve">: helper utilities for token and hashing workflows (PR #70)</w:t>
+      </w:r>
+    </w:p>
+    <w:p>
+      <w:pPr>
+        <w:numPr>
+          <w:ilvl w:val="0"/>
+          <w:numId w:val="1005"/>
+        </w:numPr>
+        <w:pStyle w:val="Compact"/>
+      </w:pPr>
+      <w:r>
+        <w:rPr>
+          <w:rStyle w:val="VerbatimChar"/>
+        </w:rPr>
+        <w:t xml:space="preserve">config/</w:t>
+      </w:r>
+      <w:r>
+        <w:t xml:space="preserve">: auth-related configuration seam (PR #70)</w:t>
       </w:r>
     </w:p>
     <w:p>
@@ -621,7 +761,19 @@
         <w:pStyle w:val="FirstParagraph"/>
       </w:pPr>
       <w:r>
-        <w:t xml:space="preserve">File:</w:t>
+        <w:t xml:space="preserve">Files:</w:t>
+      </w:r>
+      <w:r>
+        <w:t xml:space="preserve"> </w:t>
+      </w:r>
+      <w:r>
+        <w:rPr>
+          <w:rStyle w:val="VerbatimChar"/>
+        </w:rPr>
+        <w:t xml:space="preserve">newBackend/BackendCode/app.js</w:t>
+      </w:r>
+      <w:r>
+        <w:t xml:space="preserve">,</w:t>
       </w:r>
       <w:r>
         <w:t xml:space="preserve"> </w:t>
@@ -642,7 +794,16 @@
         <w:pStyle w:val="Compact"/>
       </w:pPr>
       <w:r>
-        <w:t xml:space="preserve">Load env from</w:t>
+        <w:rPr>
+          <w:rStyle w:val="VerbatimChar"/>
+        </w:rPr>
+        <w:t xml:space="preserve">app.js</w:t>
+      </w:r>
+      <w:r>
+        <w:t xml:space="preserve"> </w:t>
+      </w:r>
+      <w:r>
+        <w:t xml:space="preserve">loads env from</w:t>
       </w:r>
       <w:r>
         <w:t xml:space="preserve"> </w:t>
@@ -663,7 +824,16 @@
         <w:pStyle w:val="Compact"/>
       </w:pPr>
       <w:r>
-        <w:t xml:space="preserve">Create Express app</w:t>
+        <w:rPr>
+          <w:rStyle w:val="VerbatimChar"/>
+        </w:rPr>
+        <w:t xml:space="preserve">app.js</w:t>
+      </w:r>
+      <w:r>
+        <w:t xml:space="preserve"> </w:t>
+      </w:r>
+      <w:r>
+        <w:t xml:space="preserve">creates Express app</w:t>
       </w:r>
     </w:p>
     <w:p>
@@ -675,7 +845,16 @@
         <w:pStyle w:val="Compact"/>
       </w:pPr>
       <w:r>
-        <w:t xml:space="preserve">Register middleware:</w:t>
+        <w:rPr>
+          <w:rStyle w:val="VerbatimChar"/>
+        </w:rPr>
+        <w:t xml:space="preserve">app.js</w:t>
+      </w:r>
+      <w:r>
+        <w:t xml:space="preserve"> </w:t>
+      </w:r>
+      <w:r>
+        <w:t xml:space="preserve">registers middleware:</w:t>
       </w:r>
     </w:p>
     <w:p>
@@ -717,7 +896,16 @@
         <w:pStyle w:val="Compact"/>
       </w:pPr>
       <w:r>
-        <w:t xml:space="preserve">Register health/root route (</w:t>
+        <w:rPr>
+          <w:rStyle w:val="VerbatimChar"/>
+        </w:rPr>
+        <w:t xml:space="preserve">app.js</w:t>
+      </w:r>
+      <w:r>
+        <w:t xml:space="preserve"> </w:t>
+      </w:r>
+      <w:r>
+        <w:t xml:space="preserve">registers root and health routes (</w:t>
       </w:r>
       <w:r>
         <w:rPr>
@@ -726,6 +914,18 @@
         <w:t xml:space="preserve">GET /</w:t>
       </w:r>
       <w:r>
+        <w:t xml:space="preserve">,</w:t>
+      </w:r>
+      <w:r>
+        <w:t xml:space="preserve"> </w:t>
+      </w:r>
+      <w:r>
+        <w:rPr>
+          <w:rStyle w:val="VerbatimChar"/>
+        </w:rPr>
+        <w:t xml:space="preserve">GET /health</w:t>
+      </w:r>
+      <w:r>
         <w:t xml:space="preserve">)</w:t>
       </w:r>
     </w:p>
@@ -738,7 +938,16 @@
         <w:pStyle w:val="Compact"/>
       </w:pPr>
       <w:r>
-        <w:t xml:space="preserve">Mount API routes under</w:t>
+        <w:rPr>
+          <w:rStyle w:val="VerbatimChar"/>
+        </w:rPr>
+        <w:t xml:space="preserve">app.js</w:t>
+      </w:r>
+      <w:r>
+        <w:t xml:space="preserve"> </w:t>
+      </w:r>
+      <w:r>
+        <w:t xml:space="preserve">mounts API routes under</w:t>
       </w:r>
       <w:r>
         <w:t xml:space="preserve"> </w:t>
@@ -759,7 +968,16 @@
         <w:pStyle w:val="Compact"/>
       </w:pPr>
       <w:r>
-        <w:t xml:space="preserve">Bind server to</w:t>
+        <w:rPr>
+          <w:rStyle w:val="VerbatimChar"/>
+        </w:rPr>
+        <w:t xml:space="preserve">server.js</w:t>
+      </w:r>
+      <w:r>
+        <w:t xml:space="preserve"> </w:t>
+      </w:r>
+      <w:r>
+        <w:t xml:space="preserve">imports app and binds server to</w:t>
       </w:r>
       <w:r>
         <w:t xml:space="preserve"> </w:t>
@@ -2845,11 +3063,296 @@
         <w:pStyle w:val="Compact"/>
       </w:pPr>
       <w:r>
+        <w:t xml:space="preserve">Public routes:</w:t>
+      </w:r>
+    </w:p>
+    <w:p>
+      <w:pPr>
+        <w:numPr>
+          <w:ilvl w:val="1"/>
+          <w:numId w:val="1029"/>
+        </w:numPr>
+        <w:pStyle w:val="Compact"/>
+      </w:pPr>
+      <w:r>
+        <w:rPr>
+          <w:rStyle w:val="VerbatimChar"/>
+        </w:rPr>
+        <w:t xml:space="preserve">/</w:t>
+      </w:r>
+      <w:r>
+        <w:t xml:space="preserve"> </w:t>
+      </w:r>
+      <w:r>
+        <w:t xml:space="preserve">-&gt;</w:t>
+      </w:r>
+      <w:r>
+        <w:t xml:space="preserve"> </w:t>
+      </w:r>
+      <w:r>
+        <w:rPr>
+          <w:rStyle w:val="VerbatimChar"/>
+        </w:rPr>
+        <w:t xml:space="preserve">Login</w:t>
+      </w:r>
+    </w:p>
+    <w:p>
+      <w:pPr>
+        <w:numPr>
+          <w:ilvl w:val="1"/>
+          <w:numId w:val="1029"/>
+        </w:numPr>
+        <w:pStyle w:val="Compact"/>
+      </w:pPr>
+      <w:r>
+        <w:rPr>
+          <w:rStyle w:val="VerbatimChar"/>
+        </w:rPr>
+        <w:t xml:space="preserve">/register</w:t>
+      </w:r>
+      <w:r>
+        <w:t xml:space="preserve"> </w:t>
+      </w:r>
+      <w:r>
+        <w:t xml:space="preserve">-&gt;</w:t>
+      </w:r>
+      <w:r>
+        <w:t xml:space="preserve"> </w:t>
+      </w:r>
+      <w:r>
+        <w:rPr>
+          <w:rStyle w:val="VerbatimChar"/>
+        </w:rPr>
+        <w:t xml:space="preserve">RegistrationPage</w:t>
+      </w:r>
+    </w:p>
+    <w:p>
+      <w:pPr>
+        <w:numPr>
+          <w:ilvl w:val="1"/>
+          <w:numId w:val="1029"/>
+        </w:numPr>
+        <w:pStyle w:val="Compact"/>
+      </w:pPr>
+      <w:r>
+        <w:rPr>
+          <w:rStyle w:val="VerbatimChar"/>
+        </w:rPr>
+        <w:t xml:space="preserve">/forgot-password</w:t>
+      </w:r>
+      <w:r>
+        <w:t xml:space="preserve"> </w:t>
+      </w:r>
+      <w:r>
+        <w:t xml:space="preserve">-&gt;</w:t>
+      </w:r>
+      <w:r>
+        <w:t xml:space="preserve"> </w:t>
+      </w:r>
+      <w:r>
+        <w:rPr>
+          <w:rStyle w:val="VerbatimChar"/>
+        </w:rPr>
+        <w:t xml:space="preserve">ForgotPassword</w:t>
+      </w:r>
+    </w:p>
+    <w:p>
+      <w:pPr>
+        <w:numPr>
+          <w:ilvl w:val="0"/>
+          <w:numId w:val="1028"/>
+        </w:numPr>
+        <w:pStyle w:val="Compact"/>
+      </w:pPr>
+      <w:r>
+        <w:t xml:space="preserve">Protected routes:</w:t>
+      </w:r>
+    </w:p>
+    <w:p>
+      <w:pPr>
+        <w:numPr>
+          <w:ilvl w:val="1"/>
+          <w:numId w:val="1030"/>
+        </w:numPr>
+        <w:pStyle w:val="Compact"/>
+      </w:pPr>
+      <w:r>
+        <w:rPr>
+          <w:rStyle w:val="VerbatimChar"/>
+        </w:rPr>
+        <w:t xml:space="preserve">/home</w:t>
+      </w:r>
+      <w:r>
+        <w:t xml:space="preserve"> </w:t>
+      </w:r>
+      <w:r>
+        <w:t xml:space="preserve">-&gt;</w:t>
+      </w:r>
+      <w:r>
+        <w:t xml:space="preserve"> </w:t>
+      </w:r>
+      <w:r>
+        <w:rPr>
+          <w:rStyle w:val="VerbatimChar"/>
+        </w:rPr>
+        <w:t xml:space="preserve">ProtectedRoute</w:t>
+      </w:r>
+      <w:r>
+        <w:t xml:space="preserve"> </w:t>
+      </w:r>
+      <w:r>
+        <w:t xml:space="preserve">-&gt;</w:t>
+      </w:r>
+      <w:r>
+        <w:t xml:space="preserve"> </w:t>
+      </w:r>
+      <w:r>
+        <w:rPr>
+          <w:rStyle w:val="VerbatimChar"/>
+        </w:rPr>
+        <w:t xml:space="preserve">Layout</w:t>
+      </w:r>
+      <w:r>
+        <w:t xml:space="preserve"> </w:t>
+      </w:r>
+      <w:r>
+        <w:t xml:space="preserve">-&gt;</w:t>
+      </w:r>
+      <w:r>
+        <w:t xml:space="preserve"> </w:t>
+      </w:r>
+      <w:r>
+        <w:rPr>
+          <w:rStyle w:val="VerbatimChar"/>
+        </w:rPr>
+        <w:t xml:space="preserve">HomePage</w:t>
+      </w:r>
+    </w:p>
+    <w:p>
+      <w:pPr>
+        <w:numPr>
+          <w:ilvl w:val="1"/>
+          <w:numId w:val="1030"/>
+        </w:numPr>
+        <w:pStyle w:val="Compact"/>
+      </w:pPr>
+      <w:r>
+        <w:rPr>
+          <w:rStyle w:val="VerbatimChar"/>
+        </w:rPr>
+        <w:t xml:space="preserve">/dashboard/:id</w:t>
+      </w:r>
+      <w:r>
+        <w:t xml:space="preserve"> </w:t>
+      </w:r>
+      <w:r>
+        <w:t xml:space="preserve">-&gt;</w:t>
+      </w:r>
+      <w:r>
+        <w:t xml:space="preserve"> </w:t>
+      </w:r>
+      <w:r>
+        <w:rPr>
+          <w:rStyle w:val="VerbatimChar"/>
+        </w:rPr>
+        <w:t xml:space="preserve">ProtectedRoute</w:t>
+      </w:r>
+      <w:r>
+        <w:t xml:space="preserve"> </w:t>
+      </w:r>
+      <w:r>
+        <w:t xml:space="preserve">-&gt;</w:t>
+      </w:r>
+      <w:r>
+        <w:t xml:space="preserve"> </w:t>
+      </w:r>
+      <w:r>
+        <w:rPr>
+          <w:rStyle w:val="VerbatimChar"/>
+        </w:rPr>
+        <w:t xml:space="preserve">Layout</w:t>
+      </w:r>
+      <w:r>
+        <w:t xml:space="preserve"> </w:t>
+      </w:r>
+      <w:r>
+        <w:t xml:space="preserve">-&gt;</w:t>
+      </w:r>
+      <w:r>
+        <w:t xml:space="preserve"> </w:t>
+      </w:r>
+      <w:r>
         <w:rPr>
           <w:rStyle w:val="VerbatimChar"/>
         </w:rPr>
         <w:t xml:space="preserve">DashboardPage</w:t>
       </w:r>
+    </w:p>
+    <w:p>
+      <w:pPr>
+        <w:numPr>
+          <w:ilvl w:val="0"/>
+          <w:numId w:val="1028"/>
+        </w:numPr>
+        <w:pStyle w:val="Compact"/>
+      </w:pPr>
+      <w:r>
+        <w:rPr>
+          <w:rStyle w:val="VerbatimChar"/>
+        </w:rPr>
+        <w:t xml:space="preserve">Layout</w:t>
+      </w:r>
+      <w:r>
+        <w:t xml:space="preserve"> </w:t>
+      </w:r>
+      <w:r>
+        <w:t xml:space="preserve">composes shared</w:t>
+      </w:r>
+      <w:r>
+        <w:t xml:space="preserve"> </w:t>
+      </w:r>
+      <w:r>
+        <w:rPr>
+          <w:rStyle w:val="VerbatimChar"/>
+        </w:rPr>
+        <w:t xml:space="preserve">Navbar</w:t>
+      </w:r>
+      <w:r>
+        <w:t xml:space="preserve"> </w:t>
+      </w:r>
+      <w:r>
+        <w:t xml:space="preserve">and</w:t>
+      </w:r>
+      <w:r>
+        <w:t xml:space="preserve"> </w:t>
+      </w:r>
+      <w:r>
+        <w:rPr>
+          <w:rStyle w:val="VerbatimChar"/>
+        </w:rPr>
+        <w:t xml:space="preserve">Footer</w:t>
+      </w:r>
+      <w:r>
+        <w:t xml:space="preserve"> </w:t>
+      </w:r>
+      <w:r>
+        <w:t xml:space="preserve">around protected content.</w:t>
+      </w:r>
+    </w:p>
+    <w:p>
+      <w:pPr>
+        <w:numPr>
+          <w:ilvl w:val="0"/>
+          <w:numId w:val="1028"/>
+        </w:numPr>
+        <w:pStyle w:val="Compact"/>
+      </w:pPr>
+      <w:r>
+        <w:rPr>
+          <w:rStyle w:val="VerbatimChar"/>
+        </w:rPr>
+        <w:t xml:space="preserve">DashboardPage</w:t>
+      </w:r>
       <w:r>
         <w:t xml:space="preserve"> </w:t>
       </w:r>
@@ -2869,7 +3372,7 @@
         <w:t xml:space="preserve"> </w:t>
       </w:r>
       <w:r>
-        <w:t xml:space="preserve">feature composition</w:t>
+        <w:t xml:space="preserve">feature composition.</w:t>
       </w:r>
     </w:p>
     <w:p>
@@ -2881,7 +3384,7 @@
         <w:pStyle w:val="Compact"/>
       </w:pPr>
       <w:r>
-        <w:t xml:space="preserve">Dashboard contains selection controls, charting, stats, and correlation insights</w:t>
+        <w:t xml:space="preserve">Dashboard contains selection controls, charting, stats, and correlation insights.</w:t>
       </w:r>
     </w:p>
     <w:bookmarkEnd w:id="41"/>
@@ -2927,7 +3430,7 @@
       <w:pPr>
         <w:numPr>
           <w:ilvl w:val="0"/>
-          <w:numId w:val="1029"/>
+          <w:numId w:val="1031"/>
         </w:numPr>
         <w:pStyle w:val="Compact"/>
       </w:pPr>
@@ -2948,7 +3451,7 @@
       <w:pPr>
         <w:numPr>
           <w:ilvl w:val="0"/>
-          <w:numId w:val="1029"/>
+          <w:numId w:val="1031"/>
         </w:numPr>
         <w:pStyle w:val="Compact"/>
       </w:pPr>
@@ -2981,7 +3484,7 @@
       <w:pPr>
         <w:numPr>
           <w:ilvl w:val="0"/>
-          <w:numId w:val="1029"/>
+          <w:numId w:val="1031"/>
         </w:numPr>
         <w:pStyle w:val="Compact"/>
       </w:pPr>
@@ -3038,7 +3541,7 @@
       <w:pPr>
         <w:numPr>
           <w:ilvl w:val="0"/>
-          <w:numId w:val="1030"/>
+          <w:numId w:val="1032"/>
         </w:numPr>
         <w:pStyle w:val="Compact"/>
       </w:pPr>
@@ -3050,7 +3553,7 @@
       <w:pPr>
         <w:numPr>
           <w:ilvl w:val="0"/>
-          <w:numId w:val="1030"/>
+          <w:numId w:val="1032"/>
         </w:numPr>
         <w:pStyle w:val="Compact"/>
       </w:pPr>
@@ -3083,7 +3586,7 @@
       <w:pPr>
         <w:numPr>
           <w:ilvl w:val="0"/>
-          <w:numId w:val="1030"/>
+          <w:numId w:val="1032"/>
         </w:numPr>
         <w:pStyle w:val="Compact"/>
       </w:pPr>
@@ -3134,7 +3637,7 @@
       <w:pPr>
         <w:numPr>
           <w:ilvl w:val="0"/>
-          <w:numId w:val="1031"/>
+          <w:numId w:val="1033"/>
         </w:numPr>
         <w:pStyle w:val="Compact"/>
       </w:pPr>
@@ -3146,7 +3649,7 @@
       <w:pPr>
         <w:numPr>
           <w:ilvl w:val="1"/>
-          <w:numId w:val="1032"/>
+          <w:numId w:val="1034"/>
         </w:numPr>
         <w:pStyle w:val="Compact"/>
       </w:pPr>
@@ -3179,7 +3682,7 @@
       <w:pPr>
         <w:numPr>
           <w:ilvl w:val="1"/>
-          <w:numId w:val="1032"/>
+          <w:numId w:val="1034"/>
         </w:numPr>
         <w:pStyle w:val="Compact"/>
       </w:pPr>
@@ -3212,7 +3715,7 @@
       <w:pPr>
         <w:numPr>
           <w:ilvl w:val="0"/>
-          <w:numId w:val="1031"/>
+          <w:numId w:val="1033"/>
         </w:numPr>
         <w:pStyle w:val="Compact"/>
       </w:pPr>
@@ -3252,7 +3755,7 @@
       <w:pPr>
         <w:numPr>
           <w:ilvl w:val="0"/>
-          <w:numId w:val="1033"/>
+          <w:numId w:val="1035"/>
         </w:numPr>
         <w:pStyle w:val="Compact"/>
       </w:pPr>
@@ -3270,7 +3773,7 @@
       <w:pPr>
         <w:numPr>
           <w:ilvl w:val="0"/>
-          <w:numId w:val="1033"/>
+          <w:numId w:val="1035"/>
         </w:numPr>
         <w:pStyle w:val="Compact"/>
       </w:pPr>
@@ -3288,7 +3791,7 @@
       <w:pPr>
         <w:numPr>
           <w:ilvl w:val="0"/>
-          <w:numId w:val="1033"/>
+          <w:numId w:val="1035"/>
         </w:numPr>
         <w:pStyle w:val="Compact"/>
       </w:pPr>
@@ -3306,7 +3809,7 @@
       <w:pPr>
         <w:numPr>
           <w:ilvl w:val="0"/>
-          <w:numId w:val="1033"/>
+          <w:numId w:val="1035"/>
         </w:numPr>
         <w:pStyle w:val="Compact"/>
       </w:pPr>
@@ -3332,7 +3835,7 @@
       <w:pPr>
         <w:numPr>
           <w:ilvl w:val="0"/>
-          <w:numId w:val="1034"/>
+          <w:numId w:val="1036"/>
         </w:numPr>
         <w:pStyle w:val="Compact"/>
       </w:pPr>
@@ -3353,7 +3856,7 @@
       <w:pPr>
         <w:numPr>
           <w:ilvl w:val="0"/>
-          <w:numId w:val="1034"/>
+          <w:numId w:val="1036"/>
         </w:numPr>
         <w:pStyle w:val="Compact"/>
       </w:pPr>
@@ -3427,7 +3930,7 @@
       <w:pPr>
         <w:numPr>
           <w:ilvl w:val="0"/>
-          <w:numId w:val="1035"/>
+          <w:numId w:val="1037"/>
         </w:numPr>
         <w:pStyle w:val="Compact"/>
       </w:pPr>
@@ -3439,7 +3942,7 @@
       <w:pPr>
         <w:numPr>
           <w:ilvl w:val="0"/>
-          <w:numId w:val="1035"/>
+          <w:numId w:val="1037"/>
         </w:numPr>
         <w:pStyle w:val="Compact"/>
       </w:pPr>
@@ -3460,7 +3963,7 @@
       <w:pPr>
         <w:numPr>
           <w:ilvl w:val="0"/>
-          <w:numId w:val="1035"/>
+          <w:numId w:val="1037"/>
         </w:numPr>
         <w:pStyle w:val="Compact"/>
       </w:pPr>
@@ -3481,7 +3984,7 @@
       <w:pPr>
         <w:numPr>
           <w:ilvl w:val="0"/>
-          <w:numId w:val="1035"/>
+          <w:numId w:val="1037"/>
         </w:numPr>
         <w:pStyle w:val="Compact"/>
       </w:pPr>
@@ -3532,7 +4035,7 @@
       <w:pPr>
         <w:numPr>
           <w:ilvl w:val="0"/>
-          <w:numId w:val="1036"/>
+          <w:numId w:val="1038"/>
         </w:numPr>
         <w:pStyle w:val="Compact"/>
       </w:pPr>
@@ -3553,7 +4056,7 @@
       <w:pPr>
         <w:numPr>
           <w:ilvl w:val="0"/>
-          <w:numId w:val="1036"/>
+          <w:numId w:val="1038"/>
         </w:numPr>
         <w:pStyle w:val="Compact"/>
       </w:pPr>
@@ -3565,7 +4068,7 @@
       <w:pPr>
         <w:numPr>
           <w:ilvl w:val="0"/>
-          <w:numId w:val="1036"/>
+          <w:numId w:val="1038"/>
         </w:numPr>
         <w:pStyle w:val="Compact"/>
       </w:pPr>
@@ -3586,7 +4089,7 @@
       <w:pPr>
         <w:numPr>
           <w:ilvl w:val="0"/>
-          <w:numId w:val="1036"/>
+          <w:numId w:val="1038"/>
         </w:numPr>
         <w:pStyle w:val="Compact"/>
       </w:pPr>
@@ -3615,7 +4118,7 @@
       <w:pPr>
         <w:numPr>
           <w:ilvl w:val="0"/>
-          <w:numId w:val="1037"/>
+          <w:numId w:val="1039"/>
         </w:numPr>
         <w:pStyle w:val="Compact"/>
       </w:pPr>
@@ -3651,7 +4154,7 @@
       <w:pPr>
         <w:numPr>
           <w:ilvl w:val="0"/>
-          <w:numId w:val="1037"/>
+          <w:numId w:val="1039"/>
         </w:numPr>
         <w:pStyle w:val="Compact"/>
       </w:pPr>
@@ -3672,7 +4175,7 @@
       <w:pPr>
         <w:numPr>
           <w:ilvl w:val="0"/>
-          <w:numId w:val="1037"/>
+          <w:numId w:val="1039"/>
         </w:numPr>
         <w:pStyle w:val="Compact"/>
       </w:pPr>
@@ -3720,7 +4223,7 @@
       <w:pPr>
         <w:numPr>
           <w:ilvl w:val="0"/>
-          <w:numId w:val="1038"/>
+          <w:numId w:val="1040"/>
         </w:numPr>
         <w:pStyle w:val="Compact"/>
       </w:pPr>
@@ -3741,7 +4244,7 @@
       <w:pPr>
         <w:numPr>
           <w:ilvl w:val="0"/>
-          <w:numId w:val="1038"/>
+          <w:numId w:val="1040"/>
         </w:numPr>
         <w:pStyle w:val="Compact"/>
       </w:pPr>
@@ -3780,7 +4283,7 @@
       <w:pPr>
         <w:numPr>
           <w:ilvl w:val="0"/>
-          <w:numId w:val="1039"/>
+          <w:numId w:val="1041"/>
         </w:numPr>
         <w:pStyle w:val="Compact"/>
       </w:pPr>
@@ -3792,7 +4295,7 @@
       <w:pPr>
         <w:numPr>
           <w:ilvl w:val="0"/>
-          <w:numId w:val="1039"/>
+          <w:numId w:val="1041"/>
         </w:numPr>
         <w:pStyle w:val="Compact"/>
       </w:pPr>
@@ -3804,7 +4307,7 @@
       <w:pPr>
         <w:numPr>
           <w:ilvl w:val="0"/>
-          <w:numId w:val="1039"/>
+          <w:numId w:val="1041"/>
         </w:numPr>
         <w:pStyle w:val="Compact"/>
       </w:pPr>
@@ -3848,7 +4351,7 @@
       <w:pPr>
         <w:numPr>
           <w:ilvl w:val="0"/>
-          <w:numId w:val="1040"/>
+          <w:numId w:val="1042"/>
         </w:numPr>
         <w:pStyle w:val="Compact"/>
       </w:pPr>
@@ -3869,12 +4372,24 @@
       <w:pPr>
         <w:numPr>
           <w:ilvl w:val="0"/>
-          <w:numId w:val="1040"/>
+          <w:numId w:val="1042"/>
         </w:numPr>
         <w:pStyle w:val="Compact"/>
       </w:pPr>
       <w:r>
         <w:t xml:space="preserve">UI text mentions rolling correlation, but active code currently renders static pairwise correlation and trendline only</w:t>
+      </w:r>
+    </w:p>
+    <w:p>
+      <w:pPr>
+        <w:numPr>
+          <w:ilvl w:val="0"/>
+          <w:numId w:val="1042"/>
+        </w:numPr>
+        <w:pStyle w:val="Compact"/>
+      </w:pPr>
+      <w:r>
+        <w:t xml:space="preserve">Auth flow and protected-route shell are now implemented at router level (PR #71), but final token/session contract must be aligned with backend APIs.</w:t>
       </w:r>
     </w:p>
     <w:p>
@@ -4166,7 +4681,7 @@
       <w:pPr>
         <w:numPr>
           <w:ilvl w:val="0"/>
-          <w:numId w:val="1041"/>
+          <w:numId w:val="1043"/>
         </w:numPr>
         <w:pStyle w:val="Compact"/>
       </w:pPr>
@@ -4184,7 +4699,7 @@
       <w:pPr>
         <w:numPr>
           <w:ilvl w:val="0"/>
-          <w:numId w:val="1041"/>
+          <w:numId w:val="1043"/>
         </w:numPr>
         <w:pStyle w:val="Compact"/>
       </w:pPr>
@@ -4202,7 +4717,7 @@
       <w:pPr>
         <w:numPr>
           <w:ilvl w:val="0"/>
-          <w:numId w:val="1041"/>
+          <w:numId w:val="1043"/>
         </w:numPr>
         <w:pStyle w:val="Compact"/>
       </w:pPr>
@@ -4214,7 +4729,7 @@
       <w:pPr>
         <w:numPr>
           <w:ilvl w:val="0"/>
-          <w:numId w:val="1041"/>
+          <w:numId w:val="1043"/>
         </w:numPr>
         <w:pStyle w:val="Compact"/>
       </w:pPr>
@@ -4242,7 +4757,7 @@
       <w:pPr>
         <w:numPr>
           <w:ilvl w:val="0"/>
-          <w:numId w:val="1042"/>
+          <w:numId w:val="1044"/>
         </w:numPr>
         <w:pStyle w:val="Compact"/>
       </w:pPr>
@@ -4275,7 +4790,7 @@
       <w:pPr>
         <w:numPr>
           <w:ilvl w:val="0"/>
-          <w:numId w:val="1042"/>
+          <w:numId w:val="1044"/>
         </w:numPr>
         <w:pStyle w:val="Compact"/>
       </w:pPr>
@@ -4287,7 +4802,7 @@
       <w:pPr>
         <w:numPr>
           <w:ilvl w:val="0"/>
-          <w:numId w:val="1042"/>
+          <w:numId w:val="1044"/>
         </w:numPr>
         <w:pStyle w:val="Compact"/>
       </w:pPr>
@@ -4341,7 +4856,7 @@
       <w:pPr>
         <w:numPr>
           <w:ilvl w:val="0"/>
-          <w:numId w:val="1043"/>
+          <w:numId w:val="1045"/>
         </w:numPr>
         <w:pStyle w:val="Compact"/>
       </w:pPr>
@@ -4362,7 +4877,7 @@
       <w:pPr>
         <w:numPr>
           <w:ilvl w:val="0"/>
-          <w:numId w:val="1043"/>
+          <w:numId w:val="1045"/>
         </w:numPr>
         <w:pStyle w:val="Compact"/>
       </w:pPr>
@@ -4389,7 +4904,7 @@
       <w:pPr>
         <w:numPr>
           <w:ilvl w:val="0"/>
-          <w:numId w:val="1043"/>
+          <w:numId w:val="1045"/>
         </w:numPr>
         <w:pStyle w:val="Compact"/>
       </w:pPr>
@@ -4410,7 +4925,7 @@
       <w:pPr>
         <w:numPr>
           <w:ilvl w:val="0"/>
-          <w:numId w:val="1043"/>
+          <w:numId w:val="1045"/>
         </w:numPr>
         <w:pStyle w:val="Compact"/>
       </w:pPr>
@@ -4456,7 +4971,7 @@
       <w:pPr>
         <w:numPr>
           <w:ilvl w:val="0"/>
-          <w:numId w:val="1044"/>
+          <w:numId w:val="1046"/>
         </w:numPr>
         <w:pStyle w:val="Compact"/>
       </w:pPr>
@@ -4468,7 +4983,7 @@
       <w:pPr>
         <w:numPr>
           <w:ilvl w:val="0"/>
-          <w:numId w:val="1044"/>
+          <w:numId w:val="1046"/>
         </w:numPr>
         <w:pStyle w:val="Compact"/>
       </w:pPr>
@@ -4498,7 +5013,7 @@
       <w:pPr>
         <w:numPr>
           <w:ilvl w:val="0"/>
-          <w:numId w:val="1044"/>
+          <w:numId w:val="1046"/>
         </w:numPr>
         <w:pStyle w:val="Compact"/>
       </w:pPr>
@@ -4519,7 +5034,7 @@
       <w:pPr>
         <w:numPr>
           <w:ilvl w:val="0"/>
-          <w:numId w:val="1044"/>
+          <w:numId w:val="1046"/>
         </w:numPr>
         <w:pStyle w:val="Compact"/>
       </w:pPr>
@@ -4541,7 +5056,7 @@
       <w:pPr>
         <w:numPr>
           <w:ilvl w:val="0"/>
-          <w:numId w:val="1045"/>
+          <w:numId w:val="1047"/>
         </w:numPr>
         <w:pStyle w:val="Compact"/>
       </w:pPr>
@@ -4553,7 +5068,7 @@
       <w:pPr>
         <w:numPr>
           <w:ilvl w:val="0"/>
-          <w:numId w:val="1045"/>
+          <w:numId w:val="1047"/>
         </w:numPr>
         <w:pStyle w:val="Compact"/>
       </w:pPr>
@@ -4574,7 +5089,7 @@
       <w:pPr>
         <w:numPr>
           <w:ilvl w:val="0"/>
-          <w:numId w:val="1045"/>
+          <w:numId w:val="1047"/>
         </w:numPr>
         <w:pStyle w:val="Compact"/>
       </w:pPr>
@@ -4595,7 +5110,7 @@
       <w:pPr>
         <w:numPr>
           <w:ilvl w:val="0"/>
-          <w:numId w:val="1045"/>
+          <w:numId w:val="1047"/>
         </w:numPr>
         <w:pStyle w:val="Compact"/>
       </w:pPr>
@@ -4634,7 +5149,7 @@
       <w:pPr>
         <w:numPr>
           <w:ilvl w:val="0"/>
-          <w:numId w:val="1046"/>
+          <w:numId w:val="1048"/>
         </w:numPr>
         <w:pStyle w:val="Compact"/>
       </w:pPr>
@@ -4655,7 +5170,7 @@
       <w:pPr>
         <w:numPr>
           <w:ilvl w:val="0"/>
-          <w:numId w:val="1046"/>
+          <w:numId w:val="1048"/>
         </w:numPr>
         <w:pStyle w:val="Compact"/>
       </w:pPr>
@@ -4676,7 +5191,7 @@
       <w:pPr>
         <w:numPr>
           <w:ilvl w:val="0"/>
-          <w:numId w:val="1046"/>
+          <w:numId w:val="1048"/>
         </w:numPr>
         <w:pStyle w:val="Compact"/>
       </w:pPr>
@@ -4691,6 +5206,60 @@
           <w:rStyle w:val="VerbatimChar"/>
         </w:rPr>
         <w:t xml:space="preserve">404</w:t>
+      </w:r>
+    </w:p>
+    <w:p>
+      <w:pPr>
+        <w:numPr>
+          <w:ilvl w:val="0"/>
+          <w:numId w:val="1048"/>
+        </w:numPr>
+        <w:pStyle w:val="Compact"/>
+      </w:pPr>
+      <w:r>
+        <w:t xml:space="preserve">auth middleware path returns</w:t>
+      </w:r>
+      <w:r>
+        <w:t xml:space="preserve"> </w:t>
+      </w:r>
+      <w:r>
+        <w:rPr>
+          <w:rStyle w:val="VerbatimChar"/>
+        </w:rPr>
+        <w:t xml:space="preserve">401</w:t>
+      </w:r>
+      <w:r>
+        <w:t xml:space="preserve"> </w:t>
+      </w:r>
+      <w:r>
+        <w:t xml:space="preserve">when token is missing</w:t>
+      </w:r>
+    </w:p>
+    <w:p>
+      <w:pPr>
+        <w:numPr>
+          <w:ilvl w:val="0"/>
+          <w:numId w:val="1048"/>
+        </w:numPr>
+        <w:pStyle w:val="Compact"/>
+      </w:pPr>
+      <w:r>
+        <w:t xml:space="preserve">auth middleware path returns</w:t>
+      </w:r>
+      <w:r>
+        <w:t xml:space="preserve"> </w:t>
+      </w:r>
+      <w:r>
+        <w:rPr>
+          <w:rStyle w:val="VerbatimChar"/>
+        </w:rPr>
+        <w:t xml:space="preserve">403</w:t>
+      </w:r>
+      <w:r>
+        <w:t xml:space="preserve"> </w:t>
+      </w:r>
+      <w:r>
+        <w:t xml:space="preserve">when token is invalid/verification fails</w:t>
       </w:r>
     </w:p>
     <w:bookmarkEnd w:id="62"/>
@@ -4707,7 +5276,7 @@
       <w:pPr>
         <w:numPr>
           <w:ilvl w:val="0"/>
-          <w:numId w:val="1047"/>
+          <w:numId w:val="1049"/>
         </w:numPr>
         <w:pStyle w:val="Compact"/>
       </w:pPr>
@@ -4719,7 +5288,7 @@
       <w:pPr>
         <w:numPr>
           <w:ilvl w:val="0"/>
-          <w:numId w:val="1047"/>
+          <w:numId w:val="1049"/>
         </w:numPr>
         <w:pStyle w:val="Compact"/>
       </w:pPr>
@@ -4741,7 +5310,7 @@
       <w:pPr>
         <w:numPr>
           <w:ilvl w:val="0"/>
-          <w:numId w:val="1048"/>
+          <w:numId w:val="1050"/>
         </w:numPr>
         <w:pStyle w:val="Compact"/>
       </w:pPr>
@@ -4768,7 +5337,7 @@
       <w:pPr>
         <w:numPr>
           <w:ilvl w:val="0"/>
-          <w:numId w:val="1048"/>
+          <w:numId w:val="1050"/>
         </w:numPr>
         <w:pStyle w:val="Compact"/>
       </w:pPr>
@@ -4780,7 +5349,7 @@
       <w:pPr>
         <w:numPr>
           <w:ilvl w:val="0"/>
-          <w:numId w:val="1048"/>
+          <w:numId w:val="1050"/>
         </w:numPr>
         <w:pStyle w:val="Compact"/>
       </w:pPr>
@@ -4797,7 +5366,7 @@
     </w:p>
     <w:bookmarkEnd w:id="64"/>
     <w:bookmarkEnd w:id="65"/>
-    <w:bookmarkStart w:id="68" w:name="X135cda126bc3bb6426e45f076c3e3a1689333b0"/>
+    <w:bookmarkStart w:id="72" w:name="X135cda126bc3bb6426e45f076c3e3a1689333b0"/>
     <w:p>
       <w:pPr>
         <w:pStyle w:val="Heading2"/>
@@ -4818,7 +5387,7 @@
       <w:pPr>
         <w:numPr>
           <w:ilvl w:val="0"/>
-          <w:numId w:val="1049"/>
+          <w:numId w:val="1051"/>
         </w:numPr>
         <w:pStyle w:val="Compact"/>
       </w:pPr>
@@ -4854,7 +5423,7 @@
       <w:pPr>
         <w:numPr>
           <w:ilvl w:val="0"/>
-          <w:numId w:val="1049"/>
+          <w:numId w:val="1051"/>
         </w:numPr>
         <w:pStyle w:val="Compact"/>
       </w:pPr>
@@ -4899,7 +5468,7 @@
       <w:pPr>
         <w:numPr>
           <w:ilvl w:val="0"/>
-          <w:numId w:val="1050"/>
+          <w:numId w:val="1052"/>
         </w:numPr>
         <w:pStyle w:val="Compact"/>
       </w:pPr>
@@ -4911,7 +5480,7 @@
       <w:pPr>
         <w:numPr>
           <w:ilvl w:val="0"/>
-          <w:numId w:val="1050"/>
+          <w:numId w:val="1052"/>
         </w:numPr>
         <w:pStyle w:val="Compact"/>
       </w:pPr>
@@ -4923,7 +5492,7 @@
       <w:pPr>
         <w:numPr>
           <w:ilvl w:val="0"/>
-          <w:numId w:val="1050"/>
+          <w:numId w:val="1052"/>
         </w:numPr>
         <w:pStyle w:val="Compact"/>
       </w:pPr>
@@ -4932,12 +5501,475 @@
       </w:r>
     </w:p>
     <w:bookmarkEnd w:id="66"/>
-    <w:bookmarkStart w:id="67" w:name="contract-mismatch-to-note"/>
+    <w:bookmarkStart w:id="67" w:name="db-implementation-stream-fork-reference"/>
     <w:p>
       <w:pPr>
         <w:pStyle w:val="Heading3"/>
       </w:pPr>
       <w:r>
+        <w:t xml:space="preserve">9.1.1 DB implementation stream (fork reference)</w:t>
+      </w:r>
+    </w:p>
+    <w:p>
+      <w:pPr>
+        <w:numPr>
+          <w:ilvl w:val="0"/>
+          <w:numId w:val="1053"/>
+        </w:numPr>
+        <w:pStyle w:val="Compact"/>
+      </w:pPr>
+      <w:r>
+        <w:t xml:space="preserve">External fork commit history (</w:t>
+      </w:r>
+      <w:r>
+        <w:rPr>
+          <w:rStyle w:val="VerbatimChar"/>
+        </w:rPr>
+        <w:t xml:space="preserve">FarrisBaboo/main</w:t>
+      </w:r>
+      <w:r>
+        <w:t xml:space="preserve">) shows a DB-first implementation stream with ingestion and endpoint updates:</w:t>
+      </w:r>
+    </w:p>
+    <w:p>
+      <w:pPr>
+        <w:numPr>
+          <w:ilvl w:val="1"/>
+          <w:numId w:val="1054"/>
+        </w:numPr>
+        <w:pStyle w:val="Compact"/>
+      </w:pPr>
+      <w:r>
+        <w:rPr>
+          <w:rStyle w:val="VerbatimChar"/>
+        </w:rPr>
+        <w:t xml:space="preserve">5e04d8e</w:t>
+      </w:r>
+      <w:r>
+        <w:t xml:space="preserve"> </w:t>
+      </w:r>
+      <w:r>
+        <w:t xml:space="preserve">ingestion logic + models</w:t>
+      </w:r>
+    </w:p>
+    <w:p>
+      <w:pPr>
+        <w:numPr>
+          <w:ilvl w:val="1"/>
+          <w:numId w:val="1054"/>
+        </w:numPr>
+        <w:pStyle w:val="Compact"/>
+      </w:pPr>
+      <w:r>
+        <w:rPr>
+          <w:rStyle w:val="VerbatimChar"/>
+        </w:rPr>
+        <w:t xml:space="preserve">89e7d28</w:t>
+      </w:r>
+      <w:r>
+        <w:t xml:space="preserve"> </w:t>
+      </w:r>
+      <w:r>
+        <w:t xml:space="preserve">DB controllers/service/repository + ingest fix</w:t>
+      </w:r>
+    </w:p>
+    <w:p>
+      <w:pPr>
+        <w:numPr>
+          <w:ilvl w:val="1"/>
+          <w:numId w:val="1054"/>
+        </w:numPr>
+        <w:pStyle w:val="Compact"/>
+      </w:pPr>
+      <w:r>
+        <w:rPr>
+          <w:rStyle w:val="VerbatimChar"/>
+        </w:rPr>
+        <w:t xml:space="preserve">bffcaba</w:t>
+      </w:r>
+      <w:r>
+        <w:t xml:space="preserve"> </w:t>
+      </w:r>
+      <w:r>
+        <w:t xml:space="preserve">mock-to-DB connection fix</w:t>
+      </w:r>
+    </w:p>
+    <w:p>
+      <w:pPr>
+        <w:numPr>
+          <w:ilvl w:val="1"/>
+          <w:numId w:val="1054"/>
+        </w:numPr>
+        <w:pStyle w:val="Compact"/>
+      </w:pPr>
+      <w:r>
+        <w:rPr>
+          <w:rStyle w:val="VerbatimChar"/>
+        </w:rPr>
+        <w:t xml:space="preserve">c92a28f</w:t>
+      </w:r>
+      <w:r>
+        <w:t xml:space="preserve"> </w:t>
+      </w:r>
+      <w:r>
+        <w:t xml:space="preserve">ingestion pipeline and dataset/series endpoint update</w:t>
+      </w:r>
+    </w:p>
+    <w:p>
+      <w:pPr>
+        <w:pStyle w:val="FirstParagraph"/>
+      </w:pPr>
+      <w:r>
+        <w:t xml:space="preserve">Low-level implication:</w:t>
+      </w:r>
+    </w:p>
+    <w:p>
+      <w:pPr>
+        <w:numPr>
+          <w:ilvl w:val="0"/>
+          <w:numId w:val="1055"/>
+        </w:numPr>
+        <w:pStyle w:val="Compact"/>
+      </w:pPr>
+      <w:r>
+        <w:t xml:space="preserve">LLD should model two repository strategies:</w:t>
+      </w:r>
+    </w:p>
+    <w:p>
+      <w:pPr>
+        <w:numPr>
+          <w:ilvl w:val="1"/>
+          <w:numId w:val="1056"/>
+        </w:numPr>
+        <w:pStyle w:val="Compact"/>
+      </w:pPr>
+      <w:r>
+        <w:rPr>
+          <w:rStyle w:val="VerbatimChar"/>
+        </w:rPr>
+        <w:t xml:space="preserve">FileRepository</w:t>
+      </w:r>
+      <w:r>
+        <w:t xml:space="preserve"> </w:t>
+      </w:r>
+      <w:r>
+        <w:t xml:space="preserve">(current local runtime in this workspace)</w:t>
+      </w:r>
+    </w:p>
+    <w:p>
+      <w:pPr>
+        <w:numPr>
+          <w:ilvl w:val="1"/>
+          <w:numId w:val="1056"/>
+        </w:numPr>
+        <w:pStyle w:val="Compact"/>
+      </w:pPr>
+      <w:r>
+        <w:rPr>
+          <w:rStyle w:val="VerbatimChar"/>
+        </w:rPr>
+        <w:t xml:space="preserve">DbRepository</w:t>
+      </w:r>
+      <w:r>
+        <w:t xml:space="preserve"> </w:t>
+      </w:r>
+      <w:r>
+        <w:t xml:space="preserve">(integration path demonstrated in DB stream)</w:t>
+      </w:r>
+    </w:p>
+    <w:p>
+      <w:pPr>
+        <w:numPr>
+          <w:ilvl w:val="0"/>
+          <w:numId w:val="1055"/>
+        </w:numPr>
+        <w:pStyle w:val="Compact"/>
+      </w:pPr>
+      <w:r>
+        <w:t xml:space="preserve">Controller/service contracts should remain stable so repository implementation can be swapped without route-level refactor.</w:t>
+      </w:r>
+    </w:p>
+    <w:bookmarkEnd w:id="67"/>
+    <w:bookmarkStart w:id="68" w:name="backend-auth-stream-note-pr-70"/>
+    <w:p>
+      <w:pPr>
+        <w:pStyle w:val="Heading3"/>
+      </w:pPr>
+      <w:r>
+        <w:t xml:space="preserve">9.4 Backend auth stream note (PR #70)</w:t>
+      </w:r>
+    </w:p>
+    <w:p>
+      <w:pPr>
+        <w:numPr>
+          <w:ilvl w:val="0"/>
+          <w:numId w:val="1057"/>
+        </w:numPr>
+        <w:pStyle w:val="Compact"/>
+      </w:pPr>
+      <w:r>
+        <w:t xml:space="preserve">Merged backend PR adds lightweight authentication primitives (bcrypt, JWT, middleware) to the Node codebase lineage.</w:t>
+      </w:r>
+    </w:p>
+    <w:p>
+      <w:pPr>
+        <w:numPr>
+          <w:ilvl w:val="0"/>
+          <w:numId w:val="1057"/>
+        </w:numPr>
+        <w:pStyle w:val="Compact"/>
+      </w:pPr>
+      <w:r>
+        <w:t xml:space="preserve">LLD implication: endpoint contracts should now classify routes as</w:t>
+      </w:r>
+      <w:r>
+        <w:t xml:space="preserve"> </w:t>
+      </w:r>
+      <w:r>
+        <w:rPr>
+          <w:rStyle w:val="VerbatimChar"/>
+        </w:rPr>
+        <w:t xml:space="preserve">public</w:t>
+      </w:r>
+      <w:r>
+        <w:t xml:space="preserve"> </w:t>
+      </w:r>
+      <w:r>
+        <w:t xml:space="preserve">vs</w:t>
+      </w:r>
+      <w:r>
+        <w:t xml:space="preserve"> </w:t>
+      </w:r>
+      <w:r>
+        <w:rPr>
+          <w:rStyle w:val="VerbatimChar"/>
+        </w:rPr>
+        <w:t xml:space="preserve">protected</w:t>
+      </w:r>
+      <w:r>
+        <w:t xml:space="preserve"> </w:t>
+      </w:r>
+      <w:r>
+        <w:t xml:space="preserve">and enforce</w:t>
+      </w:r>
+      <w:r>
+        <w:t xml:space="preserve"> </w:t>
+      </w:r>
+      <w:r>
+        <w:rPr>
+          <w:rStyle w:val="VerbatimChar"/>
+        </w:rPr>
+        <w:t xml:space="preserve">Authorization: Bearer &lt;token&gt;</w:t>
+      </w:r>
+      <w:r>
+        <w:t xml:space="preserve"> </w:t>
+      </w:r>
+      <w:r>
+        <w:t xml:space="preserve">on protected operations.</w:t>
+      </w:r>
+    </w:p>
+    <w:p>
+      <w:pPr>
+        <w:numPr>
+          <w:ilvl w:val="0"/>
+          <w:numId w:val="1057"/>
+        </w:numPr>
+        <w:pStyle w:val="Compact"/>
+      </w:pPr>
+      <w:r>
+        <w:t xml:space="preserve">Integration step pending: align frontend auth client calls with backend token issuance/verification endpoints and standardized error payloads.</w:t>
+      </w:r>
+    </w:p>
+    <w:bookmarkEnd w:id="68"/>
+    <w:bookmarkStart w:id="69" w:name="data-science-stream-note-fork-reference"/>
+    <w:p>
+      <w:pPr>
+        <w:pStyle w:val="Heading3"/>
+      </w:pPr>
+      <w:r>
+        <w:t xml:space="preserve">9.5 Data science stream note (fork reference)</w:t>
+      </w:r>
+    </w:p>
+    <w:p>
+      <w:pPr>
+        <w:numPr>
+          <w:ilvl w:val="0"/>
+          <w:numId w:val="1058"/>
+        </w:numPr>
+        <w:pStyle w:val="Compact"/>
+      </w:pPr>
+      <w:r>
+        <w:t xml:space="preserve">External DS fork reference:</w:t>
+      </w:r>
+      <w:r>
+        <w:t xml:space="preserve"> </w:t>
+      </w:r>
+      <w:r>
+        <w:rPr>
+          <w:rStyle w:val="VerbatimChar"/>
+        </w:rPr>
+        <w:t xml:space="preserve">https://github.com/Yashdeep22/Intelligent-IoT-Data-Management</w:t>
+      </w:r>
+    </w:p>
+    <w:p>
+      <w:pPr>
+        <w:numPr>
+          <w:ilvl w:val="0"/>
+          <w:numId w:val="1058"/>
+        </w:numPr>
+        <w:pStyle w:val="Compact"/>
+      </w:pPr>
+      <w:r>
+        <w:t xml:space="preserve">Commit trail indicates a richer detector and benchmarking pipeline, including:</w:t>
+      </w:r>
+    </w:p>
+    <w:p>
+      <w:pPr>
+        <w:numPr>
+          <w:ilvl w:val="1"/>
+          <w:numId w:val="1059"/>
+        </w:numPr>
+        <w:pStyle w:val="Compact"/>
+      </w:pPr>
+      <w:r>
+        <w:t xml:space="preserve">ThresholdAD (</w:t>
+      </w:r>
+      <w:r>
+        <w:rPr>
+          <w:rStyle w:val="VerbatimChar"/>
+        </w:rPr>
+        <w:t xml:space="preserve">2ead71a</w:t>
+      </w:r>
+      <w:r>
+        <w:t xml:space="preserve">)</w:t>
+      </w:r>
+    </w:p>
+    <w:p>
+      <w:pPr>
+        <w:numPr>
+          <w:ilvl w:val="1"/>
+          <w:numId w:val="1059"/>
+        </w:numPr>
+        <w:pStyle w:val="Compact"/>
+      </w:pPr>
+      <w:r>
+        <w:t xml:space="preserve">LOF detector + edge guard (</w:t>
+      </w:r>
+      <w:r>
+        <w:rPr>
+          <w:rStyle w:val="VerbatimChar"/>
+        </w:rPr>
+        <w:t xml:space="preserve">2707a31</w:t>
+      </w:r>
+      <w:r>
+        <w:t xml:space="preserve">,</w:t>
+      </w:r>
+      <w:r>
+        <w:t xml:space="preserve"> </w:t>
+      </w:r>
+      <w:r>
+        <w:rPr>
+          <w:rStyle w:val="VerbatimChar"/>
+        </w:rPr>
+        <w:t xml:space="preserve">a67ac40</w:t>
+      </w:r>
+      <w:r>
+        <w:t xml:space="preserve">)</w:t>
+      </w:r>
+    </w:p>
+    <w:p>
+      <w:pPr>
+        <w:numPr>
+          <w:ilvl w:val="1"/>
+          <w:numId w:val="1059"/>
+        </w:numPr>
+        <w:pStyle w:val="Compact"/>
+      </w:pPr>
+      <w:r>
+        <w:t xml:space="preserve">benchmark label handling and NAB support (</w:t>
+      </w:r>
+      <w:r>
+        <w:rPr>
+          <w:rStyle w:val="VerbatimChar"/>
+        </w:rPr>
+        <w:t xml:space="preserve">6d21e24</w:t>
+      </w:r>
+      <w:r>
+        <w:t xml:space="preserve">,</w:t>
+      </w:r>
+      <w:r>
+        <w:t xml:space="preserve"> </w:t>
+      </w:r>
+      <w:r>
+        <w:rPr>
+          <w:rStyle w:val="VerbatimChar"/>
+        </w:rPr>
+        <w:t xml:space="preserve">f31fad3</w:t>
+      </w:r>
+      <w:r>
+        <w:t xml:space="preserve">)</w:t>
+      </w:r>
+    </w:p>
+    <w:p>
+      <w:pPr>
+        <w:numPr>
+          <w:ilvl w:val="1"/>
+          <w:numId w:val="1059"/>
+        </w:numPr>
+        <w:pStyle w:val="Compact"/>
+      </w:pPr>
+      <w:r>
+        <w:t xml:space="preserve">combined benchmark reporting (</w:t>
+      </w:r>
+      <w:r>
+        <w:rPr>
+          <w:rStyle w:val="VerbatimChar"/>
+        </w:rPr>
+        <w:t xml:space="preserve">7ab182b</w:t>
+      </w:r>
+      <w:r>
+        <w:t xml:space="preserve">)</w:t>
+      </w:r>
+    </w:p>
+    <w:p>
+      <w:pPr>
+        <w:pStyle w:val="FirstParagraph"/>
+      </w:pPr>
+      <w:r>
+        <w:t xml:space="preserve">Low-level implication:</w:t>
+      </w:r>
+    </w:p>
+    <w:p>
+      <w:pPr>
+        <w:numPr>
+          <w:ilvl w:val="0"/>
+          <w:numId w:val="1060"/>
+        </w:numPr>
+        <w:pStyle w:val="Compact"/>
+      </w:pPr>
+      <w:r>
+        <w:t xml:space="preserve">Keep analytics adapters behind a stable detector interface (fit/score/predict contract) so detector substitution does not affect API shape.</w:t>
+      </w:r>
+    </w:p>
+    <w:p>
+      <w:pPr>
+        <w:numPr>
+          <w:ilvl w:val="0"/>
+          <w:numId w:val="1060"/>
+        </w:numPr>
+        <w:pStyle w:val="Compact"/>
+      </w:pPr>
+      <w:r>
+        <w:t xml:space="preserve">Treat benchmark/report scripts as offline evaluation modules and avoid coupling them to request/response critical path.</w:t>
+      </w:r>
+    </w:p>
+    <w:bookmarkEnd w:id="69"/>
+    <w:bookmarkStart w:id="70" w:name="contract-mismatch-to-note"/>
+    <w:p>
+      <w:pPr>
+        <w:pStyle w:val="Heading3"/>
+      </w:pPr>
+      <w:r>
         <w:t xml:space="preserve">9.2 Contract mismatch to note</w:t>
       </w:r>
     </w:p>
@@ -4945,7 +5977,7 @@
       <w:pPr>
         <w:numPr>
           <w:ilvl w:val="0"/>
-          <w:numId w:val="1051"/>
+          <w:numId w:val="1061"/>
         </w:numPr>
         <w:pStyle w:val="Compact"/>
       </w:pPr>
@@ -4975,7 +6007,7 @@
       <w:pPr>
         <w:numPr>
           <w:ilvl w:val="0"/>
-          <w:numId w:val="1051"/>
+          <w:numId w:val="1061"/>
         </w:numPr>
         <w:pStyle w:val="Compact"/>
       </w:pPr>
@@ -5017,12 +6049,145 @@
       <w:pPr>
         <w:numPr>
           <w:ilvl w:val="0"/>
-          <w:numId w:val="1051"/>
+          <w:numId w:val="1061"/>
         </w:numPr>
         <w:pStyle w:val="Compact"/>
       </w:pPr>
       <w:r>
         <w:t xml:space="preserve">Flask expects multipart form-data with file upload, while frontend currently sends JSON</w:t>
+      </w:r>
+    </w:p>
+    <w:bookmarkEnd w:id="70"/>
+    <w:bookmarkStart w:id="71" w:name="additional-frontend-track-note"/>
+    <w:p>
+      <w:pPr>
+        <w:pStyle w:val="Heading3"/>
+      </w:pPr>
+      <w:r>
+        <w:t xml:space="preserve">9.3 Additional frontend track note</w:t>
+      </w:r>
+    </w:p>
+    <w:p>
+      <w:pPr>
+        <w:numPr>
+          <w:ilvl w:val="0"/>
+          <w:numId w:val="1062"/>
+        </w:numPr>
+        <w:pStyle w:val="Compact"/>
+      </w:pPr>
+      <w:r>
+        <w:rPr>
+          <w:rStyle w:val="VerbatimChar"/>
+        </w:rPr>
+        <w:t xml:space="preserve">frontend/src/App.jsx</w:t>
+      </w:r>
+      <w:r>
+        <w:t xml:space="preserve"> </w:t>
+      </w:r>
+      <w:r>
+        <w:t xml:space="preserve">includes</w:t>
+      </w:r>
+      <w:r>
+        <w:t xml:space="preserve"> </w:t>
+      </w:r>
+      <w:r>
+        <w:rPr>
+          <w:rStyle w:val="VerbatimChar"/>
+        </w:rPr>
+        <w:t xml:space="preserve">Login</w:t>
+      </w:r>
+      <w:r>
+        <w:t xml:space="preserve">,</w:t>
+      </w:r>
+      <w:r>
+        <w:t xml:space="preserve"> </w:t>
+      </w:r>
+      <w:r>
+        <w:rPr>
+          <w:rStyle w:val="VerbatimChar"/>
+        </w:rPr>
+        <w:t xml:space="preserve">Register</w:t>
+      </w:r>
+      <w:r>
+        <w:t xml:space="preserve">, and</w:t>
+      </w:r>
+      <w:r>
+        <w:t xml:space="preserve"> </w:t>
+      </w:r>
+      <w:r>
+        <w:rPr>
+          <w:rStyle w:val="VerbatimChar"/>
+        </w:rPr>
+        <w:t xml:space="preserve">AnalyzePanel</w:t>
+      </w:r>
+      <w:r>
+        <w:t xml:space="preserve"> </w:t>
+      </w:r>
+      <w:r>
+        <w:t xml:space="preserve">routes and MUI-based theme switching.</w:t>
+      </w:r>
+    </w:p>
+    <w:p>
+      <w:pPr>
+        <w:numPr>
+          <w:ilvl w:val="0"/>
+          <w:numId w:val="1062"/>
+        </w:numPr>
+        <w:pStyle w:val="Compact"/>
+      </w:pPr>
+      <w:r>
+        <w:rPr>
+          <w:rStyle w:val="VerbatimChar"/>
+        </w:rPr>
+        <w:t xml:space="preserve">new-frontend/frontend</w:t>
+      </w:r>
+      <w:r>
+        <w:t xml:space="preserve"> </w:t>
+      </w:r>
+      <w:r>
+        <w:t xml:space="preserve">now also includes a full auth + protected-layout route structure after PR #71.</w:t>
+      </w:r>
+    </w:p>
+    <w:p>
+      <w:pPr>
+        <w:numPr>
+          <w:ilvl w:val="0"/>
+          <w:numId w:val="1062"/>
+        </w:numPr>
+        <w:pStyle w:val="Compact"/>
+      </w:pPr>
+      <w:r>
+        <w:t xml:space="preserve">For convergence, keep</w:t>
+      </w:r>
+      <w:r>
+        <w:t xml:space="preserve"> </w:t>
+      </w:r>
+      <w:r>
+        <w:rPr>
+          <w:rStyle w:val="VerbatimChar"/>
+        </w:rPr>
+        <w:t xml:space="preserve">new-frontend/frontend</w:t>
+      </w:r>
+      <w:r>
+        <w:t xml:space="preserve"> </w:t>
+      </w:r>
+      <w:r>
+        <w:t xml:space="preserve">as primary runtime UI path and treat</w:t>
+      </w:r>
+      <w:r>
+        <w:t xml:space="preserve"> </w:t>
+      </w:r>
+      <w:r>
+        <w:rPr>
+          <w:rStyle w:val="VerbatimChar"/>
+        </w:rPr>
+        <w:t xml:space="preserve">frontend</w:t>
+      </w:r>
+      <w:r>
+        <w:t xml:space="preserve"> </w:t>
+      </w:r>
+      <w:r>
+        <w:t xml:space="preserve">as adjacent/legacy path unless team explicitly consolidates.</w:t>
       </w:r>
     </w:p>
     <w:p>
@@ -5032,9 +6197,9 @@
         </w:pict>
       </w:r>
     </w:p>
-    <w:bookmarkEnd w:id="67"/>
-    <w:bookmarkEnd w:id="68"/>
-    <w:bookmarkStart w:id="72" w:name="testing-strategy-low-level"/>
+    <w:bookmarkEnd w:id="71"/>
+    <w:bookmarkEnd w:id="72"/>
+    <w:bookmarkStart w:id="76" w:name="testing-strategy-low-level"/>
     <w:p>
       <w:pPr>
         <w:pStyle w:val="Heading2"/>
@@ -5043,7 +6208,7 @@
         <w:t xml:space="preserve">10. Testing Strategy (Low-Level)</w:t>
       </w:r>
     </w:p>
-    <w:bookmarkStart w:id="69" w:name="backend-unitintegration-tests"/>
+    <w:bookmarkStart w:id="73" w:name="backend-unitintegration-tests"/>
     <w:p>
       <w:pPr>
         <w:pStyle w:val="Heading3"/>
@@ -5056,7 +6221,7 @@
       <w:pPr>
         <w:numPr>
           <w:ilvl w:val="0"/>
-          <w:numId w:val="1052"/>
+          <w:numId w:val="1063"/>
         </w:numPr>
         <w:pStyle w:val="Compact"/>
       </w:pPr>
@@ -5068,7 +6233,7 @@
       <w:pPr>
         <w:numPr>
           <w:ilvl w:val="1"/>
-          <w:numId w:val="1053"/>
+          <w:numId w:val="1064"/>
         </w:numPr>
         <w:pStyle w:val="Compact"/>
       </w:pPr>
@@ -5080,7 +6245,7 @@
       <w:pPr>
         <w:numPr>
           <w:ilvl w:val="1"/>
-          <w:numId w:val="1053"/>
+          <w:numId w:val="1064"/>
         </w:numPr>
         <w:pStyle w:val="Compact"/>
       </w:pPr>
@@ -5092,7 +6257,7 @@
       <w:pPr>
         <w:numPr>
           <w:ilvl w:val="0"/>
-          <w:numId w:val="1052"/>
+          <w:numId w:val="1063"/>
         </w:numPr>
         <w:pStyle w:val="Compact"/>
       </w:pPr>
@@ -5104,7 +6269,7 @@
       <w:pPr>
         <w:numPr>
           <w:ilvl w:val="1"/>
-          <w:numId w:val="1054"/>
+          <w:numId w:val="1065"/>
         </w:numPr>
         <w:pStyle w:val="Compact"/>
       </w:pPr>
@@ -5116,7 +6281,7 @@
       <w:pPr>
         <w:numPr>
           <w:ilvl w:val="1"/>
-          <w:numId w:val="1054"/>
+          <w:numId w:val="1065"/>
         </w:numPr>
         <w:pStyle w:val="Compact"/>
       </w:pPr>
@@ -5128,7 +6293,7 @@
       <w:pPr>
         <w:numPr>
           <w:ilvl w:val="0"/>
-          <w:numId w:val="1052"/>
+          <w:numId w:val="1063"/>
         </w:numPr>
         <w:pStyle w:val="Compact"/>
       </w:pPr>
@@ -5140,7 +6305,7 @@
       <w:pPr>
         <w:numPr>
           <w:ilvl w:val="1"/>
-          <w:numId w:val="1055"/>
+          <w:numId w:val="1066"/>
         </w:numPr>
         <w:pStyle w:val="Compact"/>
       </w:pPr>
@@ -5176,7 +6341,7 @@
       <w:pPr>
         <w:numPr>
           <w:ilvl w:val="1"/>
-          <w:numId w:val="1055"/>
+          <w:numId w:val="1066"/>
         </w:numPr>
         <w:pStyle w:val="Compact"/>
       </w:pPr>
@@ -5212,7 +6377,7 @@
       <w:pPr>
         <w:numPr>
           <w:ilvl w:val="1"/>
-          <w:numId w:val="1055"/>
+          <w:numId w:val="1066"/>
         </w:numPr>
         <w:pStyle w:val="Compact"/>
       </w:pPr>
@@ -5248,7 +6413,7 @@
       <w:pPr>
         <w:numPr>
           <w:ilvl w:val="1"/>
-          <w:numId w:val="1055"/>
+          <w:numId w:val="1066"/>
         </w:numPr>
         <w:pStyle w:val="Compact"/>
       </w:pPr>
@@ -5278,7 +6443,7 @@
       <w:pPr>
         <w:numPr>
           <w:ilvl w:val="1"/>
-          <w:numId w:val="1055"/>
+          <w:numId w:val="1066"/>
         </w:numPr>
         <w:pStyle w:val="Compact"/>
       </w:pPr>
@@ -5314,7 +6479,7 @@
       <w:pPr>
         <w:numPr>
           <w:ilvl w:val="1"/>
-          <w:numId w:val="1055"/>
+          <w:numId w:val="1066"/>
         </w:numPr>
         <w:pStyle w:val="Compact"/>
       </w:pPr>
@@ -5344,7 +6509,7 @@
       <w:pPr>
         <w:numPr>
           <w:ilvl w:val="1"/>
-          <w:numId w:val="1055"/>
+          <w:numId w:val="1066"/>
         </w:numPr>
         <w:pStyle w:val="Compact"/>
       </w:pPr>
@@ -5370,8 +6535,8 @@
         <w:t xml:space="preserve">400</w:t>
       </w:r>
     </w:p>
-    <w:bookmarkEnd w:id="69"/>
-    <w:bookmarkStart w:id="70" w:name="frontend-tests"/>
+    <w:bookmarkEnd w:id="73"/>
+    <w:bookmarkStart w:id="74" w:name="frontend-tests"/>
     <w:p>
       <w:pPr>
         <w:pStyle w:val="Heading3"/>
@@ -5384,7 +6549,7 @@
       <w:pPr>
         <w:numPr>
           <w:ilvl w:val="0"/>
-          <w:numId w:val="1056"/>
+          <w:numId w:val="1067"/>
         </w:numPr>
         <w:pStyle w:val="Compact"/>
       </w:pPr>
@@ -5396,7 +6561,7 @@
       <w:pPr>
         <w:numPr>
           <w:ilvl w:val="1"/>
-          <w:numId w:val="1057"/>
+          <w:numId w:val="1068"/>
         </w:numPr>
         <w:pStyle w:val="Compact"/>
       </w:pPr>
@@ -5417,7 +6582,7 @@
       <w:pPr>
         <w:numPr>
           <w:ilvl w:val="1"/>
-          <w:numId w:val="1057"/>
+          <w:numId w:val="1068"/>
         </w:numPr>
         <w:pStyle w:val="Compact"/>
       </w:pPr>
@@ -5438,7 +6603,7 @@
       <w:pPr>
         <w:numPr>
           <w:ilvl w:val="0"/>
-          <w:numId w:val="1056"/>
+          <w:numId w:val="1067"/>
         </w:numPr>
         <w:pStyle w:val="Compact"/>
       </w:pPr>
@@ -5450,7 +6615,7 @@
       <w:pPr>
         <w:numPr>
           <w:ilvl w:val="1"/>
-          <w:numId w:val="1058"/>
+          <w:numId w:val="1069"/>
         </w:numPr>
         <w:pStyle w:val="Compact"/>
       </w:pPr>
@@ -5462,7 +6627,7 @@
       <w:pPr>
         <w:numPr>
           <w:ilvl w:val="1"/>
-          <w:numId w:val="1058"/>
+          <w:numId w:val="1069"/>
         </w:numPr>
         <w:pStyle w:val="Compact"/>
       </w:pPr>
@@ -5474,7 +6639,7 @@
       <w:pPr>
         <w:numPr>
           <w:ilvl w:val="1"/>
-          <w:numId w:val="1058"/>
+          <w:numId w:val="1069"/>
         </w:numPr>
         <w:pStyle w:val="Compact"/>
       </w:pPr>
@@ -5486,7 +6651,7 @@
       <w:pPr>
         <w:numPr>
           <w:ilvl w:val="0"/>
-          <w:numId w:val="1056"/>
+          <w:numId w:val="1067"/>
         </w:numPr>
         <w:pStyle w:val="Compact"/>
       </w:pPr>
@@ -5498,7 +6663,7 @@
       <w:pPr>
         <w:numPr>
           <w:ilvl w:val="1"/>
-          <w:numId w:val="1059"/>
+          <w:numId w:val="1070"/>
         </w:numPr>
         <w:pStyle w:val="Compact"/>
       </w:pPr>
@@ -5506,8 +6671,8 @@
         <w:t xml:space="preserve">dashboard conditionally renders sections by stream count</w:t>
       </w:r>
     </w:p>
-    <w:bookmarkEnd w:id="70"/>
-    <w:bookmarkStart w:id="71" w:name="suggested-tooling"/>
+    <w:bookmarkEnd w:id="74"/>
+    <w:bookmarkStart w:id="75" w:name="suggested-tooling"/>
     <w:p>
       <w:pPr>
         <w:pStyle w:val="Heading3"/>
@@ -5520,7 +6685,7 @@
       <w:pPr>
         <w:numPr>
           <w:ilvl w:val="0"/>
-          <w:numId w:val="1060"/>
+          <w:numId w:val="1071"/>
         </w:numPr>
         <w:pStyle w:val="Compact"/>
       </w:pPr>
@@ -5556,7 +6721,7 @@
       <w:pPr>
         <w:numPr>
           <w:ilvl w:val="0"/>
-          <w:numId w:val="1060"/>
+          <w:numId w:val="1071"/>
         </w:numPr>
         <w:pStyle w:val="Compact"/>
       </w:pPr>
@@ -5586,6 +6751,33 @@
           <w:rStyle w:val="VerbatimChar"/>
         </w:rPr>
         <w:t xml:space="preserve">@testing-library/react</w:t>
+      </w:r>
+    </w:p>
+    <w:p>
+      <w:pPr>
+        <w:numPr>
+          <w:ilvl w:val="0"/>
+          <w:numId w:val="1071"/>
+        </w:numPr>
+        <w:pStyle w:val="Compact"/>
+      </w:pPr>
+      <w:r>
+        <w:t xml:space="preserve">Data science:</w:t>
+      </w:r>
+      <w:r>
+        <w:t xml:space="preserve"> </w:t>
+      </w:r>
+      <w:r>
+        <w:rPr>
+          <w:rStyle w:val="VerbatimChar"/>
+        </w:rPr>
+        <w:t xml:space="preserve">pytest</w:t>
+      </w:r>
+      <w:r>
+        <w:t xml:space="preserve"> </w:t>
+      </w:r>
+      <w:r>
+        <w:t xml:space="preserve">+ fixture-based benchmark regression checks</w:t>
       </w:r>
     </w:p>
     <w:p>
@@ -5595,9 +6787,9 @@
         </w:pict>
       </w:r>
     </w:p>
-    <w:bookmarkEnd w:id="71"/>
-    <w:bookmarkEnd w:id="72"/>
-    <w:bookmarkStart w:id="73" w:name="performance-and-scaling-notes"/>
+    <w:bookmarkEnd w:id="75"/>
+    <w:bookmarkEnd w:id="76"/>
+    <w:bookmarkStart w:id="77" w:name="performance-and-scaling-notes"/>
     <w:p>
       <w:pPr>
         <w:pStyle w:val="Heading2"/>
@@ -5610,7 +6802,7 @@
       <w:pPr>
         <w:numPr>
           <w:ilvl w:val="0"/>
-          <w:numId w:val="1061"/>
+          <w:numId w:val="1072"/>
         </w:numPr>
         <w:pStyle w:val="Compact"/>
       </w:pPr>
@@ -5622,7 +6814,7 @@
       <w:pPr>
         <w:numPr>
           <w:ilvl w:val="0"/>
-          <w:numId w:val="1061"/>
+          <w:numId w:val="1072"/>
         </w:numPr>
         <w:pStyle w:val="Compact"/>
       </w:pPr>
@@ -5634,7 +6826,7 @@
       <w:pPr>
         <w:numPr>
           <w:ilvl w:val="0"/>
-          <w:numId w:val="1061"/>
+          <w:numId w:val="1072"/>
         </w:numPr>
         <w:pStyle w:val="Compact"/>
       </w:pPr>
@@ -5667,7 +6859,7 @@
       <w:pPr>
         <w:numPr>
           <w:ilvl w:val="0"/>
-          <w:numId w:val="1061"/>
+          <w:numId w:val="1072"/>
         </w:numPr>
         <w:pStyle w:val="Compact"/>
       </w:pPr>
@@ -5682,8 +6874,8 @@
         </w:pict>
       </w:r>
     </w:p>
-    <w:bookmarkEnd w:id="73"/>
-    <w:bookmarkStart w:id="76" w:name="runbook-developer"/>
+    <w:bookmarkEnd w:id="77"/>
+    <w:bookmarkStart w:id="80" w:name="runbook-developer"/>
     <w:p>
       <w:pPr>
         <w:pStyle w:val="Heading2"/>
@@ -5692,7 +6884,7 @@
         <w:t xml:space="preserve">12. Runbook (Developer)</w:t>
       </w:r>
     </w:p>
-    <w:bookmarkStart w:id="74" w:name="primary-converged-path"/>
+    <w:bookmarkStart w:id="78" w:name="primary-converged-path"/>
     <w:p>
       <w:pPr>
         <w:pStyle w:val="Heading3"/>
@@ -5826,8 +7018,8 @@
         <w:t xml:space="preserve"> run dev</w:t>
       </w:r>
     </w:p>
-    <w:bookmarkEnd w:id="74"/>
-    <w:bookmarkStart w:id="75" w:name="optional-analytics-path"/>
+    <w:bookmarkEnd w:id="78"/>
+    <w:bookmarkStart w:id="79" w:name="optional-analytics-path"/>
     <w:p>
       <w:pPr>
         <w:pStyle w:val="Heading3"/>
@@ -5917,9 +7109,9 @@
         </w:pict>
       </w:r>
     </w:p>
-    <w:bookmarkEnd w:id="75"/>
-    <w:bookmarkEnd w:id="76"/>
-    <w:bookmarkStart w:id="77" w:name="Xc5bcb3243cad40239a8e0033af637955e44e197"/>
+    <w:bookmarkEnd w:id="79"/>
+    <w:bookmarkEnd w:id="80"/>
+    <w:bookmarkStart w:id="81" w:name="Xc5bcb3243cad40239a8e0033af637955e44e197"/>
     <w:p>
       <w:pPr>
         <w:pStyle w:val="Heading2"/>
@@ -5932,7 +7124,7 @@
       <w:pPr>
         <w:numPr>
           <w:ilvl w:val="0"/>
-          <w:numId w:val="1062"/>
+          <w:numId w:val="1073"/>
         </w:numPr>
         <w:pStyle w:val="Compact"/>
       </w:pPr>
@@ -5944,7 +7136,7 @@
       <w:pPr>
         <w:numPr>
           <w:ilvl w:val="0"/>
-          <w:numId w:val="1062"/>
+          <w:numId w:val="1073"/>
         </w:numPr>
         <w:pStyle w:val="Compact"/>
       </w:pPr>
@@ -5983,7 +7175,7 @@
       <w:pPr>
         <w:numPr>
           <w:ilvl w:val="0"/>
-          <w:numId w:val="1062"/>
+          <w:numId w:val="1073"/>
         </w:numPr>
         <w:pStyle w:val="Compact"/>
       </w:pPr>
@@ -5995,7 +7187,7 @@
       <w:pPr>
         <w:numPr>
           <w:ilvl w:val="0"/>
-          <w:numId w:val="1062"/>
+          <w:numId w:val="1073"/>
         </w:numPr>
         <w:pStyle w:val="Compact"/>
       </w:pPr>
@@ -6007,12 +7199,60 @@
       <w:pPr>
         <w:numPr>
           <w:ilvl w:val="0"/>
-          <w:numId w:val="1062"/>
+          <w:numId w:val="1073"/>
         </w:numPr>
         <w:pStyle w:val="Compact"/>
       </w:pPr>
       <w:r>
         <w:t xml:space="preserve">add structured logging and request IDs for traceability</w:t>
+      </w:r>
+    </w:p>
+    <w:p>
+      <w:pPr>
+        <w:numPr>
+          <w:ilvl w:val="0"/>
+          <w:numId w:val="1073"/>
+        </w:numPr>
+        <w:pStyle w:val="Compact"/>
+      </w:pPr>
+      <w:r>
+        <w:t xml:space="preserve">complete upstream merge of DB ingestion stream and document concrete DB schema/ORM model map</w:t>
+      </w:r>
+    </w:p>
+    <w:p>
+      <w:pPr>
+        <w:numPr>
+          <w:ilvl w:val="0"/>
+          <w:numId w:val="1073"/>
+        </w:numPr>
+        <w:pStyle w:val="Compact"/>
+      </w:pPr>
+      <w:r>
+        <w:t xml:space="preserve">add migration/runbook steps for bootstrapping DB data from canonical processed datasets</w:t>
+      </w:r>
+    </w:p>
+    <w:p>
+      <w:pPr>
+        <w:numPr>
+          <w:ilvl w:val="0"/>
+          <w:numId w:val="1073"/>
+        </w:numPr>
+        <w:pStyle w:val="Compact"/>
+      </w:pPr>
+      <w:r>
+        <w:t xml:space="preserve">define a single source of truth for dataset/series endpoint naming across file-backed and DB-backed modes</w:t>
+      </w:r>
+    </w:p>
+    <w:p>
+      <w:pPr>
+        <w:numPr>
+          <w:ilvl w:val="0"/>
+          <w:numId w:val="1073"/>
+        </w:numPr>
+        <w:pStyle w:val="Compact"/>
+      </w:pPr>
+      <w:r>
+        <w:t xml:space="preserve">align DS detector output schema (scores, labels, metadata) with API response contracts for frontend consumption</w:t>
       </w:r>
     </w:p>
     <w:p>
@@ -6022,8 +7262,8 @@
         </w:pict>
       </w:r>
     </w:p>
-    <w:bookmarkEnd w:id="77"/>
-    <w:bookmarkStart w:id="78" w:name="definition-of-done-for-lld-compliance"/>
+    <w:bookmarkEnd w:id="81"/>
+    <w:bookmarkStart w:id="82" w:name="definition-of-done-for-lld-compliance"/>
     <w:p>
       <w:pPr>
         <w:pStyle w:val="Heading2"/>
@@ -6044,7 +7284,7 @@
       <w:pPr>
         <w:numPr>
           <w:ilvl w:val="0"/>
-          <w:numId w:val="1063"/>
+          <w:numId w:val="1074"/>
         </w:numPr>
         <w:pStyle w:val="Compact"/>
       </w:pPr>
@@ -6056,7 +7296,7 @@
       <w:pPr>
         <w:numPr>
           <w:ilvl w:val="0"/>
-          <w:numId w:val="1063"/>
+          <w:numId w:val="1074"/>
         </w:numPr>
         <w:pStyle w:val="Compact"/>
       </w:pPr>
@@ -6068,7 +7308,7 @@
       <w:pPr>
         <w:numPr>
           <w:ilvl w:val="0"/>
-          <w:numId w:val="1063"/>
+          <w:numId w:val="1074"/>
         </w:numPr>
         <w:pStyle w:val="Compact"/>
       </w:pPr>
@@ -6080,7 +7320,7 @@
       <w:pPr>
         <w:numPr>
           <w:ilvl w:val="0"/>
-          <w:numId w:val="1063"/>
+          <w:numId w:val="1074"/>
         </w:numPr>
         <w:pStyle w:val="Compact"/>
       </w:pPr>
@@ -6092,7 +7332,7 @@
       <w:pPr>
         <w:numPr>
           <w:ilvl w:val="0"/>
-          <w:numId w:val="1063"/>
+          <w:numId w:val="1074"/>
         </w:numPr>
         <w:pStyle w:val="Compact"/>
       </w:pPr>
@@ -6100,8 +7340,8 @@
         <w:t xml:space="preserve">test coverage includes critical utility, service, and route behavior</w:t>
       </w:r>
     </w:p>
-    <w:bookmarkEnd w:id="78"/>
-    <w:bookmarkEnd w:id="79"/>
+    <w:bookmarkEnd w:id="82"/>
+    <w:bookmarkEnd w:id="83"/>
     <w:sectPr/>
   </w:body>
 </w:document>
@@ -6526,64 +7766,10 @@
     <w:abstractNumId w:val="991"/>
   </w:num>
   <w:num w:numId="1043">
-    <w:abstractNumId w:val="99411"/>
-    <w:lvlOverride w:ilvl="0">
-      <w:startOverride w:val="1"/>
-    </w:lvlOverride>
-    <w:lvlOverride w:ilvl="1">
-      <w:startOverride w:val="1"/>
-    </w:lvlOverride>
-    <w:lvlOverride w:ilvl="2">
-      <w:startOverride w:val="1"/>
-    </w:lvlOverride>
-    <w:lvlOverride w:ilvl="3">
-      <w:startOverride w:val="1"/>
-    </w:lvlOverride>
-    <w:lvlOverride w:ilvl="4">
-      <w:startOverride w:val="1"/>
-    </w:lvlOverride>
-    <w:lvlOverride w:ilvl="5">
-      <w:startOverride w:val="1"/>
-    </w:lvlOverride>
-    <w:lvlOverride w:ilvl="6">
-      <w:startOverride w:val="1"/>
-    </w:lvlOverride>
-    <w:lvlOverride w:ilvl="7">
-      <w:startOverride w:val="1"/>
-    </w:lvlOverride>
-    <w:lvlOverride w:ilvl="8">
-      <w:startOverride w:val="1"/>
-    </w:lvlOverride>
+    <w:abstractNumId w:val="991"/>
   </w:num>
   <w:num w:numId="1044">
-    <w:abstractNumId w:val="99411"/>
-    <w:lvlOverride w:ilvl="0">
-      <w:startOverride w:val="1"/>
-    </w:lvlOverride>
-    <w:lvlOverride w:ilvl="1">
-      <w:startOverride w:val="1"/>
-    </w:lvlOverride>
-    <w:lvlOverride w:ilvl="2">
-      <w:startOverride w:val="1"/>
-    </w:lvlOverride>
-    <w:lvlOverride w:ilvl="3">
-      <w:startOverride w:val="1"/>
-    </w:lvlOverride>
-    <w:lvlOverride w:ilvl="4">
-      <w:startOverride w:val="1"/>
-    </w:lvlOverride>
-    <w:lvlOverride w:ilvl="5">
-      <w:startOverride w:val="1"/>
-    </w:lvlOverride>
-    <w:lvlOverride w:ilvl="6">
-      <w:startOverride w:val="1"/>
-    </w:lvlOverride>
-    <w:lvlOverride w:ilvl="7">
-      <w:startOverride w:val="1"/>
-    </w:lvlOverride>
-    <w:lvlOverride w:ilvl="8">
-      <w:startOverride w:val="1"/>
-    </w:lvlOverride>
+    <w:abstractNumId w:val="991"/>
   </w:num>
   <w:num w:numId="1045">
     <w:abstractNumId w:val="99411"/>
@@ -6616,10 +7802,64 @@
     </w:lvlOverride>
   </w:num>
   <w:num w:numId="1046">
-    <w:abstractNumId w:val="991"/>
+    <w:abstractNumId w:val="99411"/>
+    <w:lvlOverride w:ilvl="0">
+      <w:startOverride w:val="1"/>
+    </w:lvlOverride>
+    <w:lvlOverride w:ilvl="1">
+      <w:startOverride w:val="1"/>
+    </w:lvlOverride>
+    <w:lvlOverride w:ilvl="2">
+      <w:startOverride w:val="1"/>
+    </w:lvlOverride>
+    <w:lvlOverride w:ilvl="3">
+      <w:startOverride w:val="1"/>
+    </w:lvlOverride>
+    <w:lvlOverride w:ilvl="4">
+      <w:startOverride w:val="1"/>
+    </w:lvlOverride>
+    <w:lvlOverride w:ilvl="5">
+      <w:startOverride w:val="1"/>
+    </w:lvlOverride>
+    <w:lvlOverride w:ilvl="6">
+      <w:startOverride w:val="1"/>
+    </w:lvlOverride>
+    <w:lvlOverride w:ilvl="7">
+      <w:startOverride w:val="1"/>
+    </w:lvlOverride>
+    <w:lvlOverride w:ilvl="8">
+      <w:startOverride w:val="1"/>
+    </w:lvlOverride>
   </w:num>
   <w:num w:numId="1047">
-    <w:abstractNumId w:val="991"/>
+    <w:abstractNumId w:val="99411"/>
+    <w:lvlOverride w:ilvl="0">
+      <w:startOverride w:val="1"/>
+    </w:lvlOverride>
+    <w:lvlOverride w:ilvl="1">
+      <w:startOverride w:val="1"/>
+    </w:lvlOverride>
+    <w:lvlOverride w:ilvl="2">
+      <w:startOverride w:val="1"/>
+    </w:lvlOverride>
+    <w:lvlOverride w:ilvl="3">
+      <w:startOverride w:val="1"/>
+    </w:lvlOverride>
+    <w:lvlOverride w:ilvl="4">
+      <w:startOverride w:val="1"/>
+    </w:lvlOverride>
+    <w:lvlOverride w:ilvl="5">
+      <w:startOverride w:val="1"/>
+    </w:lvlOverride>
+    <w:lvlOverride w:ilvl="6">
+      <w:startOverride w:val="1"/>
+    </w:lvlOverride>
+    <w:lvlOverride w:ilvl="7">
+      <w:startOverride w:val="1"/>
+    </w:lvlOverride>
+    <w:lvlOverride w:ilvl="8">
+      <w:startOverride w:val="1"/>
+    </w:lvlOverride>
   </w:num>
   <w:num w:numId="1048">
     <w:abstractNumId w:val="991"/>
@@ -6667,6 +7907,39 @@
     <w:abstractNumId w:val="991"/>
   </w:num>
   <w:num w:numId="1063">
+    <w:abstractNumId w:val="991"/>
+  </w:num>
+  <w:num w:numId="1064">
+    <w:abstractNumId w:val="991"/>
+  </w:num>
+  <w:num w:numId="1065">
+    <w:abstractNumId w:val="991"/>
+  </w:num>
+  <w:num w:numId="1066">
+    <w:abstractNumId w:val="991"/>
+  </w:num>
+  <w:num w:numId="1067">
+    <w:abstractNumId w:val="991"/>
+  </w:num>
+  <w:num w:numId="1068">
+    <w:abstractNumId w:val="991"/>
+  </w:num>
+  <w:num w:numId="1069">
+    <w:abstractNumId w:val="991"/>
+  </w:num>
+  <w:num w:numId="1070">
+    <w:abstractNumId w:val="991"/>
+  </w:num>
+  <w:num w:numId="1071">
+    <w:abstractNumId w:val="991"/>
+  </w:num>
+  <w:num w:numId="1072">
+    <w:abstractNumId w:val="991"/>
+  </w:num>
+  <w:num w:numId="1073">
+    <w:abstractNumId w:val="991"/>
+  </w:num>
+  <w:num w:numId="1074">
     <w:abstractNumId w:val="991"/>
   </w:num>
 </w:numbering>

</xml_diff>